<commit_message>
Docs: equipamentos do teste funcional do PTU-D300E
Seção 2 passa a listar só os equipamentos usados: fonte Keysight
N5766A, notebook com Windows (Docklight) e conversor USB/RS-485 Black
Box SP390A-R2. Montagem, diagrama, cablagem e energização ajustados a
esses equipamentos.

Co-Authored-By: Claude Opus 5.5 <noreply@anthropic.com>
Claude-Session: https://claude.ai/code/session_01VvvtJDPvh4mDoSVpkHza1d
</commit_message>
<xml_diff>
--- a/docs/procedimento-teste-funcional-ptu-d300e.docx
+++ b/docs/procedimento-teste-funcional-ptu-d300e.docx
@@ -55,7 +55,7 @@
           <w:sz w:val="21"/>
           <w:szCs w:val="21"/>
         </w:rPr>
-        <w:t xml:space="preserve">Este procedimento estabelece a sequência de atividades para o teste funcional do posicionador pan-tilt FLIR PTU-D300E após a configuração das velocidades de reset em 500 posições por segundo (comandos RPS e RTS, gravados com DS). O teste verifica, pela interface RS-485 com o software Docklight num PC com Windows: a comunicação com a unidade, os valores programados, a sua permanência após desligar e religar, a execução do ciclo de reset e a movimentação dos dois eixos.</w:t>
+        <w:t xml:space="preserve">Este procedimento estabelece a sequência de atividades para o teste funcional do posicionador pan-tilt FLIR PTU-D300E após a configuração das velocidades de reset em 500 posições por segundo (comandos RPS e RTS, gravados com DS). O teste verifica, pela interface RS-485 com o software Docklight num notebook com Windows: a comunicação com a unidade, os valores programados, a sua permanência após desligar e religar, a execução do ciclo de reset e a movimentação dos dois eixos.</w:t>
       </w:r>
     </w:p>
     <w:p>
@@ -365,7 +365,7 @@
                 <w:sz w:val="19"/>
                 <w:szCs w:val="19"/>
               </w:rPr>
-              <w:t xml:space="preserve">Posicionador pan-tilt FLIR PTU-D300E (unidade sob teste), já configurado com RPS = RTS = 500 pos/s</w:t>
+              <w:t xml:space="preserve">Fonte de alimentação CC Keysight, modelo N5766A</w:t>
             </w:r>
           </w:p>
         </w:tc>
@@ -511,7 +511,7 @@
                 <w:sz w:val="19"/>
                 <w:szCs w:val="19"/>
               </w:rPr>
-              <w:t xml:space="preserve">Fonte de alimentação do PTU-D300E, conforme o manual da unidade, com cabo</w:t>
+              <w:t xml:space="preserve">Notebook com Windows e o software Docklight instalado</w:t>
             </w:r>
           </w:p>
         </w:tc>
@@ -657,591 +657,7 @@
                 <w:sz w:val="19"/>
                 <w:szCs w:val="19"/>
               </w:rPr>
-              <w:t xml:space="preserve">Computador com Windows 10 ou 11 e o software Docklight instalado</w:t>
-            </w:r>
-          </w:p>
-        </w:tc>
-        <w:tc>
-          <w:tcPr>
-            <w:tcW w:type="dxa" w:w="1100"/>
-            <w:tcBorders>
-              <w:top w:val="single" w:color="000000" w:sz="4"/>
-              <w:left w:val="single" w:color="000000" w:sz="4"/>
-              <w:bottom w:val="single" w:color="000000" w:sz="4"/>
-              <w:right w:val="single" w:color="000000" w:sz="4"/>
-            </w:tcBorders>
-            <w:tcMar>
-              <w:top w:type="dxa" w:w="50"/>
-              <w:left w:type="dxa" w:w="90"/>
-              <w:bottom w:type="dxa" w:w="50"/>
-              <w:right w:type="dxa" w:w="90"/>
-            </w:tcMar>
-          </w:tcPr>
-          <w:p>
-            <w:pPr>
-              <w:spacing w:after="0"/>
-              <w:jc w:val="center"/>
-            </w:pPr>
-            <w:r>
-              <w:rPr>
-                <w:rFonts w:ascii="Arial" w:cs="Arial" w:eastAsia="Arial" w:hAnsi="Arial"/>
-                <w:b w:val="false"/>
-                <w:bCs w:val="false"/>
-                <w:i w:val="false"/>
-                <w:iCs w:val="false"/>
-                <w:sz w:val="19"/>
-                <w:szCs w:val="19"/>
-              </w:rPr>
-              <w:t xml:space="preserve">1</w:t>
-            </w:r>
-          </w:p>
-        </w:tc>
-        <w:tc>
-          <w:tcPr>
-            <w:tcW w:type="dxa" w:w="1800"/>
-            <w:tcBorders>
-              <w:top w:val="single" w:color="000000" w:sz="4"/>
-              <w:left w:val="single" w:color="000000" w:sz="4"/>
-              <w:bottom w:val="single" w:color="000000" w:sz="4"/>
-              <w:right w:val="single" w:color="000000" w:sz="4"/>
-            </w:tcBorders>
-            <w:tcMar>
-              <w:top w:type="dxa" w:w="50"/>
-              <w:left w:type="dxa" w:w="90"/>
-              <w:bottom w:type="dxa" w:w="50"/>
-              <w:right w:type="dxa" w:w="90"/>
-            </w:tcMar>
-          </w:tcPr>
-          <w:p>
-            <w:pPr>
-              <w:spacing w:after="0"/>
-              <w:jc w:val="center"/>
-            </w:pPr>
-            <w:r>
-              <w:rPr>
-                <w:rFonts w:ascii="Arial" w:cs="Arial" w:eastAsia="Arial" w:hAnsi="Arial"/>
-                <w:b w:val="false"/>
-                <w:bCs w:val="false"/>
-                <w:i w:val="false"/>
-                <w:iCs w:val="false"/>
-                <w:sz w:val="19"/>
-                <w:szCs w:val="19"/>
-              </w:rPr>
-              <w:t xml:space="preserve">—</w:t>
-            </w:r>
-          </w:p>
-        </w:tc>
-      </w:tr>
-      <w:tr>
-        <w:trPr>
-          <w:cantSplit/>
-          <w:tblHeader w:val="false"/>
-        </w:trPr>
-        <w:tc>
-          <w:tcPr>
-            <w:tcW w:type="dxa" w:w="700"/>
-            <w:tcBorders>
-              <w:top w:val="single" w:color="000000" w:sz="4"/>
-              <w:left w:val="single" w:color="000000" w:sz="4"/>
-              <w:bottom w:val="single" w:color="000000" w:sz="4"/>
-              <w:right w:val="single" w:color="000000" w:sz="4"/>
-            </w:tcBorders>
-            <w:tcMar>
-              <w:top w:type="dxa" w:w="50"/>
-              <w:left w:type="dxa" w:w="90"/>
-              <w:bottom w:type="dxa" w:w="50"/>
-              <w:right w:type="dxa" w:w="90"/>
-            </w:tcMar>
-          </w:tcPr>
-          <w:p>
-            <w:pPr>
-              <w:spacing w:after="0"/>
-              <w:jc w:val="center"/>
-            </w:pPr>
-            <w:r>
-              <w:rPr>
-                <w:rFonts w:ascii="Arial" w:cs="Arial" w:eastAsia="Arial" w:hAnsi="Arial"/>
-                <w:b w:val="false"/>
-                <w:bCs w:val="false"/>
-                <w:i w:val="false"/>
-                <w:iCs w:val="false"/>
-                <w:sz w:val="19"/>
-                <w:szCs w:val="19"/>
-              </w:rPr>
-              <w:t xml:space="preserve">4</w:t>
-            </w:r>
-          </w:p>
-        </w:tc>
-        <w:tc>
-          <w:tcPr>
-            <w:tcW w:type="dxa" w:w="6038"/>
-            <w:tcBorders>
-              <w:top w:val="single" w:color="000000" w:sz="4"/>
-              <w:left w:val="single" w:color="000000" w:sz="4"/>
-              <w:bottom w:val="single" w:color="000000" w:sz="4"/>
-              <w:right w:val="single" w:color="000000" w:sz="4"/>
-            </w:tcBorders>
-            <w:tcMar>
-              <w:top w:type="dxa" w:w="50"/>
-              <w:left w:type="dxa" w:w="90"/>
-              <w:bottom w:type="dxa" w:w="50"/>
-              <w:right w:type="dxa" w:w="90"/>
-            </w:tcMar>
-          </w:tcPr>
-          <w:p>
-            <w:pPr>
-              <w:spacing w:after="0"/>
-              <w:jc w:val="left"/>
-            </w:pPr>
-            <w:r>
-              <w:rPr>
-                <w:rFonts w:ascii="Arial" w:cs="Arial" w:eastAsia="Arial" w:hAnsi="Arial"/>
-                <w:b w:val="false"/>
-                <w:bCs w:val="false"/>
-                <w:i w:val="false"/>
-                <w:iCs w:val="false"/>
-                <w:sz w:val="19"/>
-                <w:szCs w:val="19"/>
-              </w:rPr>
-              <w:t xml:space="preserve">Conversor USB/RS-485 com o seu driver instalado</w:t>
-            </w:r>
-          </w:p>
-        </w:tc>
-        <w:tc>
-          <w:tcPr>
-            <w:tcW w:type="dxa" w:w="1100"/>
-            <w:tcBorders>
-              <w:top w:val="single" w:color="000000" w:sz="4"/>
-              <w:left w:val="single" w:color="000000" w:sz="4"/>
-              <w:bottom w:val="single" w:color="000000" w:sz="4"/>
-              <w:right w:val="single" w:color="000000" w:sz="4"/>
-            </w:tcBorders>
-            <w:tcMar>
-              <w:top w:type="dxa" w:w="50"/>
-              <w:left w:type="dxa" w:w="90"/>
-              <w:bottom w:type="dxa" w:w="50"/>
-              <w:right w:type="dxa" w:w="90"/>
-            </w:tcMar>
-          </w:tcPr>
-          <w:p>
-            <w:pPr>
-              <w:spacing w:after="0"/>
-              <w:jc w:val="center"/>
-            </w:pPr>
-            <w:r>
-              <w:rPr>
-                <w:rFonts w:ascii="Arial" w:cs="Arial" w:eastAsia="Arial" w:hAnsi="Arial"/>
-                <w:b w:val="false"/>
-                <w:bCs w:val="false"/>
-                <w:i w:val="false"/>
-                <w:iCs w:val="false"/>
-                <w:sz w:val="19"/>
-                <w:szCs w:val="19"/>
-              </w:rPr>
-              <w:t xml:space="preserve">1</w:t>
-            </w:r>
-          </w:p>
-        </w:tc>
-        <w:tc>
-          <w:tcPr>
-            <w:tcW w:type="dxa" w:w="1800"/>
-            <w:tcBorders>
-              <w:top w:val="single" w:color="000000" w:sz="4"/>
-              <w:left w:val="single" w:color="000000" w:sz="4"/>
-              <w:bottom w:val="single" w:color="000000" w:sz="4"/>
-              <w:right w:val="single" w:color="000000" w:sz="4"/>
-            </w:tcBorders>
-            <w:tcMar>
-              <w:top w:type="dxa" w:w="50"/>
-              <w:left w:type="dxa" w:w="90"/>
-              <w:bottom w:type="dxa" w:w="50"/>
-              <w:right w:type="dxa" w:w="90"/>
-            </w:tcMar>
-          </w:tcPr>
-          <w:p>
-            <w:pPr>
-              <w:spacing w:after="0"/>
-              <w:jc w:val="center"/>
-            </w:pPr>
-            <w:r>
-              <w:rPr>
-                <w:rFonts w:ascii="Arial" w:cs="Arial" w:eastAsia="Arial" w:hAnsi="Arial"/>
-                <w:b w:val="false"/>
-                <w:bCs w:val="false"/>
-                <w:i w:val="false"/>
-                <w:iCs w:val="false"/>
-                <w:sz w:val="19"/>
-                <w:szCs w:val="19"/>
-              </w:rPr>
-              <w:t xml:space="preserve">—</w:t>
-            </w:r>
-          </w:p>
-        </w:tc>
-      </w:tr>
-      <w:tr>
-        <w:trPr>
-          <w:cantSplit/>
-          <w:tblHeader w:val="false"/>
-        </w:trPr>
-        <w:tc>
-          <w:tcPr>
-            <w:tcW w:type="dxa" w:w="700"/>
-            <w:tcBorders>
-              <w:top w:val="single" w:color="000000" w:sz="4"/>
-              <w:left w:val="single" w:color="000000" w:sz="4"/>
-              <w:bottom w:val="single" w:color="000000" w:sz="4"/>
-              <w:right w:val="single" w:color="000000" w:sz="4"/>
-            </w:tcBorders>
-            <w:tcMar>
-              <w:top w:type="dxa" w:w="50"/>
-              <w:left w:type="dxa" w:w="90"/>
-              <w:bottom w:type="dxa" w:w="50"/>
-              <w:right w:type="dxa" w:w="90"/>
-            </w:tcMar>
-          </w:tcPr>
-          <w:p>
-            <w:pPr>
-              <w:spacing w:after="0"/>
-              <w:jc w:val="center"/>
-            </w:pPr>
-            <w:r>
-              <w:rPr>
-                <w:rFonts w:ascii="Arial" w:cs="Arial" w:eastAsia="Arial" w:hAnsi="Arial"/>
-                <w:b w:val="false"/>
-                <w:bCs w:val="false"/>
-                <w:i w:val="false"/>
-                <w:iCs w:val="false"/>
-                <w:sz w:val="19"/>
-                <w:szCs w:val="19"/>
-              </w:rPr>
-              <w:t xml:space="preserve">5</w:t>
-            </w:r>
-          </w:p>
-        </w:tc>
-        <w:tc>
-          <w:tcPr>
-            <w:tcW w:type="dxa" w:w="6038"/>
-            <w:tcBorders>
-              <w:top w:val="single" w:color="000000" w:sz="4"/>
-              <w:left w:val="single" w:color="000000" w:sz="4"/>
-              <w:bottom w:val="single" w:color="000000" w:sz="4"/>
-              <w:right w:val="single" w:color="000000" w:sz="4"/>
-            </w:tcBorders>
-            <w:tcMar>
-              <w:top w:type="dxa" w:w="50"/>
-              <w:left w:type="dxa" w:w="90"/>
-              <w:bottom w:type="dxa" w:w="50"/>
-              <w:right w:type="dxa" w:w="90"/>
-            </w:tcMar>
-          </w:tcPr>
-          <w:p>
-            <w:pPr>
-              <w:spacing w:after="0"/>
-              <w:jc w:val="left"/>
-            </w:pPr>
-            <w:r>
-              <w:rPr>
-                <w:rFonts w:ascii="Arial" w:cs="Arial" w:eastAsia="Arial" w:hAnsi="Arial"/>
-                <w:b w:val="false"/>
-                <w:bCs w:val="false"/>
-                <w:i w:val="false"/>
-                <w:iCs w:val="false"/>
-                <w:sz w:val="19"/>
-                <w:szCs w:val="19"/>
-              </w:rPr>
-              <w:t xml:space="preserve">Cabo de comunicação RS-485 (par trançado) entre o conversor e a porta host do PTU</w:t>
-            </w:r>
-          </w:p>
-        </w:tc>
-        <w:tc>
-          <w:tcPr>
-            <w:tcW w:type="dxa" w:w="1100"/>
-            <w:tcBorders>
-              <w:top w:val="single" w:color="000000" w:sz="4"/>
-              <w:left w:val="single" w:color="000000" w:sz="4"/>
-              <w:bottom w:val="single" w:color="000000" w:sz="4"/>
-              <w:right w:val="single" w:color="000000" w:sz="4"/>
-            </w:tcBorders>
-            <w:tcMar>
-              <w:top w:type="dxa" w:w="50"/>
-              <w:left w:type="dxa" w:w="90"/>
-              <w:bottom w:type="dxa" w:w="50"/>
-              <w:right w:type="dxa" w:w="90"/>
-            </w:tcMar>
-          </w:tcPr>
-          <w:p>
-            <w:pPr>
-              <w:spacing w:after="0"/>
-              <w:jc w:val="center"/>
-            </w:pPr>
-            <w:r>
-              <w:rPr>
-                <w:rFonts w:ascii="Arial" w:cs="Arial" w:eastAsia="Arial" w:hAnsi="Arial"/>
-                <w:b w:val="false"/>
-                <w:bCs w:val="false"/>
-                <w:i w:val="false"/>
-                <w:iCs w:val="false"/>
-                <w:sz w:val="19"/>
-                <w:szCs w:val="19"/>
-              </w:rPr>
-              <w:t xml:space="preserve">1</w:t>
-            </w:r>
-          </w:p>
-        </w:tc>
-        <w:tc>
-          <w:tcPr>
-            <w:tcW w:type="dxa" w:w="1800"/>
-            <w:tcBorders>
-              <w:top w:val="single" w:color="000000" w:sz="4"/>
-              <w:left w:val="single" w:color="000000" w:sz="4"/>
-              <w:bottom w:val="single" w:color="000000" w:sz="4"/>
-              <w:right w:val="single" w:color="000000" w:sz="4"/>
-            </w:tcBorders>
-            <w:tcMar>
-              <w:top w:type="dxa" w:w="50"/>
-              <w:left w:type="dxa" w:w="90"/>
-              <w:bottom w:type="dxa" w:w="50"/>
-              <w:right w:type="dxa" w:w="90"/>
-            </w:tcMar>
-          </w:tcPr>
-          <w:p>
-            <w:pPr>
-              <w:spacing w:after="0"/>
-              <w:jc w:val="center"/>
-            </w:pPr>
-            <w:r>
-              <w:rPr>
-                <w:rFonts w:ascii="Arial" w:cs="Arial" w:eastAsia="Arial" w:hAnsi="Arial"/>
-                <w:b w:val="false"/>
-                <w:bCs w:val="false"/>
-                <w:i w:val="false"/>
-                <w:iCs w:val="false"/>
-                <w:sz w:val="19"/>
-                <w:szCs w:val="19"/>
-              </w:rPr>
-              <w:t xml:space="preserve">—</w:t>
-            </w:r>
-          </w:p>
-        </w:tc>
-      </w:tr>
-      <w:tr>
-        <w:trPr>
-          <w:cantSplit/>
-          <w:tblHeader w:val="false"/>
-        </w:trPr>
-        <w:tc>
-          <w:tcPr>
-            <w:tcW w:type="dxa" w:w="700"/>
-            <w:tcBorders>
-              <w:top w:val="single" w:color="000000" w:sz="4"/>
-              <w:left w:val="single" w:color="000000" w:sz="4"/>
-              <w:bottom w:val="single" w:color="000000" w:sz="4"/>
-              <w:right w:val="single" w:color="000000" w:sz="4"/>
-            </w:tcBorders>
-            <w:tcMar>
-              <w:top w:type="dxa" w:w="50"/>
-              <w:left w:type="dxa" w:w="90"/>
-              <w:bottom w:type="dxa" w:w="50"/>
-              <w:right w:type="dxa" w:w="90"/>
-            </w:tcMar>
-          </w:tcPr>
-          <w:p>
-            <w:pPr>
-              <w:spacing w:after="0"/>
-              <w:jc w:val="center"/>
-            </w:pPr>
-            <w:r>
-              <w:rPr>
-                <w:rFonts w:ascii="Arial" w:cs="Arial" w:eastAsia="Arial" w:hAnsi="Arial"/>
-                <w:b w:val="false"/>
-                <w:bCs w:val="false"/>
-                <w:i w:val="false"/>
-                <w:iCs w:val="false"/>
-                <w:sz w:val="19"/>
-                <w:szCs w:val="19"/>
-              </w:rPr>
-              <w:t xml:space="preserve">6</w:t>
-            </w:r>
-          </w:p>
-        </w:tc>
-        <w:tc>
-          <w:tcPr>
-            <w:tcW w:type="dxa" w:w="6038"/>
-            <w:tcBorders>
-              <w:top w:val="single" w:color="000000" w:sz="4"/>
-              <w:left w:val="single" w:color="000000" w:sz="4"/>
-              <w:bottom w:val="single" w:color="000000" w:sz="4"/>
-              <w:right w:val="single" w:color="000000" w:sz="4"/>
-            </w:tcBorders>
-            <w:tcMar>
-              <w:top w:type="dxa" w:w="50"/>
-              <w:left w:type="dxa" w:w="90"/>
-              <w:bottom w:type="dxa" w:w="50"/>
-              <w:right w:type="dxa" w:w="90"/>
-            </w:tcMar>
-          </w:tcPr>
-          <w:p>
-            <w:pPr>
-              <w:spacing w:after="0"/>
-              <w:jc w:val="left"/>
-            </w:pPr>
-            <w:r>
-              <w:rPr>
-                <w:rFonts w:ascii="Arial" w:cs="Arial" w:eastAsia="Arial" w:hAnsi="Arial"/>
-                <w:b w:val="false"/>
-                <w:bCs w:val="false"/>
-                <w:i w:val="false"/>
-                <w:iCs w:val="false"/>
-                <w:sz w:val="19"/>
-                <w:szCs w:val="19"/>
-              </w:rPr>
-              <w:t xml:space="preserve">Cronômetro (opcional, para registrar a duração do ciclo de reset)</w:t>
-            </w:r>
-          </w:p>
-        </w:tc>
-        <w:tc>
-          <w:tcPr>
-            <w:tcW w:type="dxa" w:w="1100"/>
-            <w:tcBorders>
-              <w:top w:val="single" w:color="000000" w:sz="4"/>
-              <w:left w:val="single" w:color="000000" w:sz="4"/>
-              <w:bottom w:val="single" w:color="000000" w:sz="4"/>
-              <w:right w:val="single" w:color="000000" w:sz="4"/>
-            </w:tcBorders>
-            <w:tcMar>
-              <w:top w:type="dxa" w:w="50"/>
-              <w:left w:type="dxa" w:w="90"/>
-              <w:bottom w:type="dxa" w:w="50"/>
-              <w:right w:type="dxa" w:w="90"/>
-            </w:tcMar>
-          </w:tcPr>
-          <w:p>
-            <w:pPr>
-              <w:spacing w:after="0"/>
-              <w:jc w:val="center"/>
-            </w:pPr>
-            <w:r>
-              <w:rPr>
-                <w:rFonts w:ascii="Arial" w:cs="Arial" w:eastAsia="Arial" w:hAnsi="Arial"/>
-                <w:b w:val="false"/>
-                <w:bCs w:val="false"/>
-                <w:i w:val="false"/>
-                <w:iCs w:val="false"/>
-                <w:sz w:val="19"/>
-                <w:szCs w:val="19"/>
-              </w:rPr>
-              <w:t xml:space="preserve">1</w:t>
-            </w:r>
-          </w:p>
-        </w:tc>
-        <w:tc>
-          <w:tcPr>
-            <w:tcW w:type="dxa" w:w="1800"/>
-            <w:tcBorders>
-              <w:top w:val="single" w:color="000000" w:sz="4"/>
-              <w:left w:val="single" w:color="000000" w:sz="4"/>
-              <w:bottom w:val="single" w:color="000000" w:sz="4"/>
-              <w:right w:val="single" w:color="000000" w:sz="4"/>
-            </w:tcBorders>
-            <w:tcMar>
-              <w:top w:type="dxa" w:w="50"/>
-              <w:left w:type="dxa" w:w="90"/>
-              <w:bottom w:type="dxa" w:w="50"/>
-              <w:right w:type="dxa" w:w="90"/>
-            </w:tcMar>
-          </w:tcPr>
-          <w:p>
-            <w:pPr>
-              <w:spacing w:after="0"/>
-              <w:jc w:val="center"/>
-            </w:pPr>
-            <w:r>
-              <w:rPr>
-                <w:rFonts w:ascii="Arial" w:cs="Arial" w:eastAsia="Arial" w:hAnsi="Arial"/>
-                <w:b w:val="false"/>
-                <w:bCs w:val="false"/>
-                <w:i w:val="false"/>
-                <w:iCs w:val="false"/>
-                <w:sz w:val="19"/>
-                <w:szCs w:val="19"/>
-              </w:rPr>
-              <w:t xml:space="preserve">—</w:t>
-            </w:r>
-          </w:p>
-        </w:tc>
-      </w:tr>
-      <w:tr>
-        <w:trPr>
-          <w:cantSplit/>
-          <w:tblHeader w:val="false"/>
-        </w:trPr>
-        <w:tc>
-          <w:tcPr>
-            <w:tcW w:type="dxa" w:w="700"/>
-            <w:tcBorders>
-              <w:top w:val="single" w:color="000000" w:sz="4"/>
-              <w:left w:val="single" w:color="000000" w:sz="4"/>
-              <w:bottom w:val="single" w:color="000000" w:sz="4"/>
-              <w:right w:val="single" w:color="000000" w:sz="4"/>
-            </w:tcBorders>
-            <w:tcMar>
-              <w:top w:type="dxa" w:w="50"/>
-              <w:left w:type="dxa" w:w="90"/>
-              <w:bottom w:type="dxa" w:w="50"/>
-              <w:right w:type="dxa" w:w="90"/>
-            </w:tcMar>
-          </w:tcPr>
-          <w:p>
-            <w:pPr>
-              <w:spacing w:after="0"/>
-              <w:jc w:val="center"/>
-            </w:pPr>
-            <w:r>
-              <w:rPr>
-                <w:rFonts w:ascii="Arial" w:cs="Arial" w:eastAsia="Arial" w:hAnsi="Arial"/>
-                <w:b w:val="false"/>
-                <w:bCs w:val="false"/>
-                <w:i w:val="false"/>
-                <w:iCs w:val="false"/>
-                <w:sz w:val="19"/>
-                <w:szCs w:val="19"/>
-              </w:rPr>
-              <w:t xml:space="preserve">7</w:t>
-            </w:r>
-          </w:p>
-        </w:tc>
-        <w:tc>
-          <w:tcPr>
-            <w:tcW w:type="dxa" w:w="6038"/>
-            <w:tcBorders>
-              <w:top w:val="single" w:color="000000" w:sz="4"/>
-              <w:left w:val="single" w:color="000000" w:sz="4"/>
-              <w:bottom w:val="single" w:color="000000" w:sz="4"/>
-              <w:right w:val="single" w:color="000000" w:sz="4"/>
-            </w:tcBorders>
-            <w:tcMar>
-              <w:top w:type="dxa" w:w="50"/>
-              <w:left w:type="dxa" w:w="90"/>
-              <w:bottom w:type="dxa" w:w="50"/>
-              <w:right w:type="dxa" w:w="90"/>
-            </w:tcMar>
-          </w:tcPr>
-          <w:p>
-            <w:pPr>
-              <w:spacing w:after="0"/>
-              <w:jc w:val="left"/>
-            </w:pPr>
-            <w:r>
-              <w:rPr>
-                <w:rFonts w:ascii="Arial" w:cs="Arial" w:eastAsia="Arial" w:hAnsi="Arial"/>
-                <w:b w:val="false"/>
-                <w:bCs w:val="false"/>
-                <w:i w:val="false"/>
-                <w:iCs w:val="false"/>
-                <w:sz w:val="19"/>
-                <w:szCs w:val="19"/>
-              </w:rPr>
-              <w:t xml:space="preserve">Manual do usuário e referência de comandos do PTU-D300E</w:t>
+              <w:t xml:space="preserve">Conversor USB/RS-485 Black Box, modelo SP390A-R2</w:t>
             </w:r>
           </w:p>
         </w:tc>
@@ -1437,7 +853,7 @@
           <w:sz w:val="21"/>
           <w:szCs w:val="21"/>
         </w:rPr>
-        <w:t xml:space="preserve">Com o PTU desligado, ligar o cabo RS-485 entre o conversor USB/RS-485 e a porta host do PTU conforme a Tabela 2, preenchida com a pinagem do manual. Ligar o conversor numa porta USB do PC.</w:t>
+        <w:t xml:space="preserve">Com o PTU desligado, ligar o cabo RS-485 entre o conversor Black Box SP390A-R2 e a porta host do PTU conforme a Tabela 2, preenchida com a pinagem dos manuais do PTU e do conversor. Ligar o conversor numa porta USB do notebook; se o Windows não o reconhecer, instalar o driver do fabricante.</w:t>
       </w:r>
     </w:p>
     <w:p>
@@ -1472,7 +888,7 @@
           <w:sz w:val="21"/>
           <w:szCs w:val="21"/>
         </w:rPr>
-        <w:t xml:space="preserve">Com a fonte desligada, ligar o cabo de alimentação ao PTU conforme o manual (polaridade e tensão). Não energizar ainda.</w:t>
+        <w:t xml:space="preserve">Ligar a fonte Keysight N5766A com a saída desabilitada (OUTPUT OFF) e ajustar a tensão de saída e o limite de corrente conforme o manual do PTU-D300E. Desligar a fonte, ligar os cabos de alimentação aos terminais de saída da fonte e ao PTU, conferindo a polaridade (+ e −). Não energizar ainda.</w:t>
       </w:r>
     </w:p>
     <w:p>
@@ -1551,7 +967,7 @@
                 <w:sz w:val="19"/>
                 <w:szCs w:val="19"/>
               </w:rPr>
-              <w:t xml:space="preserve">PC Windows (Docklight)</w:t>
+              <w:t xml:space="preserve">Notebook Windows (Docklight)</w:t>
             </w:r>
           </w:p>
         </w:tc>
@@ -1621,7 +1037,7 @@
                 <w:sz w:val="19"/>
                 <w:szCs w:val="19"/>
               </w:rPr>
-              <w:t xml:space="preserve">Conversor USB/RS-485</w:t>
+              <w:t xml:space="preserve">Conversor Black Box SP390A-R2</w:t>
             </w:r>
           </w:p>
         </w:tc>
@@ -1761,7 +1177,7 @@
                 <w:sz w:val="19"/>
                 <w:szCs w:val="19"/>
               </w:rPr>
-              <w:t xml:space="preserve">PTU-D300E (porta host) + fonte</w:t>
+              <w:t xml:space="preserve">PTU-D300E (porta host) + fonte Keysight N5766A</w:t>
             </w:r>
           </w:p>
         </w:tc>
@@ -1876,7 +1292,7 @@
                 <w:sz w:val="19"/>
                 <w:szCs w:val="19"/>
               </w:rPr>
-              <w:t xml:space="preserve">CONVERSOR USB/RS-485</w:t>
+              <w:t xml:space="preserve">CONVERSOR SP390A-R2 (TERMINAL)</w:t>
             </w:r>
           </w:p>
         </w:tc>
@@ -2330,7 +1746,7 @@
           <w:sz w:val="21"/>
           <w:szCs w:val="21"/>
         </w:rPr>
-        <w:t xml:space="preserve">Energizar o PTU e aguardar os eixos pararem (fim do ciclo de reset da energização).</w:t>
+        <w:t xml:space="preserve">Ligar a fonte Keysight N5766A, conferir no display a tensão ajustada e habilitar a saída (OUTPUT ON) para energizar o PTU. Aguardar os eixos pararem (fim do ciclo de reset da energização).</w:t>
       </w:r>
     </w:p>
     <w:p>
@@ -5109,7 +4525,7 @@
                 <w:sz w:val="19"/>
                 <w:szCs w:val="19"/>
               </w:rPr>
-              <w:t xml:space="preserve">Permanência após desligar o PTU por 10 s e religar</w:t>
+              <w:t xml:space="preserve">Permanência após desligar a saída da fonte por 10 s e religar</w:t>
             </w:r>
           </w:p>
         </w:tc>
@@ -5430,7 +4846,7 @@
                 <w:sz w:val="19"/>
                 <w:szCs w:val="19"/>
               </w:rPr>
-              <w:t xml:space="preserve">Duração (s):</w:t>
+              <w:t xml:space="preserve"/>
             </w:r>
           </w:p>
         </w:tc>

</xml_diff>

<commit_message>
Docs: teste funcional do PTU-D300E com capturas do Docklight
Inclui quadros de figura nos passos do setup (4.1) para as capturas de
tela reais do Docklight e do Gerenciador de Dispositivos. Primeira
captura inserida: janela principal do Docklight Scripting V2.4 com
projeto em branco (Figura 3), guardada em docs/capturas-docklight/. As
demais figuras ficam marcadas para inserir.

Co-Authored-By: Claude Opus 5.5 <noreply@anthropic.com>
Claude-Session: https://claude.ai/code/session_01VvvtJDPvh4mDoSVpkHza1d
</commit_message>
<xml_diff>
--- a/docs/procedimento-teste-funcional-ptu-d300e.docx
+++ b/docs/procedimento-teste-funcional-ptu-d300e.docx
@@ -1728,6 +1728,113 @@
     </w:p>
     <w:p>
       <w:pPr>
+        <w:keepNext/>
+        <w:spacing w:after="60" w:before="120"/>
+        <w:jc w:val="center"/>
+      </w:pPr>
+      <w:r>
+        <w:rPr>
+          <w:rFonts w:ascii="Arial" w:cs="Arial" w:eastAsia="Arial" w:hAnsi="Arial"/>
+          <w:b/>
+          <w:bCs/>
+          <w:i w:val="false"/>
+          <w:iCs w:val="false"/>
+          <w:sz w:val="19"/>
+          <w:szCs w:val="19"/>
+        </w:rPr>
+        <w:t xml:space="preserve">Figura 2: Porta COM do conversor SP390A-R2 no Gerenciador de Dispositivos</w:t>
+      </w:r>
+    </w:p>
+    <w:tbl>
+      <w:tblPr>
+        <w:tblW w:type="dxa" w:w="7000"/>
+        <w:jc w:val="center"/>
+        <w:tblBorders>
+          <w:top w:val="single" w:color="auto" w:sz="4"/>
+          <w:left w:val="single" w:color="auto" w:sz="4"/>
+          <w:bottom w:val="single" w:color="auto" w:sz="4"/>
+          <w:right w:val="single" w:color="auto" w:sz="4"/>
+          <w:insideH w:val="single" w:color="auto" w:sz="4"/>
+          <w:insideV w:val="single" w:color="auto" w:sz="4"/>
+        </w:tblBorders>
+      </w:tblPr>
+      <w:tblGrid>
+        <w:gridCol w:w="7000"/>
+      </w:tblGrid>
+      <w:tr>
+        <w:trPr>
+          <w:cantSplit/>
+          <w:trHeight w:val="2600" w:hRule="atLeast"/>
+        </w:trPr>
+        <w:tc>
+          <w:tcPr>
+            <w:tcW w:type="dxa" w:w="7000"/>
+            <w:tcBorders>
+              <w:top w:val="dashed" w:color="808080" w:sz="6"/>
+              <w:left w:val="dashed" w:color="808080" w:sz="6"/>
+              <w:bottom w:val="dashed" w:color="808080" w:sz="6"/>
+              <w:right w:val="dashed" w:color="808080" w:sz="6"/>
+            </w:tcBorders>
+            <w:vAlign w:val="center"/>
+          </w:tcPr>
+          <w:p>
+            <w:pPr>
+              <w:jc w:val="center"/>
+            </w:pPr>
+            <w:r>
+              <w:rPr>
+                <w:rFonts w:ascii="Arial" w:cs="Arial" w:eastAsia="Arial" w:hAnsi="Arial"/>
+                <w:b/>
+                <w:bCs/>
+                <w:i w:val="false"/>
+                <w:iCs w:val="false"/>
+                <w:sz w:val="18"/>
+                <w:szCs w:val="18"/>
+              </w:rPr>
+              <w:t xml:space="preserve">INSERIR CAPTURA DE TELA — FIGURA 2</w:t>
+            </w:r>
+          </w:p>
+          <w:p>
+            <w:pPr>
+              <w:jc w:val="center"/>
+            </w:pPr>
+            <w:r>
+              <w:rPr>
+                <w:rFonts w:ascii="Arial" w:cs="Arial" w:eastAsia="Arial" w:hAnsi="Arial"/>
+                <w:b w:val="false"/>
+                <w:bCs w:val="false"/>
+                <w:i/>
+                <w:iCs/>
+                <w:sz w:val="17"/>
+                <w:szCs w:val="17"/>
+              </w:rPr>
+              <w:t xml:space="preserve">Gerenciador de Dispositivos com "Portas (COM e LPT)" expandido, mostrando o SP390A-R2 e o número da COM.</w:t>
+            </w:r>
+          </w:p>
+        </w:tc>
+      </w:tr>
+    </w:tbl>
+    <w:p>
+      <w:pPr>
+        <w:keepNext w:val="false"/>
+        <w:spacing w:after="80" w:before="0"/>
+        <w:jc w:val="both"/>
+      </w:pPr>
+      <w:r>
+        <w:rPr>
+          <w:rFonts w:ascii="Arial" w:cs="Arial" w:eastAsia="Arial" w:hAnsi="Arial"/>
+          <w:b w:val="false"/>
+          <w:bCs w:val="false"/>
+          <w:i w:val="false"/>
+          <w:iCs w:val="false"/>
+          <w:sz w:val="21"/>
+          <w:szCs w:val="21"/>
+        </w:rPr>
+        <w:t xml:space="preserve"/>
+      </w:r>
+    </w:p>
+    <w:p>
+      <w:pPr>
         <w:pStyle w:val="ListParagraph"/>
         <w:numPr>
           <w:ilvl w:val="0"/>
@@ -1774,6 +1881,305 @@
     </w:p>
     <w:p>
       <w:pPr>
+        <w:keepNext/>
+        <w:spacing w:after="60" w:before="120"/>
+        <w:jc w:val="center"/>
+      </w:pPr>
+      <w:r>
+        <w:rPr>
+          <w:rFonts w:ascii="Arial" w:cs="Arial" w:eastAsia="Arial" w:hAnsi="Arial"/>
+          <w:b/>
+          <w:bCs/>
+          <w:i w:val="false"/>
+          <w:iCs w:val="false"/>
+          <w:sz w:val="19"/>
+          <w:szCs w:val="19"/>
+        </w:rPr>
+        <w:t xml:space="preserve">Figura 3: Docklight — janela principal com projeto em branco (porta ainda fechada; na barra de status, a porta e os parâmetros seriais em uso)</w:t>
+      </w:r>
+    </w:p>
+    <w:p>
+      <w:pPr>
+        <w:keepNext/>
+        <w:spacing w:line="240" w:lineRule="auto"/>
+        <w:jc w:val="center"/>
+      </w:pPr>
+      <w:r>
+        <w:drawing>
+          <wp:inline distT="0" distB="0" distL="0" distR="0">
+            <wp:extent cx="6000750" cy="3219450"/>
+            <wp:effectExtent t="0" r="0" b="0" l="0"/>
+            <wp:docPr id="1" name="fig3" descr="Docklight — janela principal com projeto em branco (porta ainda fechada; na barra de status, a porta e os parâmetros seriais em uso)" title="Docklight — janela principal com projeto em branco (porta ainda fechada; na barra de status, a porta e os parâmetros seriais em uso)"/>
+            <wp:cNvGraphicFramePr>
+              <a:graphicFrameLocks xmlns:a="http://schemas.openxmlformats.org/drawingml/2006/main" noChangeAspect="1"/>
+            </wp:cNvGraphicFramePr>
+            <a:graphic xmlns:a="http://schemas.openxmlformats.org/drawingml/2006/main">
+              <a:graphicData uri="http://schemas.openxmlformats.org/drawingml/2006/picture">
+                <pic:pic xmlns:pic="http://schemas.openxmlformats.org/drawingml/2006/picture">
+                  <pic:nvPicPr>
+                    <pic:cNvPr id="0" name="" descr=""/>
+                    <pic:cNvPicPr>
+                      <a:picLocks noChangeAspect="1" noChangeArrowheads="1"/>
+                    </pic:cNvPicPr>
+                  </pic:nvPicPr>
+                  <pic:blipFill>
+                    <a:blip r:embed="rId9" cstate="none"/>
+                    <a:srcRect/>
+                    <a:stretch>
+                      <a:fillRect/>
+                    </a:stretch>
+                  </pic:blipFill>
+                  <pic:spPr bwMode="auto">
+                    <a:xfrm>
+                      <a:off x="0" y="0"/>
+                      <a:ext cx="6000750" cy="3219450"/>
+                    </a:xfrm>
+                    <a:prstGeom prst="rect">
+                      <a:avLst/>
+                    </a:prstGeom>
+                  </pic:spPr>
+                </pic:pic>
+              </a:graphicData>
+            </a:graphic>
+          </wp:inline>
+        </w:drawing>
+      </w:r>
+    </w:p>
+    <w:p>
+      <w:pPr>
+        <w:keepNext w:val="false"/>
+        <w:spacing w:after="80" w:before="0"/>
+        <w:jc w:val="both"/>
+      </w:pPr>
+      <w:r>
+        <w:rPr>
+          <w:rFonts w:ascii="Arial" w:cs="Arial" w:eastAsia="Arial" w:hAnsi="Arial"/>
+          <w:b w:val="false"/>
+          <w:bCs w:val="false"/>
+          <w:i w:val="false"/>
+          <w:iCs w:val="false"/>
+          <w:sz w:val="21"/>
+          <w:szCs w:val="21"/>
+        </w:rPr>
+        <w:t xml:space="preserve"/>
+      </w:r>
+    </w:p>
+    <w:p>
+      <w:pPr>
+        <w:keepNext/>
+        <w:spacing w:after="60" w:before="120"/>
+        <w:jc w:val="center"/>
+      </w:pPr>
+      <w:r>
+        <w:rPr>
+          <w:rFonts w:ascii="Arial" w:cs="Arial" w:eastAsia="Arial" w:hAnsi="Arial"/>
+          <w:b/>
+          <w:bCs/>
+          <w:i w:val="false"/>
+          <w:iCs w:val="false"/>
+          <w:sz w:val="19"/>
+          <w:szCs w:val="19"/>
+        </w:rPr>
+        <w:t xml:space="preserve">Figura 4: Docklight — Project Settings, aba Communication</w:t>
+      </w:r>
+    </w:p>
+    <w:tbl>
+      <w:tblPr>
+        <w:tblW w:type="dxa" w:w="7000"/>
+        <w:jc w:val="center"/>
+        <w:tblBorders>
+          <w:top w:val="single" w:color="auto" w:sz="4"/>
+          <w:left w:val="single" w:color="auto" w:sz="4"/>
+          <w:bottom w:val="single" w:color="auto" w:sz="4"/>
+          <w:right w:val="single" w:color="auto" w:sz="4"/>
+          <w:insideH w:val="single" w:color="auto" w:sz="4"/>
+          <w:insideV w:val="single" w:color="auto" w:sz="4"/>
+        </w:tblBorders>
+      </w:tblPr>
+      <w:tblGrid>
+        <w:gridCol w:w="7000"/>
+      </w:tblGrid>
+      <w:tr>
+        <w:trPr>
+          <w:cantSplit/>
+          <w:trHeight w:val="2600" w:hRule="atLeast"/>
+        </w:trPr>
+        <w:tc>
+          <w:tcPr>
+            <w:tcW w:type="dxa" w:w="7000"/>
+            <w:tcBorders>
+              <w:top w:val="dashed" w:color="808080" w:sz="6"/>
+              <w:left w:val="dashed" w:color="808080" w:sz="6"/>
+              <w:bottom w:val="dashed" w:color="808080" w:sz="6"/>
+              <w:right w:val="dashed" w:color="808080" w:sz="6"/>
+            </w:tcBorders>
+            <w:vAlign w:val="center"/>
+          </w:tcPr>
+          <w:p>
+            <w:pPr>
+              <w:jc w:val="center"/>
+            </w:pPr>
+            <w:r>
+              <w:rPr>
+                <w:rFonts w:ascii="Arial" w:cs="Arial" w:eastAsia="Arial" w:hAnsi="Arial"/>
+                <w:b/>
+                <w:bCs/>
+                <w:i w:val="false"/>
+                <w:iCs w:val="false"/>
+                <w:sz w:val="18"/>
+                <w:szCs w:val="18"/>
+              </w:rPr>
+              <w:t xml:space="preserve">INSERIR CAPTURA DE TELA — FIGURA 4</w:t>
+            </w:r>
+          </w:p>
+          <w:p>
+            <w:pPr>
+              <w:jc w:val="center"/>
+            </w:pPr>
+            <w:r>
+              <w:rPr>
+                <w:rFonts w:ascii="Arial" w:cs="Arial" w:eastAsia="Arial" w:hAnsi="Arial"/>
+                <w:b w:val="false"/>
+                <w:bCs w:val="false"/>
+                <w:i/>
+                <w:iCs/>
+                <w:sz w:val="17"/>
+                <w:szCs w:val="17"/>
+              </w:rPr>
+              <w:t xml:space="preserve">Aba Communication preenchida: Send/Receive, COM do conversor, 9600, None, 8, 1.</w:t>
+            </w:r>
+          </w:p>
+        </w:tc>
+      </w:tr>
+    </w:tbl>
+    <w:p>
+      <w:pPr>
+        <w:keepNext w:val="false"/>
+        <w:spacing w:after="80" w:before="0"/>
+        <w:jc w:val="both"/>
+      </w:pPr>
+      <w:r>
+        <w:rPr>
+          <w:rFonts w:ascii="Arial" w:cs="Arial" w:eastAsia="Arial" w:hAnsi="Arial"/>
+          <w:b w:val="false"/>
+          <w:bCs w:val="false"/>
+          <w:i w:val="false"/>
+          <w:iCs w:val="false"/>
+          <w:sz w:val="21"/>
+          <w:szCs w:val="21"/>
+        </w:rPr>
+        <w:t xml:space="preserve"/>
+      </w:r>
+    </w:p>
+    <w:p>
+      <w:pPr>
+        <w:keepNext/>
+        <w:spacing w:after="60" w:before="120"/>
+        <w:jc w:val="center"/>
+      </w:pPr>
+      <w:r>
+        <w:rPr>
+          <w:rFonts w:ascii="Arial" w:cs="Arial" w:eastAsia="Arial" w:hAnsi="Arial"/>
+          <w:b/>
+          <w:bCs/>
+          <w:i w:val="false"/>
+          <w:iCs w:val="false"/>
+          <w:sz w:val="19"/>
+          <w:szCs w:val="19"/>
+        </w:rPr>
+        <w:t xml:space="preserve">Figura 5: Docklight — Project Settings, aba Flow Control</w:t>
+      </w:r>
+    </w:p>
+    <w:tbl>
+      <w:tblPr>
+        <w:tblW w:type="dxa" w:w="7000"/>
+        <w:jc w:val="center"/>
+        <w:tblBorders>
+          <w:top w:val="single" w:color="auto" w:sz="4"/>
+          <w:left w:val="single" w:color="auto" w:sz="4"/>
+          <w:bottom w:val="single" w:color="auto" w:sz="4"/>
+          <w:right w:val="single" w:color="auto" w:sz="4"/>
+          <w:insideH w:val="single" w:color="auto" w:sz="4"/>
+          <w:insideV w:val="single" w:color="auto" w:sz="4"/>
+        </w:tblBorders>
+      </w:tblPr>
+      <w:tblGrid>
+        <w:gridCol w:w="7000"/>
+      </w:tblGrid>
+      <w:tr>
+        <w:trPr>
+          <w:cantSplit/>
+          <w:trHeight w:val="2600" w:hRule="atLeast"/>
+        </w:trPr>
+        <w:tc>
+          <w:tcPr>
+            <w:tcW w:type="dxa" w:w="7000"/>
+            <w:tcBorders>
+              <w:top w:val="dashed" w:color="808080" w:sz="6"/>
+              <w:left w:val="dashed" w:color="808080" w:sz="6"/>
+              <w:bottom w:val="dashed" w:color="808080" w:sz="6"/>
+              <w:right w:val="dashed" w:color="808080" w:sz="6"/>
+            </w:tcBorders>
+            <w:vAlign w:val="center"/>
+          </w:tcPr>
+          <w:p>
+            <w:pPr>
+              <w:jc w:val="center"/>
+            </w:pPr>
+            <w:r>
+              <w:rPr>
+                <w:rFonts w:ascii="Arial" w:cs="Arial" w:eastAsia="Arial" w:hAnsi="Arial"/>
+                <w:b/>
+                <w:bCs/>
+                <w:i w:val="false"/>
+                <w:iCs w:val="false"/>
+                <w:sz w:val="18"/>
+                <w:szCs w:val="18"/>
+              </w:rPr>
+              <w:t xml:space="preserve">INSERIR CAPTURA DE TELA — FIGURA 5</w:t>
+            </w:r>
+          </w:p>
+          <w:p>
+            <w:pPr>
+              <w:jc w:val="center"/>
+            </w:pPr>
+            <w:r>
+              <w:rPr>
+                <w:rFonts w:ascii="Arial" w:cs="Arial" w:eastAsia="Arial" w:hAnsi="Arial"/>
+                <w:b w:val="false"/>
+                <w:bCs w:val="false"/>
+                <w:i/>
+                <w:iCs/>
+                <w:sz w:val="17"/>
+                <w:szCs w:val="17"/>
+              </w:rPr>
+              <w:t xml:space="preserve">Aba Flow Control com Flow Control Support = Off.</w:t>
+            </w:r>
+          </w:p>
+        </w:tc>
+      </w:tr>
+    </w:tbl>
+    <w:p>
+      <w:pPr>
+        <w:keepNext w:val="false"/>
+        <w:spacing w:after="80" w:before="0"/>
+        <w:jc w:val="both"/>
+      </w:pPr>
+      <w:r>
+        <w:rPr>
+          <w:rFonts w:ascii="Arial" w:cs="Arial" w:eastAsia="Arial" w:hAnsi="Arial"/>
+          <w:b w:val="false"/>
+          <w:bCs w:val="false"/>
+          <w:i w:val="false"/>
+          <w:iCs w:val="false"/>
+          <w:sz w:val="21"/>
+          <w:szCs w:val="21"/>
+        </w:rPr>
+        <w:t xml:space="preserve"/>
+      </w:r>
+    </w:p>
+    <w:p>
+      <w:pPr>
         <w:pStyle w:val="ListParagraph"/>
         <w:numPr>
           <w:ilvl w:val="0"/>
@@ -1793,6 +2199,220 @@
           <w:szCs w:val="21"/>
         </w:rPr>
         <w:t xml:space="preserve">No painel Send Sequences, dar duplo clique numa linha vazia e cadastrar cada comando da Tabela 3: digitar o nome, selecionar Edit Mode = HEX e digitar os bytes (o 0D final é o Enter/CR, obrigatório).</w:t>
+      </w:r>
+    </w:p>
+    <w:p>
+      <w:pPr>
+        <w:keepNext/>
+        <w:spacing w:after="60" w:before="120"/>
+        <w:jc w:val="center"/>
+      </w:pPr>
+      <w:r>
+        <w:rPr>
+          <w:rFonts w:ascii="Arial" w:cs="Arial" w:eastAsia="Arial" w:hAnsi="Arial"/>
+          <w:b/>
+          <w:bCs/>
+          <w:i w:val="false"/>
+          <w:iCs w:val="false"/>
+          <w:sz w:val="19"/>
+          <w:szCs w:val="19"/>
+        </w:rPr>
+        <w:t xml:space="preserve">Figura 6: Docklight — Edit Send Sequence em modo HEX</w:t>
+      </w:r>
+    </w:p>
+    <w:tbl>
+      <w:tblPr>
+        <w:tblW w:type="dxa" w:w="7000"/>
+        <w:jc w:val="center"/>
+        <w:tblBorders>
+          <w:top w:val="single" w:color="auto" w:sz="4"/>
+          <w:left w:val="single" w:color="auto" w:sz="4"/>
+          <w:bottom w:val="single" w:color="auto" w:sz="4"/>
+          <w:right w:val="single" w:color="auto" w:sz="4"/>
+          <w:insideH w:val="single" w:color="auto" w:sz="4"/>
+          <w:insideV w:val="single" w:color="auto" w:sz="4"/>
+        </w:tblBorders>
+      </w:tblPr>
+      <w:tblGrid>
+        <w:gridCol w:w="7000"/>
+      </w:tblGrid>
+      <w:tr>
+        <w:trPr>
+          <w:cantSplit/>
+          <w:trHeight w:val="2600" w:hRule="atLeast"/>
+        </w:trPr>
+        <w:tc>
+          <w:tcPr>
+            <w:tcW w:type="dxa" w:w="7000"/>
+            <w:tcBorders>
+              <w:top w:val="dashed" w:color="808080" w:sz="6"/>
+              <w:left w:val="dashed" w:color="808080" w:sz="6"/>
+              <w:bottom w:val="dashed" w:color="808080" w:sz="6"/>
+              <w:right w:val="dashed" w:color="808080" w:sz="6"/>
+            </w:tcBorders>
+            <w:vAlign w:val="center"/>
+          </w:tcPr>
+          <w:p>
+            <w:pPr>
+              <w:jc w:val="center"/>
+            </w:pPr>
+            <w:r>
+              <w:rPr>
+                <w:rFonts w:ascii="Arial" w:cs="Arial" w:eastAsia="Arial" w:hAnsi="Arial"/>
+                <w:b/>
+                <w:bCs/>
+                <w:i w:val="false"/>
+                <w:iCs w:val="false"/>
+                <w:sz w:val="18"/>
+                <w:szCs w:val="18"/>
+              </w:rPr>
+              <w:t xml:space="preserve">INSERIR CAPTURA DE TELA — FIGURA 6</w:t>
+            </w:r>
+          </w:p>
+          <w:p>
+            <w:pPr>
+              <w:jc w:val="center"/>
+            </w:pPr>
+            <w:r>
+              <w:rPr>
+                <w:rFonts w:ascii="Arial" w:cs="Arial" w:eastAsia="Arial" w:hAnsi="Arial"/>
+                <w:b w:val="false"/>
+                <w:bCs w:val="false"/>
+                <w:i/>
+                <w:iCs/>
+                <w:sz w:val="17"/>
+                <w:szCs w:val="17"/>
+              </w:rPr>
+              <w:t xml:space="preserve">Diálogo Edit Send Sequence com Name = Versao, Edit Mode = HEX e os bytes digitados (ex.: 56 0D).</w:t>
+            </w:r>
+          </w:p>
+        </w:tc>
+      </w:tr>
+    </w:tbl>
+    <w:p>
+      <w:pPr>
+        <w:keepNext w:val="false"/>
+        <w:spacing w:after="80" w:before="0"/>
+        <w:jc w:val="both"/>
+      </w:pPr>
+      <w:r>
+        <w:rPr>
+          <w:rFonts w:ascii="Arial" w:cs="Arial" w:eastAsia="Arial" w:hAnsi="Arial"/>
+          <w:b w:val="false"/>
+          <w:bCs w:val="false"/>
+          <w:i w:val="false"/>
+          <w:iCs w:val="false"/>
+          <w:sz w:val="21"/>
+          <w:szCs w:val="21"/>
+        </w:rPr>
+        <w:t xml:space="preserve"/>
+      </w:r>
+    </w:p>
+    <w:p>
+      <w:pPr>
+        <w:keepNext/>
+        <w:spacing w:after="60" w:before="120"/>
+        <w:jc w:val="center"/>
+      </w:pPr>
+      <w:r>
+        <w:rPr>
+          <w:rFonts w:ascii="Arial" w:cs="Arial" w:eastAsia="Arial" w:hAnsi="Arial"/>
+          <w:b/>
+          <w:bCs/>
+          <w:i w:val="false"/>
+          <w:iCs w:val="false"/>
+          <w:sz w:val="19"/>
+          <w:szCs w:val="19"/>
+        </w:rPr>
+        <w:t xml:space="preserve">Figura 7: Docklight — painel Send Sequences com os comandos cadastrados</w:t>
+      </w:r>
+    </w:p>
+    <w:tbl>
+      <w:tblPr>
+        <w:tblW w:type="dxa" w:w="7000"/>
+        <w:jc w:val="center"/>
+        <w:tblBorders>
+          <w:top w:val="single" w:color="auto" w:sz="4"/>
+          <w:left w:val="single" w:color="auto" w:sz="4"/>
+          <w:bottom w:val="single" w:color="auto" w:sz="4"/>
+          <w:right w:val="single" w:color="auto" w:sz="4"/>
+          <w:insideH w:val="single" w:color="auto" w:sz="4"/>
+          <w:insideV w:val="single" w:color="auto" w:sz="4"/>
+        </w:tblBorders>
+      </w:tblPr>
+      <w:tblGrid>
+        <w:gridCol w:w="7000"/>
+      </w:tblGrid>
+      <w:tr>
+        <w:trPr>
+          <w:cantSplit/>
+          <w:trHeight w:val="2600" w:hRule="atLeast"/>
+        </w:trPr>
+        <w:tc>
+          <w:tcPr>
+            <w:tcW w:type="dxa" w:w="7000"/>
+            <w:tcBorders>
+              <w:top w:val="dashed" w:color="808080" w:sz="6"/>
+              <w:left w:val="dashed" w:color="808080" w:sz="6"/>
+              <w:bottom w:val="dashed" w:color="808080" w:sz="6"/>
+              <w:right w:val="dashed" w:color="808080" w:sz="6"/>
+            </w:tcBorders>
+            <w:vAlign w:val="center"/>
+          </w:tcPr>
+          <w:p>
+            <w:pPr>
+              <w:jc w:val="center"/>
+            </w:pPr>
+            <w:r>
+              <w:rPr>
+                <w:rFonts w:ascii="Arial" w:cs="Arial" w:eastAsia="Arial" w:hAnsi="Arial"/>
+                <w:b/>
+                <w:bCs/>
+                <w:i w:val="false"/>
+                <w:iCs w:val="false"/>
+                <w:sz w:val="18"/>
+                <w:szCs w:val="18"/>
+              </w:rPr>
+              <w:t xml:space="preserve">INSERIR CAPTURA DE TELA — FIGURA 7</w:t>
+            </w:r>
+          </w:p>
+          <w:p>
+            <w:pPr>
+              <w:jc w:val="center"/>
+            </w:pPr>
+            <w:r>
+              <w:rPr>
+                <w:rFonts w:ascii="Arial" w:cs="Arial" w:eastAsia="Arial" w:hAnsi="Arial"/>
+                <w:b w:val="false"/>
+                <w:bCs w:val="false"/>
+                <w:i/>
+                <w:iCs/>
+                <w:sz w:val="17"/>
+                <w:szCs w:val="17"/>
+              </w:rPr>
+              <w:t xml:space="preserve">Painel Send Sequences com as 11 sequências da Tabela 3.</w:t>
+            </w:r>
+          </w:p>
+        </w:tc>
+      </w:tr>
+    </w:tbl>
+    <w:p>
+      <w:pPr>
+        <w:keepNext w:val="false"/>
+        <w:spacing w:after="80" w:before="0"/>
+        <w:jc w:val="both"/>
+      </w:pPr>
+      <w:r>
+        <w:rPr>
+          <w:rFonts w:ascii="Arial" w:cs="Arial" w:eastAsia="Arial" w:hAnsi="Arial"/>
+          <w:b w:val="false"/>
+          <w:bCs w:val="false"/>
+          <w:i w:val="false"/>
+          <w:iCs w:val="false"/>
+          <w:sz w:val="21"/>
+          <w:szCs w:val="21"/>
+        </w:rPr>
+        <w:t xml:space="preserve"/>
       </w:r>
     </w:p>
     <w:p>
@@ -1820,6 +2440,113 @@
     </w:p>
     <w:p>
       <w:pPr>
+        <w:keepNext/>
+        <w:spacing w:after="60" w:before="120"/>
+        <w:jc w:val="center"/>
+      </w:pPr>
+      <w:r>
+        <w:rPr>
+          <w:rFonts w:ascii="Arial" w:cs="Arial" w:eastAsia="Arial" w:hAnsi="Arial"/>
+          <w:b/>
+          <w:bCs/>
+          <w:i w:val="false"/>
+          <w:iCs w:val="false"/>
+          <w:sz w:val="19"/>
+          <w:szCs w:val="19"/>
+        </w:rPr>
+        <w:t xml:space="preserve">Figura 8: Docklight — início do registro (log) da comunicação</w:t>
+      </w:r>
+    </w:p>
+    <w:tbl>
+      <w:tblPr>
+        <w:tblW w:type="dxa" w:w="7000"/>
+        <w:jc w:val="center"/>
+        <w:tblBorders>
+          <w:top w:val="single" w:color="auto" w:sz="4"/>
+          <w:left w:val="single" w:color="auto" w:sz="4"/>
+          <w:bottom w:val="single" w:color="auto" w:sz="4"/>
+          <w:right w:val="single" w:color="auto" w:sz="4"/>
+          <w:insideH w:val="single" w:color="auto" w:sz="4"/>
+          <w:insideV w:val="single" w:color="auto" w:sz="4"/>
+        </w:tblBorders>
+      </w:tblPr>
+      <w:tblGrid>
+        <w:gridCol w:w="7000"/>
+      </w:tblGrid>
+      <w:tr>
+        <w:trPr>
+          <w:cantSplit/>
+          <w:trHeight w:val="2600" w:hRule="atLeast"/>
+        </w:trPr>
+        <w:tc>
+          <w:tcPr>
+            <w:tcW w:type="dxa" w:w="7000"/>
+            <w:tcBorders>
+              <w:top w:val="dashed" w:color="808080" w:sz="6"/>
+              <w:left w:val="dashed" w:color="808080" w:sz="6"/>
+              <w:bottom w:val="dashed" w:color="808080" w:sz="6"/>
+              <w:right w:val="dashed" w:color="808080" w:sz="6"/>
+            </w:tcBorders>
+            <w:vAlign w:val="center"/>
+          </w:tcPr>
+          <w:p>
+            <w:pPr>
+              <w:jc w:val="center"/>
+            </w:pPr>
+            <w:r>
+              <w:rPr>
+                <w:rFonts w:ascii="Arial" w:cs="Arial" w:eastAsia="Arial" w:hAnsi="Arial"/>
+                <w:b/>
+                <w:bCs/>
+                <w:i w:val="false"/>
+                <w:iCs w:val="false"/>
+                <w:sz w:val="18"/>
+                <w:szCs w:val="18"/>
+              </w:rPr>
+              <w:t xml:space="preserve">INSERIR CAPTURA DE TELA — FIGURA 8</w:t>
+            </w:r>
+          </w:p>
+          <w:p>
+            <w:pPr>
+              <w:jc w:val="center"/>
+            </w:pPr>
+            <w:r>
+              <w:rPr>
+                <w:rFonts w:ascii="Arial" w:cs="Arial" w:eastAsia="Arial" w:hAnsi="Arial"/>
+                <w:b w:val="false"/>
+                <w:bCs w:val="false"/>
+                <w:i/>
+                <w:iCs/>
+                <w:sz w:val="17"/>
+                <w:szCs w:val="17"/>
+              </w:rPr>
+              <w:t xml:space="preserve">Diálogo Start Communication Logging com a pasta e o nome do arquivo.</w:t>
+            </w:r>
+          </w:p>
+        </w:tc>
+      </w:tr>
+    </w:tbl>
+    <w:p>
+      <w:pPr>
+        <w:keepNext w:val="false"/>
+        <w:spacing w:after="80" w:before="0"/>
+        <w:jc w:val="both"/>
+      </w:pPr>
+      <w:r>
+        <w:rPr>
+          <w:rFonts w:ascii="Arial" w:cs="Arial" w:eastAsia="Arial" w:hAnsi="Arial"/>
+          <w:b w:val="false"/>
+          <w:bCs w:val="false"/>
+          <w:i w:val="false"/>
+          <w:iCs w:val="false"/>
+          <w:sz w:val="21"/>
+          <w:szCs w:val="21"/>
+        </w:rPr>
+        <w:t xml:space="preserve"/>
+      </w:r>
+    </w:p>
+    <w:p>
+      <w:pPr>
         <w:pStyle w:val="ListParagraph"/>
         <w:numPr>
           <w:ilvl w:val="0"/>
@@ -1839,6 +2566,113 @@
           <w:szCs w:val="21"/>
         </w:rPr>
         <w:t xml:space="preserve">Clicar em Start Communication (ícone de "play"). Para enviar um comando, clicar na seta à esquerda do seu nome; enviar um de cada vez e conferir a resposta na aba ASCII antes do próximo. Respostas iniciadas por "*" indicam comando aceito; por "!", erro.</w:t>
+      </w:r>
+    </w:p>
+    <w:p>
+      <w:pPr>
+        <w:keepNext/>
+        <w:spacing w:after="60" w:before="120"/>
+        <w:jc w:val="center"/>
+      </w:pPr>
+      <w:r>
+        <w:rPr>
+          <w:rFonts w:ascii="Arial" w:cs="Arial" w:eastAsia="Arial" w:hAnsi="Arial"/>
+          <w:b/>
+          <w:bCs/>
+          <w:i w:val="false"/>
+          <w:iCs w:val="false"/>
+          <w:sz w:val="19"/>
+          <w:szCs w:val="19"/>
+        </w:rPr>
+        <w:t xml:space="preserve">Figura 9: Docklight — comunicação iniciada e resposta ao comando V</w:t>
+      </w:r>
+    </w:p>
+    <w:tbl>
+      <w:tblPr>
+        <w:tblW w:type="dxa" w:w="7000"/>
+        <w:jc w:val="center"/>
+        <w:tblBorders>
+          <w:top w:val="single" w:color="auto" w:sz="4"/>
+          <w:left w:val="single" w:color="auto" w:sz="4"/>
+          <w:bottom w:val="single" w:color="auto" w:sz="4"/>
+          <w:right w:val="single" w:color="auto" w:sz="4"/>
+          <w:insideH w:val="single" w:color="auto" w:sz="4"/>
+          <w:insideV w:val="single" w:color="auto" w:sz="4"/>
+        </w:tblBorders>
+      </w:tblPr>
+      <w:tblGrid>
+        <w:gridCol w:w="7000"/>
+      </w:tblGrid>
+      <w:tr>
+        <w:trPr>
+          <w:cantSplit/>
+          <w:trHeight w:val="2600" w:hRule="atLeast"/>
+        </w:trPr>
+        <w:tc>
+          <w:tcPr>
+            <w:tcW w:type="dxa" w:w="7000"/>
+            <w:tcBorders>
+              <w:top w:val="dashed" w:color="808080" w:sz="6"/>
+              <w:left w:val="dashed" w:color="808080" w:sz="6"/>
+              <w:bottom w:val="dashed" w:color="808080" w:sz="6"/>
+              <w:right w:val="dashed" w:color="808080" w:sz="6"/>
+            </w:tcBorders>
+            <w:vAlign w:val="center"/>
+          </w:tcPr>
+          <w:p>
+            <w:pPr>
+              <w:jc w:val="center"/>
+            </w:pPr>
+            <w:r>
+              <w:rPr>
+                <w:rFonts w:ascii="Arial" w:cs="Arial" w:eastAsia="Arial" w:hAnsi="Arial"/>
+                <w:b/>
+                <w:bCs/>
+                <w:i w:val="false"/>
+                <w:iCs w:val="false"/>
+                <w:sz w:val="18"/>
+                <w:szCs w:val="18"/>
+              </w:rPr>
+              <w:t xml:space="preserve">INSERIR CAPTURA DE TELA — FIGURA 9</w:t>
+            </w:r>
+          </w:p>
+          <w:p>
+            <w:pPr>
+              <w:jc w:val="center"/>
+            </w:pPr>
+            <w:r>
+              <w:rPr>
+                <w:rFonts w:ascii="Arial" w:cs="Arial" w:eastAsia="Arial" w:hAnsi="Arial"/>
+                <w:b w:val="false"/>
+                <w:bCs w:val="false"/>
+                <w:i/>
+                <w:iCs/>
+                <w:sz w:val="17"/>
+                <w:szCs w:val="17"/>
+              </w:rPr>
+              <w:t xml:space="preserve">Janela principal com a comunicação aberta (botão Start Communication) e a aba ASCII mostrando o envio de V e a resposta "*" do PTU.</w:t>
+            </w:r>
+          </w:p>
+        </w:tc>
+      </w:tr>
+    </w:tbl>
+    <w:p>
+      <w:pPr>
+        <w:keepNext w:val="false"/>
+        <w:spacing w:after="80" w:before="0"/>
+        <w:jc w:val="both"/>
+      </w:pPr>
+      <w:r>
+        <w:rPr>
+          <w:rFonts w:ascii="Arial" w:cs="Arial" w:eastAsia="Arial" w:hAnsi="Arial"/>
+          <w:b w:val="false"/>
+          <w:bCs w:val="false"/>
+          <w:i w:val="false"/>
+          <w:iCs w:val="false"/>
+          <w:sz w:val="21"/>
+          <w:szCs w:val="21"/>
+        </w:rPr>
+        <w:t xml:space="preserve"/>
       </w:r>
     </w:p>
     <w:p>

</xml_diff>

<commit_message>
Docs: teste funcional do PTU-D300E, Figura 2 (Gerenciador de Dispositivos)
Captura real do Gerenciador de Dispositivos com o conversor SP390A-R2
como USB Serial Port (COM10), recortada e destacada; passo 4.1.1 cita
o nome com que o conversor aparece.

Co-Authored-By: Claude Opus 5.5 <noreply@anthropic.com>
Claude-Session: https://claude.ai/code/session_01VvvtJDPvh4mDoSVpkHza1d
</commit_message>
<xml_diff>
--- a/docs/procedimento-teste-funcional-ptu-d300e.docx
+++ b/docs/procedimento-teste-funcional-ptu-d300e.docx
@@ -1723,7 +1723,7 @@
           <w:sz w:val="21"/>
           <w:szCs w:val="21"/>
         </w:rPr>
-        <w:t xml:space="preserve">No Gerenciador de Dispositivos do Windows (tecla Windows + X), em "Portas (COM e LPT)", anotar a porta COM do conversor (ex.: COM5).</w:t>
+        <w:t xml:space="preserve">No Gerenciador de Dispositivos do Windows (tecla Windows + X), em "Portas (COM e LPT)", anotar a porta COM do conversor SP390A-R2, que aparece como "USB Serial Port (COMx)" — na Figura 2, COM10.</w:t>
       </w:r>
     </w:p>
     <w:p>
@@ -1742,78 +1742,56 @@
           <w:sz w:val="19"/>
           <w:szCs w:val="19"/>
         </w:rPr>
-        <w:t xml:space="preserve">Figura 2: Porta COM do conversor SP390A-R2 no Gerenciador de Dispositivos</w:t>
+        <w:t xml:space="preserve">Figura 2: Gerenciador de Dispositivos — conversor SP390A-R2 como USB Serial Port (COM10)</w:t>
       </w:r>
     </w:p>
-    <w:tbl>
-      <w:tblPr>
-        <w:tblW w:type="dxa" w:w="7000"/>
+    <w:p>
+      <w:pPr>
+        <w:keepNext/>
+        <w:spacing w:line="240" w:lineRule="auto"/>
         <w:jc w:val="center"/>
-        <w:tblBorders>
-          <w:top w:val="single" w:color="auto" w:sz="4"/>
-          <w:left w:val="single" w:color="auto" w:sz="4"/>
-          <w:bottom w:val="single" w:color="auto" w:sz="4"/>
-          <w:right w:val="single" w:color="auto" w:sz="4"/>
-          <w:insideH w:val="single" w:color="auto" w:sz="4"/>
-          <w:insideV w:val="single" w:color="auto" w:sz="4"/>
-        </w:tblBorders>
-      </w:tblPr>
-      <w:tblGrid>
-        <w:gridCol w:w="7000"/>
-      </w:tblGrid>
-      <w:tr>
-        <w:trPr>
-          <w:cantSplit/>
-          <w:trHeight w:val="2600" w:hRule="atLeast"/>
-        </w:trPr>
-        <w:tc>
-          <w:tcPr>
-            <w:tcW w:type="dxa" w:w="7000"/>
-            <w:tcBorders>
-              <w:top w:val="dashed" w:color="808080" w:sz="6"/>
-              <w:left w:val="dashed" w:color="808080" w:sz="6"/>
-              <w:bottom w:val="dashed" w:color="808080" w:sz="6"/>
-              <w:right w:val="dashed" w:color="808080" w:sz="6"/>
-            </w:tcBorders>
-            <w:vAlign w:val="center"/>
-          </w:tcPr>
-          <w:p>
-            <w:pPr>
-              <w:jc w:val="center"/>
-            </w:pPr>
-            <w:r>
-              <w:rPr>
-                <w:rFonts w:ascii="Arial" w:cs="Arial" w:eastAsia="Arial" w:hAnsi="Arial"/>
-                <w:b/>
-                <w:bCs/>
-                <w:i w:val="false"/>
-                <w:iCs w:val="false"/>
-                <w:sz w:val="18"/>
-                <w:szCs w:val="18"/>
-              </w:rPr>
-              <w:t xml:space="preserve">INSERIR CAPTURA DE TELA — FIGURA 2</w:t>
-            </w:r>
-          </w:p>
-          <w:p>
-            <w:pPr>
-              <w:jc w:val="center"/>
-            </w:pPr>
-            <w:r>
-              <w:rPr>
-                <w:rFonts w:ascii="Arial" w:cs="Arial" w:eastAsia="Arial" w:hAnsi="Arial"/>
-                <w:b w:val="false"/>
-                <w:bCs w:val="false"/>
-                <w:i/>
-                <w:iCs/>
-                <w:sz w:val="17"/>
-                <w:szCs w:val="17"/>
-              </w:rPr>
-              <w:t xml:space="preserve">Gerenciador de Dispositivos com "Portas (COM e LPT)" expandido, mostrando o SP390A-R2 e o número da COM.</w:t>
-            </w:r>
-          </w:p>
-        </w:tc>
-      </w:tr>
-    </w:tbl>
+      </w:pPr>
+      <w:r>
+        <w:drawing>
+          <wp:inline distT="0" distB="0" distL="0" distR="0">
+            <wp:extent cx="5448300" cy="4000500"/>
+            <wp:effectExtent t="0" r="0" b="0" l="0"/>
+            <wp:docPr id="1" name="fig2" descr="Gerenciador de Dispositivos — conversor SP390A-R2 como USB Serial Port (COM10)" title="Gerenciador de Dispositivos — conversor SP390A-R2 como USB Serial Port (COM10)"/>
+            <wp:cNvGraphicFramePr>
+              <a:graphicFrameLocks xmlns:a="http://schemas.openxmlformats.org/drawingml/2006/main" noChangeAspect="1"/>
+            </wp:cNvGraphicFramePr>
+            <a:graphic xmlns:a="http://schemas.openxmlformats.org/drawingml/2006/main">
+              <a:graphicData uri="http://schemas.openxmlformats.org/drawingml/2006/picture">
+                <pic:pic xmlns:pic="http://schemas.openxmlformats.org/drawingml/2006/picture">
+                  <pic:nvPicPr>
+                    <pic:cNvPr id="0" name="" descr=""/>
+                    <pic:cNvPicPr>
+                      <a:picLocks noChangeAspect="1" noChangeArrowheads="1"/>
+                    </pic:cNvPicPr>
+                  </pic:nvPicPr>
+                  <pic:blipFill>
+                    <a:blip r:embed="rId9" cstate="none"/>
+                    <a:srcRect/>
+                    <a:stretch>
+                      <a:fillRect/>
+                    </a:stretch>
+                  </pic:blipFill>
+                  <pic:spPr bwMode="auto">
+                    <a:xfrm>
+                      <a:off x="0" y="0"/>
+                      <a:ext cx="5448300" cy="4000500"/>
+                    </a:xfrm>
+                    <a:prstGeom prst="rect">
+                      <a:avLst/>
+                    </a:prstGeom>
+                  </pic:spPr>
+                </pic:pic>
+              </a:graphicData>
+            </a:graphic>
+          </wp:inline>
+        </w:drawing>
+      </w:r>
+    </w:p>
     <w:p>
       <w:pPr>
         <w:keepNext w:val="false"/>
@@ -1923,7 +1901,7 @@
                     </pic:cNvPicPr>
                   </pic:nvPicPr>
                   <pic:blipFill>
-                    <a:blip r:embed="rId9" cstate="none"/>
+                    <a:blip r:embed="rId10" cstate="none"/>
                     <a:srcRect/>
                     <a:stretch>
                       <a:fillRect/>

</xml_diff>

<commit_message>
Docs: teste funcional do PTU-D300E, Figuras 4 a 6 (Docklight)
Capturas reais do menu Tools (Project Settings e Start Communication
Logging, F2) e das abas Communication (Send/Receive, COM10, 9600, None,
8, 1) e Flow Control (Off) do Project Settings, recortadas e com os
campos destacados. Figuras seguintes renumeradas (7 a 10); passo 4.1.3
remete às figuras.

Co-Authored-By: Claude Opus 5.5 <noreply@anthropic.com>
Claude-Session: https://claude.ai/code/session_01VvvtJDPvh4mDoSVpkHza1d
</commit_message>
<xml_diff>
--- a/docs/procedimento-teste-funcional-ptu-d300e.docx
+++ b/docs/procedimento-teste-funcional-ptu-d300e.docx
@@ -1854,7 +1854,7 @@
           <w:sz w:val="21"/>
           <w:szCs w:val="21"/>
         </w:rPr>
-        <w:t xml:space="preserve">Abrir o Docklight com um projeto em branco. Em Tools → Project Settings…: Communication Mode = Send/Receive; porta = a COM anotada; 9600 bps; Parity = None; Data Bits = 8; Stop Bits = 1; Flow Control = Off. Confirmar com OK.</w:t>
+        <w:t xml:space="preserve">Abrir o Docklight com um projeto em branco (Figura 3) e abrir Tools → Project Settings… (Figura 4). Na aba Communication (Figura 5): Communication Mode = Send/Receive; Send/Receive on Comm. Channel = a COM anotada no passo 1; Baud Rate = 9600; Parity = None; Data Bits = 8; Stop Bits = 1; manter Parity Error Char. no valor padrão. Na aba Flow Control (Figura 6): Flow Control Support = Off. Confirmar com OK; a barra de status passa a mostrar a porta e 9600, None, 8, 1.</w:t>
       </w:r>
     </w:p>
     <w:p>
@@ -1958,7 +1958,285 @@
           <w:sz w:val="19"/>
           <w:szCs w:val="19"/>
         </w:rPr>
-        <w:t xml:space="preserve">Figura 4: Docklight — Project Settings, aba Communication</w:t>
+        <w:t xml:space="preserve">Figura 4: Docklight — menu Tools: Project Settings… e Start Communication Logging… (F2)</w:t>
+      </w:r>
+    </w:p>
+    <w:p>
+      <w:pPr>
+        <w:keepNext/>
+        <w:spacing w:line="240" w:lineRule="auto"/>
+        <w:jc w:val="center"/>
+      </w:pPr>
+      <w:r>
+        <w:drawing>
+          <wp:inline distT="0" distB="0" distL="0" distR="0">
+            <wp:extent cx="6000750" cy="3695700"/>
+            <wp:effectExtent t="0" r="0" b="0" l="0"/>
+            <wp:docPr id="1" name="fig4" descr="Docklight — menu Tools: Project Settings… e Start Communication Logging… (F2)" title="Docklight — menu Tools: Project Settings… e Start Communication Logging… (F2)"/>
+            <wp:cNvGraphicFramePr>
+              <a:graphicFrameLocks xmlns:a="http://schemas.openxmlformats.org/drawingml/2006/main" noChangeAspect="1"/>
+            </wp:cNvGraphicFramePr>
+            <a:graphic xmlns:a="http://schemas.openxmlformats.org/drawingml/2006/main">
+              <a:graphicData uri="http://schemas.openxmlformats.org/drawingml/2006/picture">
+                <pic:pic xmlns:pic="http://schemas.openxmlformats.org/drawingml/2006/picture">
+                  <pic:nvPicPr>
+                    <pic:cNvPr id="0" name="" descr=""/>
+                    <pic:cNvPicPr>
+                      <a:picLocks noChangeAspect="1" noChangeArrowheads="1"/>
+                    </pic:cNvPicPr>
+                  </pic:nvPicPr>
+                  <pic:blipFill>
+                    <a:blip r:embed="rId11" cstate="none"/>
+                    <a:srcRect/>
+                    <a:stretch>
+                      <a:fillRect/>
+                    </a:stretch>
+                  </pic:blipFill>
+                  <pic:spPr bwMode="auto">
+                    <a:xfrm>
+                      <a:off x="0" y="0"/>
+                      <a:ext cx="6000750" cy="3695700"/>
+                    </a:xfrm>
+                    <a:prstGeom prst="rect">
+                      <a:avLst/>
+                    </a:prstGeom>
+                  </pic:spPr>
+                </pic:pic>
+              </a:graphicData>
+            </a:graphic>
+          </wp:inline>
+        </w:drawing>
+      </w:r>
+    </w:p>
+    <w:p>
+      <w:pPr>
+        <w:keepNext w:val="false"/>
+        <w:spacing w:after="80" w:before="0"/>
+        <w:jc w:val="both"/>
+      </w:pPr>
+      <w:r>
+        <w:rPr>
+          <w:rFonts w:ascii="Arial" w:cs="Arial" w:eastAsia="Arial" w:hAnsi="Arial"/>
+          <w:b w:val="false"/>
+          <w:bCs w:val="false"/>
+          <w:i w:val="false"/>
+          <w:iCs w:val="false"/>
+          <w:sz w:val="21"/>
+          <w:szCs w:val="21"/>
+        </w:rPr>
+        <w:t xml:space="preserve"/>
+      </w:r>
+    </w:p>
+    <w:p>
+      <w:pPr>
+        <w:keepNext/>
+        <w:spacing w:after="60" w:before="120"/>
+        <w:jc w:val="center"/>
+      </w:pPr>
+      <w:r>
+        <w:rPr>
+          <w:rFonts w:ascii="Arial" w:cs="Arial" w:eastAsia="Arial" w:hAnsi="Arial"/>
+          <w:b/>
+          <w:bCs/>
+          <w:i w:val="false"/>
+          <w:iCs w:val="false"/>
+          <w:sz w:val="19"/>
+          <w:szCs w:val="19"/>
+        </w:rPr>
+        <w:t xml:space="preserve">Figura 5: Docklight — Project Settings, aba Communication: Send/Receive, COM10, 9600, None, 8, 1</w:t>
+      </w:r>
+    </w:p>
+    <w:p>
+      <w:pPr>
+        <w:keepNext/>
+        <w:spacing w:line="240" w:lineRule="auto"/>
+        <w:jc w:val="center"/>
+      </w:pPr>
+      <w:r>
+        <w:drawing>
+          <wp:inline distT="0" distB="0" distL="0" distR="0">
+            <wp:extent cx="3771900" cy="4000500"/>
+            <wp:effectExtent t="0" r="0" b="0" l="0"/>
+            <wp:docPr id="1" name="fig5" descr="Docklight — Project Settings, aba Communication: Send/Receive, COM10, 9600, None, 8, 1" title="Docklight — Project Settings, aba Communication: Send/Receive, COM10, 9600, None, 8, 1"/>
+            <wp:cNvGraphicFramePr>
+              <a:graphicFrameLocks xmlns:a="http://schemas.openxmlformats.org/drawingml/2006/main" noChangeAspect="1"/>
+            </wp:cNvGraphicFramePr>
+            <a:graphic xmlns:a="http://schemas.openxmlformats.org/drawingml/2006/main">
+              <a:graphicData uri="http://schemas.openxmlformats.org/drawingml/2006/picture">
+                <pic:pic xmlns:pic="http://schemas.openxmlformats.org/drawingml/2006/picture">
+                  <pic:nvPicPr>
+                    <pic:cNvPr id="0" name="" descr=""/>
+                    <pic:cNvPicPr>
+                      <a:picLocks noChangeAspect="1" noChangeArrowheads="1"/>
+                    </pic:cNvPicPr>
+                  </pic:nvPicPr>
+                  <pic:blipFill>
+                    <a:blip r:embed="rId12" cstate="none"/>
+                    <a:srcRect/>
+                    <a:stretch>
+                      <a:fillRect/>
+                    </a:stretch>
+                  </pic:blipFill>
+                  <pic:spPr bwMode="auto">
+                    <a:xfrm>
+                      <a:off x="0" y="0"/>
+                      <a:ext cx="3771900" cy="4000500"/>
+                    </a:xfrm>
+                    <a:prstGeom prst="rect">
+                      <a:avLst/>
+                    </a:prstGeom>
+                  </pic:spPr>
+                </pic:pic>
+              </a:graphicData>
+            </a:graphic>
+          </wp:inline>
+        </w:drawing>
+      </w:r>
+    </w:p>
+    <w:p>
+      <w:pPr>
+        <w:keepNext w:val="false"/>
+        <w:spacing w:after="80" w:before="0"/>
+        <w:jc w:val="both"/>
+      </w:pPr>
+      <w:r>
+        <w:rPr>
+          <w:rFonts w:ascii="Arial" w:cs="Arial" w:eastAsia="Arial" w:hAnsi="Arial"/>
+          <w:b w:val="false"/>
+          <w:bCs w:val="false"/>
+          <w:i w:val="false"/>
+          <w:iCs w:val="false"/>
+          <w:sz w:val="21"/>
+          <w:szCs w:val="21"/>
+        </w:rPr>
+        <w:t xml:space="preserve"/>
+      </w:r>
+    </w:p>
+    <w:p>
+      <w:pPr>
+        <w:keepNext/>
+        <w:spacing w:after="60" w:before="120"/>
+        <w:jc w:val="center"/>
+      </w:pPr>
+      <w:r>
+        <w:rPr>
+          <w:rFonts w:ascii="Arial" w:cs="Arial" w:eastAsia="Arial" w:hAnsi="Arial"/>
+          <w:b/>
+          <w:bCs/>
+          <w:i w:val="false"/>
+          <w:iCs w:val="false"/>
+          <w:sz w:val="19"/>
+          <w:szCs w:val="19"/>
+        </w:rPr>
+        <w:t xml:space="preserve">Figura 6: Docklight — Project Settings, aba Flow Control: Off</w:t>
+      </w:r>
+    </w:p>
+    <w:p>
+      <w:pPr>
+        <w:keepNext/>
+        <w:spacing w:line="240" w:lineRule="auto"/>
+        <w:jc w:val="center"/>
+      </w:pPr>
+      <w:r>
+        <w:drawing>
+          <wp:inline distT="0" distB="0" distL="0" distR="0">
+            <wp:extent cx="3771900" cy="4000500"/>
+            <wp:effectExtent t="0" r="0" b="0" l="0"/>
+            <wp:docPr id="1" name="fig6" descr="Docklight — Project Settings, aba Flow Control: Off" title="Docklight — Project Settings, aba Flow Control: Off"/>
+            <wp:cNvGraphicFramePr>
+              <a:graphicFrameLocks xmlns:a="http://schemas.openxmlformats.org/drawingml/2006/main" noChangeAspect="1"/>
+            </wp:cNvGraphicFramePr>
+            <a:graphic xmlns:a="http://schemas.openxmlformats.org/drawingml/2006/main">
+              <a:graphicData uri="http://schemas.openxmlformats.org/drawingml/2006/picture">
+                <pic:pic xmlns:pic="http://schemas.openxmlformats.org/drawingml/2006/picture">
+                  <pic:nvPicPr>
+                    <pic:cNvPr id="0" name="" descr=""/>
+                    <pic:cNvPicPr>
+                      <a:picLocks noChangeAspect="1" noChangeArrowheads="1"/>
+                    </pic:cNvPicPr>
+                  </pic:nvPicPr>
+                  <pic:blipFill>
+                    <a:blip r:embed="rId13" cstate="none"/>
+                    <a:srcRect/>
+                    <a:stretch>
+                      <a:fillRect/>
+                    </a:stretch>
+                  </pic:blipFill>
+                  <pic:spPr bwMode="auto">
+                    <a:xfrm>
+                      <a:off x="0" y="0"/>
+                      <a:ext cx="3771900" cy="4000500"/>
+                    </a:xfrm>
+                    <a:prstGeom prst="rect">
+                      <a:avLst/>
+                    </a:prstGeom>
+                  </pic:spPr>
+                </pic:pic>
+              </a:graphicData>
+            </a:graphic>
+          </wp:inline>
+        </w:drawing>
+      </w:r>
+    </w:p>
+    <w:p>
+      <w:pPr>
+        <w:keepNext w:val="false"/>
+        <w:spacing w:after="80" w:before="0"/>
+        <w:jc w:val="both"/>
+      </w:pPr>
+      <w:r>
+        <w:rPr>
+          <w:rFonts w:ascii="Arial" w:cs="Arial" w:eastAsia="Arial" w:hAnsi="Arial"/>
+          <w:b w:val="false"/>
+          <w:bCs w:val="false"/>
+          <w:i w:val="false"/>
+          <w:iCs w:val="false"/>
+          <w:sz w:val="21"/>
+          <w:szCs w:val="21"/>
+        </w:rPr>
+        <w:t xml:space="preserve"/>
+      </w:r>
+    </w:p>
+    <w:p>
+      <w:pPr>
+        <w:pStyle w:val="ListParagraph"/>
+        <w:numPr>
+          <w:ilvl w:val="0"/>
+          <w:numId w:val="3"/>
+        </w:numPr>
+        <w:spacing w:after="80"/>
+        <w:jc w:val="both"/>
+      </w:pPr>
+      <w:r>
+        <w:rPr>
+          <w:rFonts w:ascii="Arial" w:cs="Arial" w:eastAsia="Arial" w:hAnsi="Arial"/>
+          <w:b w:val="false"/>
+          <w:bCs w:val="false"/>
+          <w:i w:val="false"/>
+          <w:iCs w:val="false"/>
+          <w:sz w:val="21"/>
+          <w:szCs w:val="21"/>
+        </w:rPr>
+        <w:t xml:space="preserve">No painel Send Sequences, dar duplo clique numa linha vazia e cadastrar cada comando da Tabela 3: digitar o nome, selecionar Edit Mode = HEX e digitar os bytes (o 0D final é o Enter/CR, obrigatório).</w:t>
+      </w:r>
+    </w:p>
+    <w:p>
+      <w:pPr>
+        <w:keepNext/>
+        <w:spacing w:after="60" w:before="120"/>
+        <w:jc w:val="center"/>
+      </w:pPr>
+      <w:r>
+        <w:rPr>
+          <w:rFonts w:ascii="Arial" w:cs="Arial" w:eastAsia="Arial" w:hAnsi="Arial"/>
+          <w:b/>
+          <w:bCs/>
+          <w:i w:val="false"/>
+          <w:iCs w:val="false"/>
+          <w:sz w:val="19"/>
+          <w:szCs w:val="19"/>
+        </w:rPr>
+        <w:t xml:space="preserve">Figura 7: Docklight — Edit Send Sequence em modo HEX</w:t>
       </w:r>
     </w:p>
     <w:tbl>
@@ -2007,7 +2285,7 @@
                 <w:sz w:val="18"/>
                 <w:szCs w:val="18"/>
               </w:rPr>
-              <w:t xml:space="preserve">INSERIR CAPTURA DE TELA — FIGURA 4</w:t>
+              <w:t xml:space="preserve">INSERIR CAPTURA DE TELA — FIGURA 7</w:t>
             </w:r>
           </w:p>
           <w:p>
@@ -2024,7 +2302,7 @@
                 <w:sz w:val="17"/>
                 <w:szCs w:val="17"/>
               </w:rPr>
-              <w:t xml:space="preserve">Aba Communication preenchida: Send/Receive, COM do conversor, 9600, None, 8, 1.</w:t>
+              <w:t xml:space="preserve">Diálogo Edit Send Sequence com Name = Versao, Edit Mode = HEX e os bytes digitados (ex.: 56 0D).</w:t>
             </w:r>
           </w:p>
         </w:tc>
@@ -2065,7 +2343,7 @@
           <w:sz w:val="19"/>
           <w:szCs w:val="19"/>
         </w:rPr>
-        <w:t xml:space="preserve">Figura 5: Docklight — Project Settings, aba Flow Control</w:t>
+        <w:t xml:space="preserve">Figura 8: Docklight — painel Send Sequences com os comandos cadastrados</w:t>
       </w:r>
     </w:p>
     <w:tbl>
@@ -2114,7 +2392,7 @@
                 <w:sz w:val="18"/>
                 <w:szCs w:val="18"/>
               </w:rPr>
-              <w:t xml:space="preserve">INSERIR CAPTURA DE TELA — FIGURA 5</w:t>
+              <w:t xml:space="preserve">INSERIR CAPTURA DE TELA — FIGURA 8</w:t>
             </w:r>
           </w:p>
           <w:p>
@@ -2131,7 +2409,7 @@
                 <w:sz w:val="17"/>
                 <w:szCs w:val="17"/>
               </w:rPr>
-              <w:t xml:space="preserve">Aba Flow Control com Flow Control Support = Off.</w:t>
+              <w:t xml:space="preserve">Painel Send Sequences com as 11 sequências da Tabela 3.</w:t>
             </w:r>
           </w:p>
         </w:tc>
@@ -2176,7 +2454,7 @@
           <w:sz w:val="21"/>
           <w:szCs w:val="21"/>
         </w:rPr>
-        <w:t xml:space="preserve">No painel Send Sequences, dar duplo clique numa linha vazia e cadastrar cada comando da Tabela 3: digitar o nome, selecionar Edit Mode = HEX e digitar os bytes (o 0D final é o Enter/CR, obrigatório).</w:t>
+        <w:t xml:space="preserve">Em Tools → Start Communication Logging… (tecla F2, Figura 4), criar um arquivo de registro identificando a unidade (ex.: TESTE_PTU-D300E_&lt;nº de série&gt;_&lt;data&gt;).</w:t>
       </w:r>
     </w:p>
     <w:p>
@@ -2195,7 +2473,7 @@
           <w:sz w:val="19"/>
           <w:szCs w:val="19"/>
         </w:rPr>
-        <w:t xml:space="preserve">Figura 6: Docklight — Edit Send Sequence em modo HEX</w:t>
+        <w:t xml:space="preserve">Figura 9: Docklight — início do registro (log) da comunicação</w:t>
       </w:r>
     </w:p>
     <w:tbl>
@@ -2244,7 +2522,7 @@
                 <w:sz w:val="18"/>
                 <w:szCs w:val="18"/>
               </w:rPr>
-              <w:t xml:space="preserve">INSERIR CAPTURA DE TELA — FIGURA 6</w:t>
+              <w:t xml:space="preserve">INSERIR CAPTURA DE TELA — FIGURA 9</w:t>
             </w:r>
           </w:p>
           <w:p>
@@ -2261,7 +2539,7 @@
                 <w:sz w:val="17"/>
                 <w:szCs w:val="17"/>
               </w:rPr>
-              <w:t xml:space="preserve">Diálogo Edit Send Sequence com Name = Versao, Edit Mode = HEX e os bytes digitados (ex.: 56 0D).</w:t>
+              <w:t xml:space="preserve">Diálogo Start Communication Logging com a pasta e o nome do arquivo.</w:t>
             </w:r>
           </w:p>
         </w:tc>
@@ -2288,6 +2566,29 @@
     </w:p>
     <w:p>
       <w:pPr>
+        <w:pStyle w:val="ListParagraph"/>
+        <w:numPr>
+          <w:ilvl w:val="0"/>
+          <w:numId w:val="3"/>
+        </w:numPr>
+        <w:spacing w:after="80"/>
+        <w:jc w:val="both"/>
+      </w:pPr>
+      <w:r>
+        <w:rPr>
+          <w:rFonts w:ascii="Arial" w:cs="Arial" w:eastAsia="Arial" w:hAnsi="Arial"/>
+          <w:b w:val="false"/>
+          <w:bCs w:val="false"/>
+          <w:i w:val="false"/>
+          <w:iCs w:val="false"/>
+          <w:sz w:val="21"/>
+          <w:szCs w:val="21"/>
+        </w:rPr>
+        <w:t xml:space="preserve">Clicar em Start Communication (ícone de "play"). Para enviar um comando, clicar na seta à esquerda do seu nome; enviar um de cada vez e conferir a resposta na aba ASCII antes do próximo. Respostas iniciadas por "*" indicam comando aceito; por "!", erro.</w:t>
+      </w:r>
+    </w:p>
+    <w:p>
+      <w:pPr>
         <w:keepNext/>
         <w:spacing w:after="60" w:before="120"/>
         <w:jc w:val="center"/>
@@ -2302,7 +2603,7 @@
           <w:sz w:val="19"/>
           <w:szCs w:val="19"/>
         </w:rPr>
-        <w:t xml:space="preserve">Figura 7: Docklight — painel Send Sequences com os comandos cadastrados</w:t>
+        <w:t xml:space="preserve">Figura 10: Docklight — comunicação iniciada e resposta ao comando V</w:t>
       </w:r>
     </w:p>
     <w:tbl>
@@ -2351,267 +2652,7 @@
                 <w:sz w:val="18"/>
                 <w:szCs w:val="18"/>
               </w:rPr>
-              <w:t xml:space="preserve">INSERIR CAPTURA DE TELA — FIGURA 7</w:t>
-            </w:r>
-          </w:p>
-          <w:p>
-            <w:pPr>
-              <w:jc w:val="center"/>
-            </w:pPr>
-            <w:r>
-              <w:rPr>
-                <w:rFonts w:ascii="Arial" w:cs="Arial" w:eastAsia="Arial" w:hAnsi="Arial"/>
-                <w:b w:val="false"/>
-                <w:bCs w:val="false"/>
-                <w:i/>
-                <w:iCs/>
-                <w:sz w:val="17"/>
-                <w:szCs w:val="17"/>
-              </w:rPr>
-              <w:t xml:space="preserve">Painel Send Sequences com as 11 sequências da Tabela 3.</w:t>
-            </w:r>
-          </w:p>
-        </w:tc>
-      </w:tr>
-    </w:tbl>
-    <w:p>
-      <w:pPr>
-        <w:keepNext w:val="false"/>
-        <w:spacing w:after="80" w:before="0"/>
-        <w:jc w:val="both"/>
-      </w:pPr>
-      <w:r>
-        <w:rPr>
-          <w:rFonts w:ascii="Arial" w:cs="Arial" w:eastAsia="Arial" w:hAnsi="Arial"/>
-          <w:b w:val="false"/>
-          <w:bCs w:val="false"/>
-          <w:i w:val="false"/>
-          <w:iCs w:val="false"/>
-          <w:sz w:val="21"/>
-          <w:szCs w:val="21"/>
-        </w:rPr>
-        <w:t xml:space="preserve"/>
-      </w:r>
-    </w:p>
-    <w:p>
-      <w:pPr>
-        <w:pStyle w:val="ListParagraph"/>
-        <w:numPr>
-          <w:ilvl w:val="0"/>
-          <w:numId w:val="3"/>
-        </w:numPr>
-        <w:spacing w:after="80"/>
-        <w:jc w:val="both"/>
-      </w:pPr>
-      <w:r>
-        <w:rPr>
-          <w:rFonts w:ascii="Arial" w:cs="Arial" w:eastAsia="Arial" w:hAnsi="Arial"/>
-          <w:b w:val="false"/>
-          <w:bCs w:val="false"/>
-          <w:i w:val="false"/>
-          <w:iCs w:val="false"/>
-          <w:sz w:val="21"/>
-          <w:szCs w:val="21"/>
-        </w:rPr>
-        <w:t xml:space="preserve">Em Tools → Start Communication Logging…, criar um arquivo de registro identificando a unidade (ex.: TESTE_PTU-D300E_&lt;nº de série&gt;_&lt;data&gt;).</w:t>
-      </w:r>
-    </w:p>
-    <w:p>
-      <w:pPr>
-        <w:keepNext/>
-        <w:spacing w:after="60" w:before="120"/>
-        <w:jc w:val="center"/>
-      </w:pPr>
-      <w:r>
-        <w:rPr>
-          <w:rFonts w:ascii="Arial" w:cs="Arial" w:eastAsia="Arial" w:hAnsi="Arial"/>
-          <w:b/>
-          <w:bCs/>
-          <w:i w:val="false"/>
-          <w:iCs w:val="false"/>
-          <w:sz w:val="19"/>
-          <w:szCs w:val="19"/>
-        </w:rPr>
-        <w:t xml:space="preserve">Figura 8: Docklight — início do registro (log) da comunicação</w:t>
-      </w:r>
-    </w:p>
-    <w:tbl>
-      <w:tblPr>
-        <w:tblW w:type="dxa" w:w="7000"/>
-        <w:jc w:val="center"/>
-        <w:tblBorders>
-          <w:top w:val="single" w:color="auto" w:sz="4"/>
-          <w:left w:val="single" w:color="auto" w:sz="4"/>
-          <w:bottom w:val="single" w:color="auto" w:sz="4"/>
-          <w:right w:val="single" w:color="auto" w:sz="4"/>
-          <w:insideH w:val="single" w:color="auto" w:sz="4"/>
-          <w:insideV w:val="single" w:color="auto" w:sz="4"/>
-        </w:tblBorders>
-      </w:tblPr>
-      <w:tblGrid>
-        <w:gridCol w:w="7000"/>
-      </w:tblGrid>
-      <w:tr>
-        <w:trPr>
-          <w:cantSplit/>
-          <w:trHeight w:val="2600" w:hRule="atLeast"/>
-        </w:trPr>
-        <w:tc>
-          <w:tcPr>
-            <w:tcW w:type="dxa" w:w="7000"/>
-            <w:tcBorders>
-              <w:top w:val="dashed" w:color="808080" w:sz="6"/>
-              <w:left w:val="dashed" w:color="808080" w:sz="6"/>
-              <w:bottom w:val="dashed" w:color="808080" w:sz="6"/>
-              <w:right w:val="dashed" w:color="808080" w:sz="6"/>
-            </w:tcBorders>
-            <w:vAlign w:val="center"/>
-          </w:tcPr>
-          <w:p>
-            <w:pPr>
-              <w:jc w:val="center"/>
-            </w:pPr>
-            <w:r>
-              <w:rPr>
-                <w:rFonts w:ascii="Arial" w:cs="Arial" w:eastAsia="Arial" w:hAnsi="Arial"/>
-                <w:b/>
-                <w:bCs/>
-                <w:i w:val="false"/>
-                <w:iCs w:val="false"/>
-                <w:sz w:val="18"/>
-                <w:szCs w:val="18"/>
-              </w:rPr>
-              <w:t xml:space="preserve">INSERIR CAPTURA DE TELA — FIGURA 8</w:t>
-            </w:r>
-          </w:p>
-          <w:p>
-            <w:pPr>
-              <w:jc w:val="center"/>
-            </w:pPr>
-            <w:r>
-              <w:rPr>
-                <w:rFonts w:ascii="Arial" w:cs="Arial" w:eastAsia="Arial" w:hAnsi="Arial"/>
-                <w:b w:val="false"/>
-                <w:bCs w:val="false"/>
-                <w:i/>
-                <w:iCs/>
-                <w:sz w:val="17"/>
-                <w:szCs w:val="17"/>
-              </w:rPr>
-              <w:t xml:space="preserve">Diálogo Start Communication Logging com a pasta e o nome do arquivo.</w:t>
-            </w:r>
-          </w:p>
-        </w:tc>
-      </w:tr>
-    </w:tbl>
-    <w:p>
-      <w:pPr>
-        <w:keepNext w:val="false"/>
-        <w:spacing w:after="80" w:before="0"/>
-        <w:jc w:val="both"/>
-      </w:pPr>
-      <w:r>
-        <w:rPr>
-          <w:rFonts w:ascii="Arial" w:cs="Arial" w:eastAsia="Arial" w:hAnsi="Arial"/>
-          <w:b w:val="false"/>
-          <w:bCs w:val="false"/>
-          <w:i w:val="false"/>
-          <w:iCs w:val="false"/>
-          <w:sz w:val="21"/>
-          <w:szCs w:val="21"/>
-        </w:rPr>
-        <w:t xml:space="preserve"/>
-      </w:r>
-    </w:p>
-    <w:p>
-      <w:pPr>
-        <w:pStyle w:val="ListParagraph"/>
-        <w:numPr>
-          <w:ilvl w:val="0"/>
-          <w:numId w:val="3"/>
-        </w:numPr>
-        <w:spacing w:after="80"/>
-        <w:jc w:val="both"/>
-      </w:pPr>
-      <w:r>
-        <w:rPr>
-          <w:rFonts w:ascii="Arial" w:cs="Arial" w:eastAsia="Arial" w:hAnsi="Arial"/>
-          <w:b w:val="false"/>
-          <w:bCs w:val="false"/>
-          <w:i w:val="false"/>
-          <w:iCs w:val="false"/>
-          <w:sz w:val="21"/>
-          <w:szCs w:val="21"/>
-        </w:rPr>
-        <w:t xml:space="preserve">Clicar em Start Communication (ícone de "play"). Para enviar um comando, clicar na seta à esquerda do seu nome; enviar um de cada vez e conferir a resposta na aba ASCII antes do próximo. Respostas iniciadas por "*" indicam comando aceito; por "!", erro.</w:t>
-      </w:r>
-    </w:p>
-    <w:p>
-      <w:pPr>
-        <w:keepNext/>
-        <w:spacing w:after="60" w:before="120"/>
-        <w:jc w:val="center"/>
-      </w:pPr>
-      <w:r>
-        <w:rPr>
-          <w:rFonts w:ascii="Arial" w:cs="Arial" w:eastAsia="Arial" w:hAnsi="Arial"/>
-          <w:b/>
-          <w:bCs/>
-          <w:i w:val="false"/>
-          <w:iCs w:val="false"/>
-          <w:sz w:val="19"/>
-          <w:szCs w:val="19"/>
-        </w:rPr>
-        <w:t xml:space="preserve">Figura 9: Docklight — comunicação iniciada e resposta ao comando V</w:t>
-      </w:r>
-    </w:p>
-    <w:tbl>
-      <w:tblPr>
-        <w:tblW w:type="dxa" w:w="7000"/>
-        <w:jc w:val="center"/>
-        <w:tblBorders>
-          <w:top w:val="single" w:color="auto" w:sz="4"/>
-          <w:left w:val="single" w:color="auto" w:sz="4"/>
-          <w:bottom w:val="single" w:color="auto" w:sz="4"/>
-          <w:right w:val="single" w:color="auto" w:sz="4"/>
-          <w:insideH w:val="single" w:color="auto" w:sz="4"/>
-          <w:insideV w:val="single" w:color="auto" w:sz="4"/>
-        </w:tblBorders>
-      </w:tblPr>
-      <w:tblGrid>
-        <w:gridCol w:w="7000"/>
-      </w:tblGrid>
-      <w:tr>
-        <w:trPr>
-          <w:cantSplit/>
-          <w:trHeight w:val="2600" w:hRule="atLeast"/>
-        </w:trPr>
-        <w:tc>
-          <w:tcPr>
-            <w:tcW w:type="dxa" w:w="7000"/>
-            <w:tcBorders>
-              <w:top w:val="dashed" w:color="808080" w:sz="6"/>
-              <w:left w:val="dashed" w:color="808080" w:sz="6"/>
-              <w:bottom w:val="dashed" w:color="808080" w:sz="6"/>
-              <w:right w:val="dashed" w:color="808080" w:sz="6"/>
-            </w:tcBorders>
-            <w:vAlign w:val="center"/>
-          </w:tcPr>
-          <w:p>
-            <w:pPr>
-              <w:jc w:val="center"/>
-            </w:pPr>
-            <w:r>
-              <w:rPr>
-                <w:rFonts w:ascii="Arial" w:cs="Arial" w:eastAsia="Arial" w:hAnsi="Arial"/>
-                <w:b/>
-                <w:bCs/>
-                <w:i w:val="false"/>
-                <w:iCs w:val="false"/>
-                <w:sz w:val="18"/>
-                <w:szCs w:val="18"/>
-              </w:rPr>
-              <w:t xml:space="preserve">INSERIR CAPTURA DE TELA — FIGURA 9</w:t>
+              <w:t xml:space="preserve">INSERIR CAPTURA DE TELA — FIGURA 10</w:t>
             </w:r>
           </w:p>
           <w:p>
@@ -6579,7 +6620,7 @@
           <w:sz w:val="21"/>
           <w:szCs w:val="21"/>
         </w:rPr>
-        <w:t xml:space="preserve">Ao final, clicar em Stop Communication e em Tools → Stop Communication Logging, desenergizar o PTU e guardar o arquivo de registro junto com este formulário.</w:t>
+        <w:t xml:space="preserve">Ao final, clicar em Stop Communication e em Tools → Stop Communication Logging (F3), desenergizar o PTU e guardar o arquivo de registro junto com este formulário.</w:t>
       </w:r>
     </w:p>
     <w:p>

</xml_diff>

<commit_message>
Docs: teste funcional do PTU-D300E, Figura 7 (menu Edit do Docklight)
Captura real do menu Edit com Edit Send Sequence List…, citada no passo
4.1.4 como alternativa ao duplo clique. Figuras seguintes renumeradas
(8 a 11).

Co-Authored-By: Claude Opus 5.5 <noreply@anthropic.com>
Claude-Session: https://claude.ai/code/session_01VvvtJDPvh4mDoSVpkHza1d
</commit_message>
<xml_diff>
--- a/docs/procedimento-teste-funcional-ptu-d300e.docx
+++ b/docs/procedimento-teste-funcional-ptu-d300e.docx
@@ -2217,7 +2217,7 @@
           <w:sz w:val="21"/>
           <w:szCs w:val="21"/>
         </w:rPr>
-        <w:t xml:space="preserve">No painel Send Sequences, dar duplo clique numa linha vazia e cadastrar cada comando da Tabela 3: digitar o nome, selecionar Edit Mode = HEX e digitar os bytes (o 0D final é o Enter/CR, obrigatório).</w:t>
+        <w:t xml:space="preserve">No painel Send Sequences, dar duplo clique numa linha vazia (ou usar Edit → Edit Send Sequence List…, Figura 7) e cadastrar cada comando da Tabela 3: digitar o nome, selecionar Edit Mode = HEX e digitar os bytes (o 0D final é o Enter/CR, obrigatório).</w:t>
       </w:r>
     </w:p>
     <w:p>
@@ -2236,7 +2236,92 @@
           <w:sz w:val="19"/>
           <w:szCs w:val="19"/>
         </w:rPr>
-        <w:t xml:space="preserve">Figura 7: Docklight — Edit Send Sequence em modo HEX</w:t>
+        <w:t xml:space="preserve">Figura 7: Docklight — menu Edit: Edit Send Sequence List…</w:t>
+      </w:r>
+    </w:p>
+    <w:p>
+      <w:pPr>
+        <w:keepNext/>
+        <w:spacing w:line="240" w:lineRule="auto"/>
+        <w:jc w:val="center"/>
+      </w:pPr>
+      <w:r>
+        <w:drawing>
+          <wp:inline distT="0" distB="0" distL="0" distR="0">
+            <wp:extent cx="6000750" cy="1819275"/>
+            <wp:effectExtent t="0" r="0" b="0" l="0"/>
+            <wp:docPr id="1" name="fig7" descr="Docklight — menu Edit: Edit Send Sequence List…" title="Docklight — menu Edit: Edit Send Sequence List…"/>
+            <wp:cNvGraphicFramePr>
+              <a:graphicFrameLocks xmlns:a="http://schemas.openxmlformats.org/drawingml/2006/main" noChangeAspect="1"/>
+            </wp:cNvGraphicFramePr>
+            <a:graphic xmlns:a="http://schemas.openxmlformats.org/drawingml/2006/main">
+              <a:graphicData uri="http://schemas.openxmlformats.org/drawingml/2006/picture">
+                <pic:pic xmlns:pic="http://schemas.openxmlformats.org/drawingml/2006/picture">
+                  <pic:nvPicPr>
+                    <pic:cNvPr id="0" name="" descr=""/>
+                    <pic:cNvPicPr>
+                      <a:picLocks noChangeAspect="1" noChangeArrowheads="1"/>
+                    </pic:cNvPicPr>
+                  </pic:nvPicPr>
+                  <pic:blipFill>
+                    <a:blip r:embed="rId14" cstate="none"/>
+                    <a:srcRect/>
+                    <a:stretch>
+                      <a:fillRect/>
+                    </a:stretch>
+                  </pic:blipFill>
+                  <pic:spPr bwMode="auto">
+                    <a:xfrm>
+                      <a:off x="0" y="0"/>
+                      <a:ext cx="6000750" cy="1819275"/>
+                    </a:xfrm>
+                    <a:prstGeom prst="rect">
+                      <a:avLst/>
+                    </a:prstGeom>
+                  </pic:spPr>
+                </pic:pic>
+              </a:graphicData>
+            </a:graphic>
+          </wp:inline>
+        </w:drawing>
+      </w:r>
+    </w:p>
+    <w:p>
+      <w:pPr>
+        <w:keepNext w:val="false"/>
+        <w:spacing w:after="80" w:before="0"/>
+        <w:jc w:val="both"/>
+      </w:pPr>
+      <w:r>
+        <w:rPr>
+          <w:rFonts w:ascii="Arial" w:cs="Arial" w:eastAsia="Arial" w:hAnsi="Arial"/>
+          <w:b w:val="false"/>
+          <w:bCs w:val="false"/>
+          <w:i w:val="false"/>
+          <w:iCs w:val="false"/>
+          <w:sz w:val="21"/>
+          <w:szCs w:val="21"/>
+        </w:rPr>
+        <w:t xml:space="preserve"/>
+      </w:r>
+    </w:p>
+    <w:p>
+      <w:pPr>
+        <w:keepNext/>
+        <w:spacing w:after="60" w:before="120"/>
+        <w:jc w:val="center"/>
+      </w:pPr>
+      <w:r>
+        <w:rPr>
+          <w:rFonts w:ascii="Arial" w:cs="Arial" w:eastAsia="Arial" w:hAnsi="Arial"/>
+          <w:b/>
+          <w:bCs/>
+          <w:i w:val="false"/>
+          <w:iCs w:val="false"/>
+          <w:sz w:val="19"/>
+          <w:szCs w:val="19"/>
+        </w:rPr>
+        <w:t xml:space="preserve">Figura 8: Docklight — Edit Send Sequence em modo HEX</w:t>
       </w:r>
     </w:p>
     <w:tbl>
@@ -2285,7 +2370,7 @@
                 <w:sz w:val="18"/>
                 <w:szCs w:val="18"/>
               </w:rPr>
-              <w:t xml:space="preserve">INSERIR CAPTURA DE TELA — FIGURA 7</w:t>
+              <w:t xml:space="preserve">INSERIR CAPTURA DE TELA — FIGURA 8</w:t>
             </w:r>
           </w:p>
           <w:p>
@@ -2343,7 +2428,7 @@
           <w:sz w:val="19"/>
           <w:szCs w:val="19"/>
         </w:rPr>
-        <w:t xml:space="preserve">Figura 8: Docklight — painel Send Sequences com os comandos cadastrados</w:t>
+        <w:t xml:space="preserve">Figura 9: Docklight — painel Send Sequences com os comandos cadastrados</w:t>
       </w:r>
     </w:p>
     <w:tbl>
@@ -2392,7 +2477,7 @@
                 <w:sz w:val="18"/>
                 <w:szCs w:val="18"/>
               </w:rPr>
-              <w:t xml:space="preserve">INSERIR CAPTURA DE TELA — FIGURA 8</w:t>
+              <w:t xml:space="preserve">INSERIR CAPTURA DE TELA — FIGURA 9</w:t>
             </w:r>
           </w:p>
           <w:p>
@@ -2473,7 +2558,7 @@
           <w:sz w:val="19"/>
           <w:szCs w:val="19"/>
         </w:rPr>
-        <w:t xml:space="preserve">Figura 9: Docklight — início do registro (log) da comunicação</w:t>
+        <w:t xml:space="preserve">Figura 10: Docklight — início do registro (log) da comunicação</w:t>
       </w:r>
     </w:p>
     <w:tbl>
@@ -2522,7 +2607,7 @@
                 <w:sz w:val="18"/>
                 <w:szCs w:val="18"/>
               </w:rPr>
-              <w:t xml:space="preserve">INSERIR CAPTURA DE TELA — FIGURA 9</w:t>
+              <w:t xml:space="preserve">INSERIR CAPTURA DE TELA — FIGURA 10</w:t>
             </w:r>
           </w:p>
           <w:p>
@@ -2603,7 +2688,7 @@
           <w:sz w:val="19"/>
           <w:szCs w:val="19"/>
         </w:rPr>
-        <w:t xml:space="preserve">Figura 10: Docklight — comunicação iniciada e resposta ao comando V</w:t>
+        <w:t xml:space="preserve">Figura 11: Docklight — comunicação iniciada e resposta ao comando V</w:t>
       </w:r>
     </w:p>
     <w:tbl>
@@ -2652,7 +2737,7 @@
                 <w:sz w:val="18"/>
                 <w:szCs w:val="18"/>
               </w:rPr>
-              <w:t xml:space="preserve">INSERIR CAPTURA DE TELA — FIGURA 10</w:t>
+              <w:t xml:space="preserve">INSERIR CAPTURA DE TELA — FIGURA 11</w:t>
             </w:r>
           </w:p>
           <w:p>

</xml_diff>

<commit_message>
Docs: teste funcional do PTU-D300E com comandos em ASCII
As sequências do Docklight passam a ser cadastradas em modo ASCII, com
os comandos escritos como no manual da FLIR (V, RPS, RTS, R, PP, TP,
PP1000…) e o nome igual ao comando; o CR final é inserido trocando
brevemente o Edit Mode para HEX. Tabelas 3 e 4 sem códigos HEX.

Co-Authored-By: Claude Opus 5.5 <noreply@anthropic.com>
Claude-Session: https://claude.ai/code/session_01VvvtJDPvh4mDoSVpkHza1d
</commit_message>
<xml_diff>
--- a/docs/procedimento-teste-funcional-ptu-d300e.docx
+++ b/docs/procedimento-teste-funcional-ptu-d300e.docx
@@ -2217,7 +2217,7 @@
           <w:sz w:val="21"/>
           <w:szCs w:val="21"/>
         </w:rPr>
-        <w:t xml:space="preserve">No painel Send Sequences, dar duplo clique numa linha vazia (ou usar Edit → Edit Send Sequence List…, Figura 7) e cadastrar cada comando da Tabela 3: digitar o nome, selecionar Edit Mode = HEX e digitar os bytes (o 0D final é o Enter/CR, obrigatório).</w:t>
+        <w:t xml:space="preserve">No painel Send Sequences, dar duplo clique numa linha vazia (ou usar Edit → Edit Send Sequence List…, Figura 7) e cadastrar cada comando da Tabela 3. Em Name, digitar o próprio comando; em Edit Mode, manter ASCII e, em Sequence, digitar o comando exatamente como no manual da FLIR (ex.: RPS500). Todo comando precisa terminar com Enter (CR, código 0D), sem o qual o PTU não o executa: com o cursor no fim do texto, mudar Edit Mode para HEX, digitar 0D e voltar para ASCII — o CR passa a aparecer no fim do comando. Confirmar com OK.</w:t>
       </w:r>
     </w:p>
     <w:p>
@@ -2321,7 +2321,7 @@
           <w:sz w:val="19"/>
           <w:szCs w:val="19"/>
         </w:rPr>
-        <w:t xml:space="preserve">Figura 8: Docklight — Edit Send Sequence em modo HEX</w:t>
+        <w:t xml:space="preserve">Figura 8: Docklight — Edit Send Sequence em modo ASCII</w:t>
       </w:r>
     </w:p>
     <w:tbl>
@@ -2387,7 +2387,7 @@
                 <w:sz w:val="17"/>
                 <w:szCs w:val="17"/>
               </w:rPr>
-              <w:t xml:space="preserve">Diálogo Edit Send Sequence com Name = Versao, Edit Mode = HEX e os bytes digitados (ex.: 56 0D).</w:t>
+              <w:t xml:space="preserve">Diálogo Edit Send Sequence com Name = RPS500, Edit Mode = ASCII e a sequência RPS500 seguida do CR.</w:t>
             </w:r>
           </w:p>
         </w:tc>
@@ -2494,7 +2494,7 @@
                 <w:sz w:val="17"/>
                 <w:szCs w:val="17"/>
               </w:rPr>
-              <w:t xml:space="preserve">Painel Send Sequences com as 11 sequências da Tabela 3.</w:t>
+              <w:t xml:space="preserve">Painel Send Sequences com os comandos da Tabela 3.</w:t>
             </w:r>
           </w:p>
         </w:tc>
@@ -2669,7 +2669,7 @@
           <w:sz w:val="21"/>
           <w:szCs w:val="21"/>
         </w:rPr>
-        <w:t xml:space="preserve">Clicar em Start Communication (ícone de "play"). Para enviar um comando, clicar na seta à esquerda do seu nome; enviar um de cada vez e conferir a resposta na aba ASCII antes do próximo. Respostas iniciadas por "*" indicam comando aceito; por "!", erro.</w:t>
+        <w:t xml:space="preserve">Clicar em Start Communication (ícone de "play"). Para enviar um comando, clicar no botão Send à esquerda do seu nome; enviar um de cada vez e conferir a resposta na aba ASCII antes do próximo. Respostas iniciadas por "*" indicam comando aceito; por "!", erro.</w:t>
       </w:r>
     </w:p>
     <w:p>
@@ -2795,7 +2795,7 @@
           <w:sz w:val="19"/>
           <w:szCs w:val="19"/>
         </w:rPr>
-        <w:t xml:space="preserve">Tabela 3: Comandos a cadastrar no Docklight</w:t>
+        <w:t xml:space="preserve">Tabela 3: Comandos a cadastrar no Docklight (ASCII, conforme o manual FLIR)</w:t>
       </w:r>
     </w:p>
     <w:tbl>
@@ -2811,10 +2811,8 @@
         </w:tblBorders>
       </w:tblPr>
       <w:tblGrid>
-        <w:gridCol w:w="1500"/>
-        <w:gridCol w:w="1900"/>
-        <w:gridCol w:w="2900"/>
-        <w:gridCol w:w="3338"/>
+        <w:gridCol w:w="2600"/>
+        <w:gridCol w:w="7038"/>
       </w:tblGrid>
       <w:tr>
         <w:trPr>
@@ -2823,7 +2821,7 @@
         </w:trPr>
         <w:tc>
           <w:tcPr>
-            <w:tcW w:type="dxa" w:w="1500"/>
+            <w:tcW w:type="dxa" w:w="2600"/>
             <w:tcBorders>
               <w:top w:val="single" w:color="000000" w:sz="4"/>
               <w:left w:val="single" w:color="000000" w:sz="4"/>
@@ -2853,85 +2851,13 @@
                 <w:sz w:val="19"/>
                 <w:szCs w:val="19"/>
               </w:rPr>
-              <w:t xml:space="preserve">NOME</w:t>
-            </w:r>
-          </w:p>
-        </w:tc>
-        <w:tc>
-          <w:tcPr>
-            <w:tcW w:type="dxa" w:w="1900"/>
-            <w:tcBorders>
-              <w:top w:val="single" w:color="000000" w:sz="4"/>
-              <w:left w:val="single" w:color="000000" w:sz="4"/>
-              <w:bottom w:val="single" w:color="000000" w:sz="4"/>
-              <w:right w:val="single" w:color="000000" w:sz="4"/>
-            </w:tcBorders>
-            <w:shd w:fill="D9D9D9" w:color="auto" w:val="clear"/>
-            <w:tcMar>
-              <w:top w:type="dxa" w:w="50"/>
-              <w:left w:type="dxa" w:w="90"/>
-              <w:bottom w:type="dxa" w:w="50"/>
-              <w:right w:type="dxa" w:w="90"/>
-            </w:tcMar>
-          </w:tcPr>
-          <w:p>
-            <w:pPr>
-              <w:spacing w:after="0"/>
-              <w:jc w:val="center"/>
-            </w:pPr>
-            <w:r>
-              <w:rPr>
-                <w:rFonts w:ascii="Arial" w:cs="Arial" w:eastAsia="Arial" w:hAnsi="Arial"/>
-                <w:b/>
-                <w:bCs/>
-                <w:i w:val="false"/>
-                <w:iCs w:val="false"/>
-                <w:sz w:val="19"/>
-                <w:szCs w:val="19"/>
-              </w:rPr>
-              <w:t xml:space="preserve">COMANDO</w:t>
-            </w:r>
-          </w:p>
-        </w:tc>
-        <w:tc>
-          <w:tcPr>
-            <w:tcW w:type="dxa" w:w="2900"/>
-            <w:tcBorders>
-              <w:top w:val="single" w:color="000000" w:sz="4"/>
-              <w:left w:val="single" w:color="000000" w:sz="4"/>
-              <w:bottom w:val="single" w:color="000000" w:sz="4"/>
-              <w:right w:val="single" w:color="000000" w:sz="4"/>
-            </w:tcBorders>
-            <w:shd w:fill="D9D9D9" w:color="auto" w:val="clear"/>
-            <w:tcMar>
-              <w:top w:type="dxa" w:w="50"/>
-              <w:left w:type="dxa" w:w="90"/>
-              <w:bottom w:type="dxa" w:w="50"/>
-              <w:right w:type="dxa" w:w="90"/>
-            </w:tcMar>
-          </w:tcPr>
-          <w:p>
-            <w:pPr>
-              <w:spacing w:after="0"/>
-              <w:jc w:val="center"/>
-            </w:pPr>
-            <w:r>
-              <w:rPr>
-                <w:rFonts w:ascii="Arial" w:cs="Arial" w:eastAsia="Arial" w:hAnsi="Arial"/>
-                <w:b/>
-                <w:bCs/>
-                <w:i w:val="false"/>
-                <w:iCs w:val="false"/>
-                <w:sz w:val="19"/>
-                <w:szCs w:val="19"/>
-              </w:rPr>
-              <w:t xml:space="preserve">BYTES (HEX)</w:t>
-            </w:r>
-          </w:p>
-        </w:tc>
-        <w:tc>
-          <w:tcPr>
-            <w:tcW w:type="dxa" w:w="3338"/>
+              <w:t xml:space="preserve">COMANDO ASCII (NAME e SEQUENCE)</w:t>
+            </w:r>
+          </w:p>
+        </w:tc>
+        <w:tc>
+          <w:tcPr>
+            <w:tcW w:type="dxa" w:w="7038"/>
             <w:tcBorders>
               <w:top w:val="single" w:color="000000" w:sz="4"/>
               <w:left w:val="single" w:color="000000" w:sz="4"/>
@@ -2973,42 +2899,7 @@
         </w:trPr>
         <w:tc>
           <w:tcPr>
-            <w:tcW w:type="dxa" w:w="1500"/>
-            <w:tcBorders>
-              <w:top w:val="single" w:color="000000" w:sz="4"/>
-              <w:left w:val="single" w:color="000000" w:sz="4"/>
-              <w:bottom w:val="single" w:color="000000" w:sz="4"/>
-              <w:right w:val="single" w:color="000000" w:sz="4"/>
-            </w:tcBorders>
-            <w:tcMar>
-              <w:top w:type="dxa" w:w="50"/>
-              <w:left w:type="dxa" w:w="90"/>
-              <w:bottom w:type="dxa" w:w="50"/>
-              <w:right w:type="dxa" w:w="90"/>
-            </w:tcMar>
-          </w:tcPr>
-          <w:p>
-            <w:pPr>
-              <w:spacing w:after="0"/>
-              <w:jc w:val="left"/>
-            </w:pPr>
-            <w:r>
-              <w:rPr>
-                <w:rFonts w:ascii="Arial" w:cs="Arial" w:eastAsia="Arial" w:hAnsi="Arial"/>
-                <w:b w:val="false"/>
-                <w:bCs w:val="false"/>
-                <w:i w:val="false"/>
-                <w:iCs w:val="false"/>
-                <w:sz w:val="19"/>
-                <w:szCs w:val="19"/>
-              </w:rPr>
-              <w:t xml:space="preserve">Versao</w:t>
-            </w:r>
-          </w:p>
-        </w:tc>
-        <w:tc>
-          <w:tcPr>
-            <w:tcW w:type="dxa" w:w="1900"/>
+            <w:tcW w:type="dxa" w:w="2600"/>
             <w:tcBorders>
               <w:top w:val="single" w:color="000000" w:sz="4"/>
               <w:left w:val="single" w:color="000000" w:sz="4"/>
@@ -3037,48 +2928,13 @@
                 <w:sz w:val="19"/>
                 <w:szCs w:val="19"/>
               </w:rPr>
-              <w:t xml:space="preserve">V&lt;CR&gt;</w:t>
-            </w:r>
-          </w:p>
-        </w:tc>
-        <w:tc>
-          <w:tcPr>
-            <w:tcW w:type="dxa" w:w="2900"/>
-            <w:tcBorders>
-              <w:top w:val="single" w:color="000000" w:sz="4"/>
-              <w:left w:val="single" w:color="000000" w:sz="4"/>
-              <w:bottom w:val="single" w:color="000000" w:sz="4"/>
-              <w:right w:val="single" w:color="000000" w:sz="4"/>
-            </w:tcBorders>
-            <w:tcMar>
-              <w:top w:type="dxa" w:w="50"/>
-              <w:left w:type="dxa" w:w="90"/>
-              <w:bottom w:type="dxa" w:w="50"/>
-              <w:right w:type="dxa" w:w="90"/>
-            </w:tcMar>
-          </w:tcPr>
-          <w:p>
-            <w:pPr>
-              <w:spacing w:after="0"/>
-              <w:jc w:val="center"/>
-            </w:pPr>
-            <w:r>
-              <w:rPr>
-                <w:rFonts w:ascii="Courier New" w:cs="Courier New" w:eastAsia="Courier New" w:hAnsi="Courier New"/>
-                <w:b w:val="false"/>
-                <w:bCs w:val="false"/>
-                <w:i w:val="false"/>
-                <w:iCs w:val="false"/>
-                <w:sz w:val="19"/>
-                <w:szCs w:val="19"/>
-              </w:rPr>
-              <w:t xml:space="preserve">56 0D</w:t>
-            </w:r>
-          </w:p>
-        </w:tc>
-        <w:tc>
-          <w:tcPr>
-            <w:tcW w:type="dxa" w:w="3338"/>
+              <w:t xml:space="preserve">V</w:t>
+            </w:r>
+          </w:p>
+        </w:tc>
+        <w:tc>
+          <w:tcPr>
+            <w:tcW w:type="dxa" w:w="7038"/>
             <w:tcBorders>
               <w:top w:val="single" w:color="000000" w:sz="4"/>
               <w:left w:val="single" w:color="000000" w:sz="4"/>
@@ -3119,7 +2975,42 @@
         </w:trPr>
         <w:tc>
           <w:tcPr>
-            <w:tcW w:type="dxa" w:w="1500"/>
+            <w:tcW w:type="dxa" w:w="2600"/>
+            <w:tcBorders>
+              <w:top w:val="single" w:color="000000" w:sz="4"/>
+              <w:left w:val="single" w:color="000000" w:sz="4"/>
+              <w:bottom w:val="single" w:color="000000" w:sz="4"/>
+              <w:right w:val="single" w:color="000000" w:sz="4"/>
+            </w:tcBorders>
+            <w:tcMar>
+              <w:top w:type="dxa" w:w="50"/>
+              <w:left w:type="dxa" w:w="90"/>
+              <w:bottom w:type="dxa" w:w="50"/>
+              <w:right w:type="dxa" w:w="90"/>
+            </w:tcMar>
+          </w:tcPr>
+          <w:p>
+            <w:pPr>
+              <w:spacing w:after="0"/>
+              <w:jc w:val="center"/>
+            </w:pPr>
+            <w:r>
+              <w:rPr>
+                <w:rFonts w:ascii="Courier New" w:cs="Courier New" w:eastAsia="Courier New" w:hAnsi="Courier New"/>
+                <w:b w:val="false"/>
+                <w:bCs w:val="false"/>
+                <w:i w:val="false"/>
+                <w:iCs w:val="false"/>
+                <w:sz w:val="19"/>
+                <w:szCs w:val="19"/>
+              </w:rPr>
+              <w:t xml:space="preserve">RPS</w:t>
+            </w:r>
+          </w:p>
+        </w:tc>
+        <w:tc>
+          <w:tcPr>
+            <w:tcW w:type="dxa" w:w="7038"/>
             <w:tcBorders>
               <w:top w:val="single" w:color="000000" w:sz="4"/>
               <w:left w:val="single" w:color="000000" w:sz="4"/>
@@ -3148,112 +3039,7 @@
                 <w:sz w:val="19"/>
                 <w:szCs w:val="19"/>
               </w:rPr>
-              <w:t xml:space="preserve">Le_RPS</w:t>
-            </w:r>
-          </w:p>
-        </w:tc>
-        <w:tc>
-          <w:tcPr>
-            <w:tcW w:type="dxa" w:w="1900"/>
-            <w:tcBorders>
-              <w:top w:val="single" w:color="000000" w:sz="4"/>
-              <w:left w:val="single" w:color="000000" w:sz="4"/>
-              <w:bottom w:val="single" w:color="000000" w:sz="4"/>
-              <w:right w:val="single" w:color="000000" w:sz="4"/>
-            </w:tcBorders>
-            <w:tcMar>
-              <w:top w:type="dxa" w:w="50"/>
-              <w:left w:type="dxa" w:w="90"/>
-              <w:bottom w:type="dxa" w:w="50"/>
-              <w:right w:type="dxa" w:w="90"/>
-            </w:tcMar>
-          </w:tcPr>
-          <w:p>
-            <w:pPr>
-              <w:spacing w:after="0"/>
-              <w:jc w:val="center"/>
-            </w:pPr>
-            <w:r>
-              <w:rPr>
-                <w:rFonts w:ascii="Courier New" w:cs="Courier New" w:eastAsia="Courier New" w:hAnsi="Courier New"/>
-                <w:b w:val="false"/>
-                <w:bCs w:val="false"/>
-                <w:i w:val="false"/>
-                <w:iCs w:val="false"/>
-                <w:sz w:val="19"/>
-                <w:szCs w:val="19"/>
-              </w:rPr>
-              <w:t xml:space="preserve">RPS&lt;CR&gt;</w:t>
-            </w:r>
-          </w:p>
-        </w:tc>
-        <w:tc>
-          <w:tcPr>
-            <w:tcW w:type="dxa" w:w="2900"/>
-            <w:tcBorders>
-              <w:top w:val="single" w:color="000000" w:sz="4"/>
-              <w:left w:val="single" w:color="000000" w:sz="4"/>
-              <w:bottom w:val="single" w:color="000000" w:sz="4"/>
-              <w:right w:val="single" w:color="000000" w:sz="4"/>
-            </w:tcBorders>
-            <w:tcMar>
-              <w:top w:type="dxa" w:w="50"/>
-              <w:left w:type="dxa" w:w="90"/>
-              <w:bottom w:type="dxa" w:w="50"/>
-              <w:right w:type="dxa" w:w="90"/>
-            </w:tcMar>
-          </w:tcPr>
-          <w:p>
-            <w:pPr>
-              <w:spacing w:after="0"/>
-              <w:jc w:val="center"/>
-            </w:pPr>
-            <w:r>
-              <w:rPr>
-                <w:rFonts w:ascii="Courier New" w:cs="Courier New" w:eastAsia="Courier New" w:hAnsi="Courier New"/>
-                <w:b w:val="false"/>
-                <w:bCs w:val="false"/>
-                <w:i w:val="false"/>
-                <w:iCs w:val="false"/>
-                <w:sz w:val="19"/>
-                <w:szCs w:val="19"/>
-              </w:rPr>
-              <w:t xml:space="preserve">52 50 53 0D</w:t>
-            </w:r>
-          </w:p>
-        </w:tc>
-        <w:tc>
-          <w:tcPr>
-            <w:tcW w:type="dxa" w:w="3338"/>
-            <w:tcBorders>
-              <w:top w:val="single" w:color="000000" w:sz="4"/>
-              <w:left w:val="single" w:color="000000" w:sz="4"/>
-              <w:bottom w:val="single" w:color="000000" w:sz="4"/>
-              <w:right w:val="single" w:color="000000" w:sz="4"/>
-            </w:tcBorders>
-            <w:tcMar>
-              <w:top w:type="dxa" w:w="50"/>
-              <w:left w:type="dxa" w:w="90"/>
-              <w:bottom w:type="dxa" w:w="50"/>
-              <w:right w:type="dxa" w:w="90"/>
-            </w:tcMar>
-          </w:tcPr>
-          <w:p>
-            <w:pPr>
-              <w:spacing w:after="0"/>
-              <w:jc w:val="left"/>
-            </w:pPr>
-            <w:r>
-              <w:rPr>
-                <w:rFonts w:ascii="Arial" w:cs="Arial" w:eastAsia="Arial" w:hAnsi="Arial"/>
-                <w:b w:val="false"/>
-                <w:bCs w:val="false"/>
-                <w:i w:val="false"/>
-                <w:iCs w:val="false"/>
-                <w:sz w:val="19"/>
-                <w:szCs w:val="19"/>
-              </w:rPr>
-              <w:t xml:space="preserve">Lê a velocidade de reset do pan</w:t>
+              <w:t xml:space="preserve">Consulta a velocidade de reset do pan</w:t>
             </w:r>
           </w:p>
         </w:tc>
@@ -3265,7 +3051,42 @@
         </w:trPr>
         <w:tc>
           <w:tcPr>
-            <w:tcW w:type="dxa" w:w="1500"/>
+            <w:tcW w:type="dxa" w:w="2600"/>
+            <w:tcBorders>
+              <w:top w:val="single" w:color="000000" w:sz="4"/>
+              <w:left w:val="single" w:color="000000" w:sz="4"/>
+              <w:bottom w:val="single" w:color="000000" w:sz="4"/>
+              <w:right w:val="single" w:color="000000" w:sz="4"/>
+            </w:tcBorders>
+            <w:tcMar>
+              <w:top w:type="dxa" w:w="50"/>
+              <w:left w:type="dxa" w:w="90"/>
+              <w:bottom w:type="dxa" w:w="50"/>
+              <w:right w:type="dxa" w:w="90"/>
+            </w:tcMar>
+          </w:tcPr>
+          <w:p>
+            <w:pPr>
+              <w:spacing w:after="0"/>
+              <w:jc w:val="center"/>
+            </w:pPr>
+            <w:r>
+              <w:rPr>
+                <w:rFonts w:ascii="Courier New" w:cs="Courier New" w:eastAsia="Courier New" w:hAnsi="Courier New"/>
+                <w:b w:val="false"/>
+                <w:bCs w:val="false"/>
+                <w:i w:val="false"/>
+                <w:iCs w:val="false"/>
+                <w:sz w:val="19"/>
+                <w:szCs w:val="19"/>
+              </w:rPr>
+              <w:t xml:space="preserve">RTS</w:t>
+            </w:r>
+          </w:p>
+        </w:tc>
+        <w:tc>
+          <w:tcPr>
+            <w:tcW w:type="dxa" w:w="7038"/>
             <w:tcBorders>
               <w:top w:val="single" w:color="000000" w:sz="4"/>
               <w:left w:val="single" w:color="000000" w:sz="4"/>
@@ -3294,112 +3115,7 @@
                 <w:sz w:val="19"/>
                 <w:szCs w:val="19"/>
               </w:rPr>
-              <w:t xml:space="preserve">Le_RTS</w:t>
-            </w:r>
-          </w:p>
-        </w:tc>
-        <w:tc>
-          <w:tcPr>
-            <w:tcW w:type="dxa" w:w="1900"/>
-            <w:tcBorders>
-              <w:top w:val="single" w:color="000000" w:sz="4"/>
-              <w:left w:val="single" w:color="000000" w:sz="4"/>
-              <w:bottom w:val="single" w:color="000000" w:sz="4"/>
-              <w:right w:val="single" w:color="000000" w:sz="4"/>
-            </w:tcBorders>
-            <w:tcMar>
-              <w:top w:type="dxa" w:w="50"/>
-              <w:left w:type="dxa" w:w="90"/>
-              <w:bottom w:type="dxa" w:w="50"/>
-              <w:right w:type="dxa" w:w="90"/>
-            </w:tcMar>
-          </w:tcPr>
-          <w:p>
-            <w:pPr>
-              <w:spacing w:after="0"/>
-              <w:jc w:val="center"/>
-            </w:pPr>
-            <w:r>
-              <w:rPr>
-                <w:rFonts w:ascii="Courier New" w:cs="Courier New" w:eastAsia="Courier New" w:hAnsi="Courier New"/>
-                <w:b w:val="false"/>
-                <w:bCs w:val="false"/>
-                <w:i w:val="false"/>
-                <w:iCs w:val="false"/>
-                <w:sz w:val="19"/>
-                <w:szCs w:val="19"/>
-              </w:rPr>
-              <w:t xml:space="preserve">RTS&lt;CR&gt;</w:t>
-            </w:r>
-          </w:p>
-        </w:tc>
-        <w:tc>
-          <w:tcPr>
-            <w:tcW w:type="dxa" w:w="2900"/>
-            <w:tcBorders>
-              <w:top w:val="single" w:color="000000" w:sz="4"/>
-              <w:left w:val="single" w:color="000000" w:sz="4"/>
-              <w:bottom w:val="single" w:color="000000" w:sz="4"/>
-              <w:right w:val="single" w:color="000000" w:sz="4"/>
-            </w:tcBorders>
-            <w:tcMar>
-              <w:top w:type="dxa" w:w="50"/>
-              <w:left w:type="dxa" w:w="90"/>
-              <w:bottom w:type="dxa" w:w="50"/>
-              <w:right w:type="dxa" w:w="90"/>
-            </w:tcMar>
-          </w:tcPr>
-          <w:p>
-            <w:pPr>
-              <w:spacing w:after="0"/>
-              <w:jc w:val="center"/>
-            </w:pPr>
-            <w:r>
-              <w:rPr>
-                <w:rFonts w:ascii="Courier New" w:cs="Courier New" w:eastAsia="Courier New" w:hAnsi="Courier New"/>
-                <w:b w:val="false"/>
-                <w:bCs w:val="false"/>
-                <w:i w:val="false"/>
-                <w:iCs w:val="false"/>
-                <w:sz w:val="19"/>
-                <w:szCs w:val="19"/>
-              </w:rPr>
-              <w:t xml:space="preserve">52 54 53 0D</w:t>
-            </w:r>
-          </w:p>
-        </w:tc>
-        <w:tc>
-          <w:tcPr>
-            <w:tcW w:type="dxa" w:w="3338"/>
-            <w:tcBorders>
-              <w:top w:val="single" w:color="000000" w:sz="4"/>
-              <w:left w:val="single" w:color="000000" w:sz="4"/>
-              <w:bottom w:val="single" w:color="000000" w:sz="4"/>
-              <w:right w:val="single" w:color="000000" w:sz="4"/>
-            </w:tcBorders>
-            <w:tcMar>
-              <w:top w:type="dxa" w:w="50"/>
-              <w:left w:type="dxa" w:w="90"/>
-              <w:bottom w:type="dxa" w:w="50"/>
-              <w:right w:type="dxa" w:w="90"/>
-            </w:tcMar>
-          </w:tcPr>
-          <w:p>
-            <w:pPr>
-              <w:spacing w:after="0"/>
-              <w:jc w:val="left"/>
-            </w:pPr>
-            <w:r>
-              <w:rPr>
-                <w:rFonts w:ascii="Arial" w:cs="Arial" w:eastAsia="Arial" w:hAnsi="Arial"/>
-                <w:b w:val="false"/>
-                <w:bCs w:val="false"/>
-                <w:i w:val="false"/>
-                <w:iCs w:val="false"/>
-                <w:sz w:val="19"/>
-                <w:szCs w:val="19"/>
-              </w:rPr>
-              <w:t xml:space="preserve">Lê a velocidade de reset do tilt</w:t>
+              <w:t xml:space="preserve">Consulta a velocidade de reset do tilt</w:t>
             </w:r>
           </w:p>
         </w:tc>
@@ -3411,42 +3127,7 @@
         </w:trPr>
         <w:tc>
           <w:tcPr>
-            <w:tcW w:type="dxa" w:w="1500"/>
-            <w:tcBorders>
-              <w:top w:val="single" w:color="000000" w:sz="4"/>
-              <w:left w:val="single" w:color="000000" w:sz="4"/>
-              <w:bottom w:val="single" w:color="000000" w:sz="4"/>
-              <w:right w:val="single" w:color="000000" w:sz="4"/>
-            </w:tcBorders>
-            <w:tcMar>
-              <w:top w:type="dxa" w:w="50"/>
-              <w:left w:type="dxa" w:w="90"/>
-              <w:bottom w:type="dxa" w:w="50"/>
-              <w:right w:type="dxa" w:w="90"/>
-            </w:tcMar>
-          </w:tcPr>
-          <w:p>
-            <w:pPr>
-              <w:spacing w:after="0"/>
-              <w:jc w:val="left"/>
-            </w:pPr>
-            <w:r>
-              <w:rPr>
-                <w:rFonts w:ascii="Arial" w:cs="Arial" w:eastAsia="Arial" w:hAnsi="Arial"/>
-                <w:b w:val="false"/>
-                <w:bCs w:val="false"/>
-                <w:i w:val="false"/>
-                <w:iCs w:val="false"/>
-                <w:sz w:val="19"/>
-                <w:szCs w:val="19"/>
-              </w:rPr>
-              <w:t xml:space="preserve">Reset</w:t>
-            </w:r>
-          </w:p>
-        </w:tc>
-        <w:tc>
-          <w:tcPr>
-            <w:tcW w:type="dxa" w:w="1900"/>
+            <w:tcW w:type="dxa" w:w="2600"/>
             <w:tcBorders>
               <w:top w:val="single" w:color="000000" w:sz="4"/>
               <w:left w:val="single" w:color="000000" w:sz="4"/>
@@ -3475,48 +3156,13 @@
                 <w:sz w:val="19"/>
                 <w:szCs w:val="19"/>
               </w:rPr>
-              <w:t xml:space="preserve">R&lt;CR&gt;</w:t>
-            </w:r>
-          </w:p>
-        </w:tc>
-        <w:tc>
-          <w:tcPr>
-            <w:tcW w:type="dxa" w:w="2900"/>
-            <w:tcBorders>
-              <w:top w:val="single" w:color="000000" w:sz="4"/>
-              <w:left w:val="single" w:color="000000" w:sz="4"/>
-              <w:bottom w:val="single" w:color="000000" w:sz="4"/>
-              <w:right w:val="single" w:color="000000" w:sz="4"/>
-            </w:tcBorders>
-            <w:tcMar>
-              <w:top w:type="dxa" w:w="50"/>
-              <w:left w:type="dxa" w:w="90"/>
-              <w:bottom w:type="dxa" w:w="50"/>
-              <w:right w:type="dxa" w:w="90"/>
-            </w:tcMar>
-          </w:tcPr>
-          <w:p>
-            <w:pPr>
-              <w:spacing w:after="0"/>
-              <w:jc w:val="center"/>
-            </w:pPr>
-            <w:r>
-              <w:rPr>
-                <w:rFonts w:ascii="Courier New" w:cs="Courier New" w:eastAsia="Courier New" w:hAnsi="Courier New"/>
-                <w:b w:val="false"/>
-                <w:bCs w:val="false"/>
-                <w:i w:val="false"/>
-                <w:iCs w:val="false"/>
-                <w:sz w:val="19"/>
-                <w:szCs w:val="19"/>
-              </w:rPr>
-              <w:t xml:space="preserve">52 0D</w:t>
-            </w:r>
-          </w:p>
-        </w:tc>
-        <w:tc>
-          <w:tcPr>
-            <w:tcW w:type="dxa" w:w="3338"/>
+              <w:t xml:space="preserve">R</w:t>
+            </w:r>
+          </w:p>
+        </w:tc>
+        <w:tc>
+          <w:tcPr>
+            <w:tcW w:type="dxa" w:w="7038"/>
             <w:tcBorders>
               <w:top w:val="single" w:color="000000" w:sz="4"/>
               <w:left w:val="single" w:color="000000" w:sz="4"/>
@@ -3557,7 +3203,42 @@
         </w:trPr>
         <w:tc>
           <w:tcPr>
-            <w:tcW w:type="dxa" w:w="1500"/>
+            <w:tcW w:type="dxa" w:w="2600"/>
+            <w:tcBorders>
+              <w:top w:val="single" w:color="000000" w:sz="4"/>
+              <w:left w:val="single" w:color="000000" w:sz="4"/>
+              <w:bottom w:val="single" w:color="000000" w:sz="4"/>
+              <w:right w:val="single" w:color="000000" w:sz="4"/>
+            </w:tcBorders>
+            <w:tcMar>
+              <w:top w:type="dxa" w:w="50"/>
+              <w:left w:type="dxa" w:w="90"/>
+              <w:bottom w:type="dxa" w:w="50"/>
+              <w:right w:type="dxa" w:w="90"/>
+            </w:tcMar>
+          </w:tcPr>
+          <w:p>
+            <w:pPr>
+              <w:spacing w:after="0"/>
+              <w:jc w:val="center"/>
+            </w:pPr>
+            <w:r>
+              <w:rPr>
+                <w:rFonts w:ascii="Courier New" w:cs="Courier New" w:eastAsia="Courier New" w:hAnsi="Courier New"/>
+                <w:b w:val="false"/>
+                <w:bCs w:val="false"/>
+                <w:i w:val="false"/>
+                <w:iCs w:val="false"/>
+                <w:sz w:val="19"/>
+                <w:szCs w:val="19"/>
+              </w:rPr>
+              <w:t xml:space="preserve">PP</w:t>
+            </w:r>
+          </w:p>
+        </w:tc>
+        <w:tc>
+          <w:tcPr>
+            <w:tcW w:type="dxa" w:w="7038"/>
             <w:tcBorders>
               <w:top w:val="single" w:color="000000" w:sz="4"/>
               <w:left w:val="single" w:color="000000" w:sz="4"/>
@@ -3586,112 +3267,7 @@
                 <w:sz w:val="19"/>
                 <w:szCs w:val="19"/>
               </w:rPr>
-              <w:t xml:space="preserve">Le_PP</w:t>
-            </w:r>
-          </w:p>
-        </w:tc>
-        <w:tc>
-          <w:tcPr>
-            <w:tcW w:type="dxa" w:w="1900"/>
-            <w:tcBorders>
-              <w:top w:val="single" w:color="000000" w:sz="4"/>
-              <w:left w:val="single" w:color="000000" w:sz="4"/>
-              <w:bottom w:val="single" w:color="000000" w:sz="4"/>
-              <w:right w:val="single" w:color="000000" w:sz="4"/>
-            </w:tcBorders>
-            <w:tcMar>
-              <w:top w:type="dxa" w:w="50"/>
-              <w:left w:type="dxa" w:w="90"/>
-              <w:bottom w:type="dxa" w:w="50"/>
-              <w:right w:type="dxa" w:w="90"/>
-            </w:tcMar>
-          </w:tcPr>
-          <w:p>
-            <w:pPr>
-              <w:spacing w:after="0"/>
-              <w:jc w:val="center"/>
-            </w:pPr>
-            <w:r>
-              <w:rPr>
-                <w:rFonts w:ascii="Courier New" w:cs="Courier New" w:eastAsia="Courier New" w:hAnsi="Courier New"/>
-                <w:b w:val="false"/>
-                <w:bCs w:val="false"/>
-                <w:i w:val="false"/>
-                <w:iCs w:val="false"/>
-                <w:sz w:val="19"/>
-                <w:szCs w:val="19"/>
-              </w:rPr>
-              <w:t xml:space="preserve">PP&lt;CR&gt;</w:t>
-            </w:r>
-          </w:p>
-        </w:tc>
-        <w:tc>
-          <w:tcPr>
-            <w:tcW w:type="dxa" w:w="2900"/>
-            <w:tcBorders>
-              <w:top w:val="single" w:color="000000" w:sz="4"/>
-              <w:left w:val="single" w:color="000000" w:sz="4"/>
-              <w:bottom w:val="single" w:color="000000" w:sz="4"/>
-              <w:right w:val="single" w:color="000000" w:sz="4"/>
-            </w:tcBorders>
-            <w:tcMar>
-              <w:top w:type="dxa" w:w="50"/>
-              <w:left w:type="dxa" w:w="90"/>
-              <w:bottom w:type="dxa" w:w="50"/>
-              <w:right w:type="dxa" w:w="90"/>
-            </w:tcMar>
-          </w:tcPr>
-          <w:p>
-            <w:pPr>
-              <w:spacing w:after="0"/>
-              <w:jc w:val="center"/>
-            </w:pPr>
-            <w:r>
-              <w:rPr>
-                <w:rFonts w:ascii="Courier New" w:cs="Courier New" w:eastAsia="Courier New" w:hAnsi="Courier New"/>
-                <w:b w:val="false"/>
-                <w:bCs w:val="false"/>
-                <w:i w:val="false"/>
-                <w:iCs w:val="false"/>
-                <w:sz w:val="19"/>
-                <w:szCs w:val="19"/>
-              </w:rPr>
-              <w:t xml:space="preserve">50 50 0D</w:t>
-            </w:r>
-          </w:p>
-        </w:tc>
-        <w:tc>
-          <w:tcPr>
-            <w:tcW w:type="dxa" w:w="3338"/>
-            <w:tcBorders>
-              <w:top w:val="single" w:color="000000" w:sz="4"/>
-              <w:left w:val="single" w:color="000000" w:sz="4"/>
-              <w:bottom w:val="single" w:color="000000" w:sz="4"/>
-              <w:right w:val="single" w:color="000000" w:sz="4"/>
-            </w:tcBorders>
-            <w:tcMar>
-              <w:top w:type="dxa" w:w="50"/>
-              <w:left w:type="dxa" w:w="90"/>
-              <w:bottom w:type="dxa" w:w="50"/>
-              <w:right w:type="dxa" w:w="90"/>
-            </w:tcMar>
-          </w:tcPr>
-          <w:p>
-            <w:pPr>
-              <w:spacing w:after="0"/>
-              <w:jc w:val="left"/>
-            </w:pPr>
-            <w:r>
-              <w:rPr>
-                <w:rFonts w:ascii="Arial" w:cs="Arial" w:eastAsia="Arial" w:hAnsi="Arial"/>
-                <w:b w:val="false"/>
-                <w:bCs w:val="false"/>
-                <w:i w:val="false"/>
-                <w:iCs w:val="false"/>
-                <w:sz w:val="19"/>
-                <w:szCs w:val="19"/>
-              </w:rPr>
-              <w:t xml:space="preserve">Lê a posição atual do pan</w:t>
+              <w:t xml:space="preserve">Consulta a posição atual do pan</w:t>
             </w:r>
           </w:p>
         </w:tc>
@@ -3703,7 +3279,42 @@
         </w:trPr>
         <w:tc>
           <w:tcPr>
-            <w:tcW w:type="dxa" w:w="1500"/>
+            <w:tcW w:type="dxa" w:w="2600"/>
+            <w:tcBorders>
+              <w:top w:val="single" w:color="000000" w:sz="4"/>
+              <w:left w:val="single" w:color="000000" w:sz="4"/>
+              <w:bottom w:val="single" w:color="000000" w:sz="4"/>
+              <w:right w:val="single" w:color="000000" w:sz="4"/>
+            </w:tcBorders>
+            <w:tcMar>
+              <w:top w:type="dxa" w:w="50"/>
+              <w:left w:type="dxa" w:w="90"/>
+              <w:bottom w:type="dxa" w:w="50"/>
+              <w:right w:type="dxa" w:w="90"/>
+            </w:tcMar>
+          </w:tcPr>
+          <w:p>
+            <w:pPr>
+              <w:spacing w:after="0"/>
+              <w:jc w:val="center"/>
+            </w:pPr>
+            <w:r>
+              <w:rPr>
+                <w:rFonts w:ascii="Courier New" w:cs="Courier New" w:eastAsia="Courier New" w:hAnsi="Courier New"/>
+                <w:b w:val="false"/>
+                <w:bCs w:val="false"/>
+                <w:i w:val="false"/>
+                <w:iCs w:val="false"/>
+                <w:sz w:val="19"/>
+                <w:szCs w:val="19"/>
+              </w:rPr>
+              <w:t xml:space="preserve">TP</w:t>
+            </w:r>
+          </w:p>
+        </w:tc>
+        <w:tc>
+          <w:tcPr>
+            <w:tcW w:type="dxa" w:w="7038"/>
             <w:tcBorders>
               <w:top w:val="single" w:color="000000" w:sz="4"/>
               <w:left w:val="single" w:color="000000" w:sz="4"/>
@@ -3732,112 +3343,7 @@
                 <w:sz w:val="19"/>
                 <w:szCs w:val="19"/>
               </w:rPr>
-              <w:t xml:space="preserve">Le_TP</w:t>
-            </w:r>
-          </w:p>
-        </w:tc>
-        <w:tc>
-          <w:tcPr>
-            <w:tcW w:type="dxa" w:w="1900"/>
-            <w:tcBorders>
-              <w:top w:val="single" w:color="000000" w:sz="4"/>
-              <w:left w:val="single" w:color="000000" w:sz="4"/>
-              <w:bottom w:val="single" w:color="000000" w:sz="4"/>
-              <w:right w:val="single" w:color="000000" w:sz="4"/>
-            </w:tcBorders>
-            <w:tcMar>
-              <w:top w:type="dxa" w:w="50"/>
-              <w:left w:type="dxa" w:w="90"/>
-              <w:bottom w:type="dxa" w:w="50"/>
-              <w:right w:type="dxa" w:w="90"/>
-            </w:tcMar>
-          </w:tcPr>
-          <w:p>
-            <w:pPr>
-              <w:spacing w:after="0"/>
-              <w:jc w:val="center"/>
-            </w:pPr>
-            <w:r>
-              <w:rPr>
-                <w:rFonts w:ascii="Courier New" w:cs="Courier New" w:eastAsia="Courier New" w:hAnsi="Courier New"/>
-                <w:b w:val="false"/>
-                <w:bCs w:val="false"/>
-                <w:i w:val="false"/>
-                <w:iCs w:val="false"/>
-                <w:sz w:val="19"/>
-                <w:szCs w:val="19"/>
-              </w:rPr>
-              <w:t xml:space="preserve">TP&lt;CR&gt;</w:t>
-            </w:r>
-          </w:p>
-        </w:tc>
-        <w:tc>
-          <w:tcPr>
-            <w:tcW w:type="dxa" w:w="2900"/>
-            <w:tcBorders>
-              <w:top w:val="single" w:color="000000" w:sz="4"/>
-              <w:left w:val="single" w:color="000000" w:sz="4"/>
-              <w:bottom w:val="single" w:color="000000" w:sz="4"/>
-              <w:right w:val="single" w:color="000000" w:sz="4"/>
-            </w:tcBorders>
-            <w:tcMar>
-              <w:top w:type="dxa" w:w="50"/>
-              <w:left w:type="dxa" w:w="90"/>
-              <w:bottom w:type="dxa" w:w="50"/>
-              <w:right w:type="dxa" w:w="90"/>
-            </w:tcMar>
-          </w:tcPr>
-          <w:p>
-            <w:pPr>
-              <w:spacing w:after="0"/>
-              <w:jc w:val="center"/>
-            </w:pPr>
-            <w:r>
-              <w:rPr>
-                <w:rFonts w:ascii="Courier New" w:cs="Courier New" w:eastAsia="Courier New" w:hAnsi="Courier New"/>
-                <w:b w:val="false"/>
-                <w:bCs w:val="false"/>
-                <w:i w:val="false"/>
-                <w:iCs w:val="false"/>
-                <w:sz w:val="19"/>
-                <w:szCs w:val="19"/>
-              </w:rPr>
-              <w:t xml:space="preserve">54 50 0D</w:t>
-            </w:r>
-          </w:p>
-        </w:tc>
-        <w:tc>
-          <w:tcPr>
-            <w:tcW w:type="dxa" w:w="3338"/>
-            <w:tcBorders>
-              <w:top w:val="single" w:color="000000" w:sz="4"/>
-              <w:left w:val="single" w:color="000000" w:sz="4"/>
-              <w:bottom w:val="single" w:color="000000" w:sz="4"/>
-              <w:right w:val="single" w:color="000000" w:sz="4"/>
-            </w:tcBorders>
-            <w:tcMar>
-              <w:top w:type="dxa" w:w="50"/>
-              <w:left w:type="dxa" w:w="90"/>
-              <w:bottom w:type="dxa" w:w="50"/>
-              <w:right w:type="dxa" w:w="90"/>
-            </w:tcMar>
-          </w:tcPr>
-          <w:p>
-            <w:pPr>
-              <w:spacing w:after="0"/>
-              <w:jc w:val="left"/>
-            </w:pPr>
-            <w:r>
-              <w:rPr>
-                <w:rFonts w:ascii="Arial" w:cs="Arial" w:eastAsia="Arial" w:hAnsi="Arial"/>
-                <w:b w:val="false"/>
-                <w:bCs w:val="false"/>
-                <w:i w:val="false"/>
-                <w:iCs w:val="false"/>
-                <w:sz w:val="19"/>
-                <w:szCs w:val="19"/>
-              </w:rPr>
-              <w:t xml:space="preserve">Lê a posição atual do tilt</w:t>
+              <w:t xml:space="preserve">Consulta a posição atual do tilt</w:t>
             </w:r>
           </w:p>
         </w:tc>
@@ -3849,28 +3355,28 @@
         </w:trPr>
         <w:tc>
           <w:tcPr>
-            <w:tcW w:type="dxa" w:w="1500"/>
-            <w:tcBorders>
-              <w:top w:val="single" w:color="000000" w:sz="4"/>
-              <w:left w:val="single" w:color="000000" w:sz="4"/>
-              <w:bottom w:val="single" w:color="000000" w:sz="4"/>
-              <w:right w:val="single" w:color="000000" w:sz="4"/>
-            </w:tcBorders>
-            <w:tcMar>
-              <w:top w:type="dxa" w:w="50"/>
-              <w:left w:type="dxa" w:w="90"/>
-              <w:bottom w:type="dxa" w:w="50"/>
-              <w:right w:type="dxa" w:w="90"/>
-            </w:tcMar>
-          </w:tcPr>
-          <w:p>
-            <w:pPr>
-              <w:spacing w:after="0"/>
-              <w:jc w:val="left"/>
-            </w:pPr>
-            <w:r>
-              <w:rPr>
-                <w:rFonts w:ascii="Arial" w:cs="Arial" w:eastAsia="Arial" w:hAnsi="Arial"/>
+            <w:tcW w:type="dxa" w:w="2600"/>
+            <w:tcBorders>
+              <w:top w:val="single" w:color="000000" w:sz="4"/>
+              <w:left w:val="single" w:color="000000" w:sz="4"/>
+              <w:bottom w:val="single" w:color="000000" w:sz="4"/>
+              <w:right w:val="single" w:color="000000" w:sz="4"/>
+            </w:tcBorders>
+            <w:tcMar>
+              <w:top w:type="dxa" w:w="50"/>
+              <w:left w:type="dxa" w:w="90"/>
+              <w:bottom w:type="dxa" w:w="50"/>
+              <w:right w:type="dxa" w:w="90"/>
+            </w:tcMar>
+          </w:tcPr>
+          <w:p>
+            <w:pPr>
+              <w:spacing w:after="0"/>
+              <w:jc w:val="center"/>
+            </w:pPr>
+            <w:r>
+              <w:rPr>
+                <w:rFonts w:ascii="Courier New" w:cs="Courier New" w:eastAsia="Courier New" w:hAnsi="Courier New"/>
                 <w:b w:val="false"/>
                 <w:bCs w:val="false"/>
                 <w:i w:val="false"/>
@@ -3884,77 +3390,7 @@
         </w:tc>
         <w:tc>
           <w:tcPr>
-            <w:tcW w:type="dxa" w:w="1900"/>
-            <w:tcBorders>
-              <w:top w:val="single" w:color="000000" w:sz="4"/>
-              <w:left w:val="single" w:color="000000" w:sz="4"/>
-              <w:bottom w:val="single" w:color="000000" w:sz="4"/>
-              <w:right w:val="single" w:color="000000" w:sz="4"/>
-            </w:tcBorders>
-            <w:tcMar>
-              <w:top w:type="dxa" w:w="50"/>
-              <w:left w:type="dxa" w:w="90"/>
-              <w:bottom w:type="dxa" w:w="50"/>
-              <w:right w:type="dxa" w:w="90"/>
-            </w:tcMar>
-          </w:tcPr>
-          <w:p>
-            <w:pPr>
-              <w:spacing w:after="0"/>
-              <w:jc w:val="center"/>
-            </w:pPr>
-            <w:r>
-              <w:rPr>
-                <w:rFonts w:ascii="Courier New" w:cs="Courier New" w:eastAsia="Courier New" w:hAnsi="Courier New"/>
-                <w:b w:val="false"/>
-                <w:bCs w:val="false"/>
-                <w:i w:val="false"/>
-                <w:iCs w:val="false"/>
-                <w:sz w:val="19"/>
-                <w:szCs w:val="19"/>
-              </w:rPr>
-              <w:t xml:space="preserve">PP1000&lt;CR&gt;</w:t>
-            </w:r>
-          </w:p>
-        </w:tc>
-        <w:tc>
-          <w:tcPr>
-            <w:tcW w:type="dxa" w:w="2900"/>
-            <w:tcBorders>
-              <w:top w:val="single" w:color="000000" w:sz="4"/>
-              <w:left w:val="single" w:color="000000" w:sz="4"/>
-              <w:bottom w:val="single" w:color="000000" w:sz="4"/>
-              <w:right w:val="single" w:color="000000" w:sz="4"/>
-            </w:tcBorders>
-            <w:tcMar>
-              <w:top w:type="dxa" w:w="50"/>
-              <w:left w:type="dxa" w:w="90"/>
-              <w:bottom w:type="dxa" w:w="50"/>
-              <w:right w:type="dxa" w:w="90"/>
-            </w:tcMar>
-          </w:tcPr>
-          <w:p>
-            <w:pPr>
-              <w:spacing w:after="0"/>
-              <w:jc w:val="center"/>
-            </w:pPr>
-            <w:r>
-              <w:rPr>
-                <w:rFonts w:ascii="Courier New" w:cs="Courier New" w:eastAsia="Courier New" w:hAnsi="Courier New"/>
-                <w:b w:val="false"/>
-                <w:bCs w:val="false"/>
-                <w:i w:val="false"/>
-                <w:iCs w:val="false"/>
-                <w:sz w:val="19"/>
-                <w:szCs w:val="19"/>
-              </w:rPr>
-              <w:t xml:space="preserve">50 50 31 30 30 30 0D</w:t>
-            </w:r>
-          </w:p>
-        </w:tc>
-        <w:tc>
-          <w:tcPr>
-            <w:tcW w:type="dxa" w:w="3338"/>
+            <w:tcW w:type="dxa" w:w="7038"/>
             <w:tcBorders>
               <w:top w:val="single" w:color="000000" w:sz="4"/>
               <w:left w:val="single" w:color="000000" w:sz="4"/>
@@ -3995,28 +3431,28 @@
         </w:trPr>
         <w:tc>
           <w:tcPr>
-            <w:tcW w:type="dxa" w:w="1500"/>
-            <w:tcBorders>
-              <w:top w:val="single" w:color="000000" w:sz="4"/>
-              <w:left w:val="single" w:color="000000" w:sz="4"/>
-              <w:bottom w:val="single" w:color="000000" w:sz="4"/>
-              <w:right w:val="single" w:color="000000" w:sz="4"/>
-            </w:tcBorders>
-            <w:tcMar>
-              <w:top w:type="dxa" w:w="50"/>
-              <w:left w:type="dxa" w:w="90"/>
-              <w:bottom w:type="dxa" w:w="50"/>
-              <w:right w:type="dxa" w:w="90"/>
-            </w:tcMar>
-          </w:tcPr>
-          <w:p>
-            <w:pPr>
-              <w:spacing w:after="0"/>
-              <w:jc w:val="left"/>
-            </w:pPr>
-            <w:r>
-              <w:rPr>
-                <w:rFonts w:ascii="Arial" w:cs="Arial" w:eastAsia="Arial" w:hAnsi="Arial"/>
+            <w:tcW w:type="dxa" w:w="2600"/>
+            <w:tcBorders>
+              <w:top w:val="single" w:color="000000" w:sz="4"/>
+              <w:left w:val="single" w:color="000000" w:sz="4"/>
+              <w:bottom w:val="single" w:color="000000" w:sz="4"/>
+              <w:right w:val="single" w:color="000000" w:sz="4"/>
+            </w:tcBorders>
+            <w:tcMar>
+              <w:top w:type="dxa" w:w="50"/>
+              <w:left w:type="dxa" w:w="90"/>
+              <w:bottom w:type="dxa" w:w="50"/>
+              <w:right w:type="dxa" w:w="90"/>
+            </w:tcMar>
+          </w:tcPr>
+          <w:p>
+            <w:pPr>
+              <w:spacing w:after="0"/>
+              <w:jc w:val="center"/>
+            </w:pPr>
+            <w:r>
+              <w:rPr>
+                <w:rFonts w:ascii="Courier New" w:cs="Courier New" w:eastAsia="Courier New" w:hAnsi="Courier New"/>
                 <w:b w:val="false"/>
                 <w:bCs w:val="false"/>
                 <w:i w:val="false"/>
@@ -4030,77 +3466,7 @@
         </w:tc>
         <w:tc>
           <w:tcPr>
-            <w:tcW w:type="dxa" w:w="1900"/>
-            <w:tcBorders>
-              <w:top w:val="single" w:color="000000" w:sz="4"/>
-              <w:left w:val="single" w:color="000000" w:sz="4"/>
-              <w:bottom w:val="single" w:color="000000" w:sz="4"/>
-              <w:right w:val="single" w:color="000000" w:sz="4"/>
-            </w:tcBorders>
-            <w:tcMar>
-              <w:top w:type="dxa" w:w="50"/>
-              <w:left w:type="dxa" w:w="90"/>
-              <w:bottom w:type="dxa" w:w="50"/>
-              <w:right w:type="dxa" w:w="90"/>
-            </w:tcMar>
-          </w:tcPr>
-          <w:p>
-            <w:pPr>
-              <w:spacing w:after="0"/>
-              <w:jc w:val="center"/>
-            </w:pPr>
-            <w:r>
-              <w:rPr>
-                <w:rFonts w:ascii="Courier New" w:cs="Courier New" w:eastAsia="Courier New" w:hAnsi="Courier New"/>
-                <w:b w:val="false"/>
-                <w:bCs w:val="false"/>
-                <w:i w:val="false"/>
-                <w:iCs w:val="false"/>
-                <w:sz w:val="19"/>
-                <w:szCs w:val="19"/>
-              </w:rPr>
-              <w:t xml:space="preserve">PP0&lt;CR&gt;</w:t>
-            </w:r>
-          </w:p>
-        </w:tc>
-        <w:tc>
-          <w:tcPr>
-            <w:tcW w:type="dxa" w:w="2900"/>
-            <w:tcBorders>
-              <w:top w:val="single" w:color="000000" w:sz="4"/>
-              <w:left w:val="single" w:color="000000" w:sz="4"/>
-              <w:bottom w:val="single" w:color="000000" w:sz="4"/>
-              <w:right w:val="single" w:color="000000" w:sz="4"/>
-            </w:tcBorders>
-            <w:tcMar>
-              <w:top w:type="dxa" w:w="50"/>
-              <w:left w:type="dxa" w:w="90"/>
-              <w:bottom w:type="dxa" w:w="50"/>
-              <w:right w:type="dxa" w:w="90"/>
-            </w:tcMar>
-          </w:tcPr>
-          <w:p>
-            <w:pPr>
-              <w:spacing w:after="0"/>
-              <w:jc w:val="center"/>
-            </w:pPr>
-            <w:r>
-              <w:rPr>
-                <w:rFonts w:ascii="Courier New" w:cs="Courier New" w:eastAsia="Courier New" w:hAnsi="Courier New"/>
-                <w:b w:val="false"/>
-                <w:bCs w:val="false"/>
-                <w:i w:val="false"/>
-                <w:iCs w:val="false"/>
-                <w:sz w:val="19"/>
-                <w:szCs w:val="19"/>
-              </w:rPr>
-              <w:t xml:space="preserve">50 50 30 0D</w:t>
-            </w:r>
-          </w:p>
-        </w:tc>
-        <w:tc>
-          <w:tcPr>
-            <w:tcW w:type="dxa" w:w="3338"/>
+            <w:tcW w:type="dxa" w:w="7038"/>
             <w:tcBorders>
               <w:top w:val="single" w:color="000000" w:sz="4"/>
               <w:left w:val="single" w:color="000000" w:sz="4"/>
@@ -4141,28 +3507,28 @@
         </w:trPr>
         <w:tc>
           <w:tcPr>
-            <w:tcW w:type="dxa" w:w="1500"/>
-            <w:tcBorders>
-              <w:top w:val="single" w:color="000000" w:sz="4"/>
-              <w:left w:val="single" w:color="000000" w:sz="4"/>
-              <w:bottom w:val="single" w:color="000000" w:sz="4"/>
-              <w:right w:val="single" w:color="000000" w:sz="4"/>
-            </w:tcBorders>
-            <w:tcMar>
-              <w:top w:type="dxa" w:w="50"/>
-              <w:left w:type="dxa" w:w="90"/>
-              <w:bottom w:type="dxa" w:w="50"/>
-              <w:right w:type="dxa" w:w="90"/>
-            </w:tcMar>
-          </w:tcPr>
-          <w:p>
-            <w:pPr>
-              <w:spacing w:after="0"/>
-              <w:jc w:val="left"/>
-            </w:pPr>
-            <w:r>
-              <w:rPr>
-                <w:rFonts w:ascii="Arial" w:cs="Arial" w:eastAsia="Arial" w:hAnsi="Arial"/>
+            <w:tcW w:type="dxa" w:w="2600"/>
+            <w:tcBorders>
+              <w:top w:val="single" w:color="000000" w:sz="4"/>
+              <w:left w:val="single" w:color="000000" w:sz="4"/>
+              <w:bottom w:val="single" w:color="000000" w:sz="4"/>
+              <w:right w:val="single" w:color="000000" w:sz="4"/>
+            </w:tcBorders>
+            <w:tcMar>
+              <w:top w:type="dxa" w:w="50"/>
+              <w:left w:type="dxa" w:w="90"/>
+              <w:bottom w:type="dxa" w:w="50"/>
+              <w:right w:type="dxa" w:w="90"/>
+            </w:tcMar>
+          </w:tcPr>
+          <w:p>
+            <w:pPr>
+              <w:spacing w:after="0"/>
+              <w:jc w:val="center"/>
+            </w:pPr>
+            <w:r>
+              <w:rPr>
+                <w:rFonts w:ascii="Courier New" w:cs="Courier New" w:eastAsia="Courier New" w:hAnsi="Courier New"/>
                 <w:b w:val="false"/>
                 <w:bCs w:val="false"/>
                 <w:i w:val="false"/>
@@ -4176,77 +3542,7 @@
         </w:tc>
         <w:tc>
           <w:tcPr>
-            <w:tcW w:type="dxa" w:w="1900"/>
-            <w:tcBorders>
-              <w:top w:val="single" w:color="000000" w:sz="4"/>
-              <w:left w:val="single" w:color="000000" w:sz="4"/>
-              <w:bottom w:val="single" w:color="000000" w:sz="4"/>
-              <w:right w:val="single" w:color="000000" w:sz="4"/>
-            </w:tcBorders>
-            <w:tcMar>
-              <w:top w:type="dxa" w:w="50"/>
-              <w:left w:type="dxa" w:w="90"/>
-              <w:bottom w:type="dxa" w:w="50"/>
-              <w:right w:type="dxa" w:w="90"/>
-            </w:tcMar>
-          </w:tcPr>
-          <w:p>
-            <w:pPr>
-              <w:spacing w:after="0"/>
-              <w:jc w:val="center"/>
-            </w:pPr>
-            <w:r>
-              <w:rPr>
-                <w:rFonts w:ascii="Courier New" w:cs="Courier New" w:eastAsia="Courier New" w:hAnsi="Courier New"/>
-                <w:b w:val="false"/>
-                <w:bCs w:val="false"/>
-                <w:i w:val="false"/>
-                <w:iCs w:val="false"/>
-                <w:sz w:val="19"/>
-                <w:szCs w:val="19"/>
-              </w:rPr>
-              <w:t xml:space="preserve">TP500&lt;CR&gt;</w:t>
-            </w:r>
-          </w:p>
-        </w:tc>
-        <w:tc>
-          <w:tcPr>
-            <w:tcW w:type="dxa" w:w="2900"/>
-            <w:tcBorders>
-              <w:top w:val="single" w:color="000000" w:sz="4"/>
-              <w:left w:val="single" w:color="000000" w:sz="4"/>
-              <w:bottom w:val="single" w:color="000000" w:sz="4"/>
-              <w:right w:val="single" w:color="000000" w:sz="4"/>
-            </w:tcBorders>
-            <w:tcMar>
-              <w:top w:type="dxa" w:w="50"/>
-              <w:left w:type="dxa" w:w="90"/>
-              <w:bottom w:type="dxa" w:w="50"/>
-              <w:right w:type="dxa" w:w="90"/>
-            </w:tcMar>
-          </w:tcPr>
-          <w:p>
-            <w:pPr>
-              <w:spacing w:after="0"/>
-              <w:jc w:val="center"/>
-            </w:pPr>
-            <w:r>
-              <w:rPr>
-                <w:rFonts w:ascii="Courier New" w:cs="Courier New" w:eastAsia="Courier New" w:hAnsi="Courier New"/>
-                <w:b w:val="false"/>
-                <w:bCs w:val="false"/>
-                <w:i w:val="false"/>
-                <w:iCs w:val="false"/>
-                <w:sz w:val="19"/>
-                <w:szCs w:val="19"/>
-              </w:rPr>
-              <w:t xml:space="preserve">54 50 35 30 30 0D</w:t>
-            </w:r>
-          </w:p>
-        </w:tc>
-        <w:tc>
-          <w:tcPr>
-            <w:tcW w:type="dxa" w:w="3338"/>
+            <w:tcW w:type="dxa" w:w="7038"/>
             <w:tcBorders>
               <w:top w:val="single" w:color="000000" w:sz="4"/>
               <w:left w:val="single" w:color="000000" w:sz="4"/>
@@ -4287,28 +3583,28 @@
         </w:trPr>
         <w:tc>
           <w:tcPr>
-            <w:tcW w:type="dxa" w:w="1500"/>
-            <w:tcBorders>
-              <w:top w:val="single" w:color="000000" w:sz="4"/>
-              <w:left w:val="single" w:color="000000" w:sz="4"/>
-              <w:bottom w:val="single" w:color="000000" w:sz="4"/>
-              <w:right w:val="single" w:color="000000" w:sz="4"/>
-            </w:tcBorders>
-            <w:tcMar>
-              <w:top w:type="dxa" w:w="50"/>
-              <w:left w:type="dxa" w:w="90"/>
-              <w:bottom w:type="dxa" w:w="50"/>
-              <w:right w:type="dxa" w:w="90"/>
-            </w:tcMar>
-          </w:tcPr>
-          <w:p>
-            <w:pPr>
-              <w:spacing w:after="0"/>
-              <w:jc w:val="left"/>
-            </w:pPr>
-            <w:r>
-              <w:rPr>
-                <w:rFonts w:ascii="Arial" w:cs="Arial" w:eastAsia="Arial" w:hAnsi="Arial"/>
+            <w:tcW w:type="dxa" w:w="2600"/>
+            <w:tcBorders>
+              <w:top w:val="single" w:color="000000" w:sz="4"/>
+              <w:left w:val="single" w:color="000000" w:sz="4"/>
+              <w:bottom w:val="single" w:color="000000" w:sz="4"/>
+              <w:right w:val="single" w:color="000000" w:sz="4"/>
+            </w:tcBorders>
+            <w:tcMar>
+              <w:top w:type="dxa" w:w="50"/>
+              <w:left w:type="dxa" w:w="90"/>
+              <w:bottom w:type="dxa" w:w="50"/>
+              <w:right w:type="dxa" w:w="90"/>
+            </w:tcMar>
+          </w:tcPr>
+          <w:p>
+            <w:pPr>
+              <w:spacing w:after="0"/>
+              <w:jc w:val="center"/>
+            </w:pPr>
+            <w:r>
+              <w:rPr>
+                <w:rFonts w:ascii="Courier New" w:cs="Courier New" w:eastAsia="Courier New" w:hAnsi="Courier New"/>
                 <w:b w:val="false"/>
                 <w:bCs w:val="false"/>
                 <w:i w:val="false"/>
@@ -4322,77 +3618,7 @@
         </w:tc>
         <w:tc>
           <w:tcPr>
-            <w:tcW w:type="dxa" w:w="1900"/>
-            <w:tcBorders>
-              <w:top w:val="single" w:color="000000" w:sz="4"/>
-              <w:left w:val="single" w:color="000000" w:sz="4"/>
-              <w:bottom w:val="single" w:color="000000" w:sz="4"/>
-              <w:right w:val="single" w:color="000000" w:sz="4"/>
-            </w:tcBorders>
-            <w:tcMar>
-              <w:top w:type="dxa" w:w="50"/>
-              <w:left w:type="dxa" w:w="90"/>
-              <w:bottom w:type="dxa" w:w="50"/>
-              <w:right w:type="dxa" w:w="90"/>
-            </w:tcMar>
-          </w:tcPr>
-          <w:p>
-            <w:pPr>
-              <w:spacing w:after="0"/>
-              <w:jc w:val="center"/>
-            </w:pPr>
-            <w:r>
-              <w:rPr>
-                <w:rFonts w:ascii="Courier New" w:cs="Courier New" w:eastAsia="Courier New" w:hAnsi="Courier New"/>
-                <w:b w:val="false"/>
-                <w:bCs w:val="false"/>
-                <w:i w:val="false"/>
-                <w:iCs w:val="false"/>
-                <w:sz w:val="19"/>
-                <w:szCs w:val="19"/>
-              </w:rPr>
-              <w:t xml:space="preserve">TP0&lt;CR&gt;</w:t>
-            </w:r>
-          </w:p>
-        </w:tc>
-        <w:tc>
-          <w:tcPr>
-            <w:tcW w:type="dxa" w:w="2900"/>
-            <w:tcBorders>
-              <w:top w:val="single" w:color="000000" w:sz="4"/>
-              <w:left w:val="single" w:color="000000" w:sz="4"/>
-              <w:bottom w:val="single" w:color="000000" w:sz="4"/>
-              <w:right w:val="single" w:color="000000" w:sz="4"/>
-            </w:tcBorders>
-            <w:tcMar>
-              <w:top w:type="dxa" w:w="50"/>
-              <w:left w:type="dxa" w:w="90"/>
-              <w:bottom w:type="dxa" w:w="50"/>
-              <w:right w:type="dxa" w:w="90"/>
-            </w:tcMar>
-          </w:tcPr>
-          <w:p>
-            <w:pPr>
-              <w:spacing w:after="0"/>
-              <w:jc w:val="center"/>
-            </w:pPr>
-            <w:r>
-              <w:rPr>
-                <w:rFonts w:ascii="Courier New" w:cs="Courier New" w:eastAsia="Courier New" w:hAnsi="Courier New"/>
-                <w:b w:val="false"/>
-                <w:bCs w:val="false"/>
-                <w:i w:val="false"/>
-                <w:iCs w:val="false"/>
-                <w:sz w:val="19"/>
-                <w:szCs w:val="19"/>
-              </w:rPr>
-              <w:t xml:space="preserve">54 50 30 0D</w:t>
-            </w:r>
-          </w:p>
-        </w:tc>
-        <w:tc>
-          <w:tcPr>
-            <w:tcW w:type="dxa" w:w="3338"/>
+            <w:tcW w:type="dxa" w:w="7038"/>
             <w:tcBorders>
               <w:top w:val="single" w:color="000000" w:sz="4"/>
               <w:left w:val="single" w:color="000000" w:sz="4"/>
@@ -4427,6 +3653,25 @@
         </w:tc>
       </w:tr>
     </w:tbl>
+    <w:p>
+      <w:pPr>
+        <w:keepNext w:val="false"/>
+        <w:spacing w:after="120" w:before="120"/>
+        <w:jc w:val="both"/>
+      </w:pPr>
+      <w:r>
+        <w:rPr>
+          <w:rFonts w:ascii="Arial" w:cs="Arial" w:eastAsia="Arial" w:hAnsi="Arial"/>
+          <w:b w:val="false"/>
+          <w:bCs w:val="false"/>
+          <w:i w:val="false"/>
+          <w:iCs w:val="false"/>
+          <w:sz w:val="21"/>
+          <w:szCs w:val="21"/>
+        </w:rPr>
+        <w:t xml:space="preserve">Os comandos são os do manual do PTU (FLIR): letras, seguidas ou não de um número, e terminados por Enter (CR). Consulta = comando sem número (ex.: RPS); programação = comando com o valor (ex.: RPS500). Maiúsculas e minúsculas são equivalentes.</w:t>
+      </w:r>
+    </w:p>
     <w:p>
       <w:pPr>
         <w:keepNext w:val="false"/>
@@ -4850,7 +4095,7 @@
                 <w:sz w:val="19"/>
                 <w:szCs w:val="19"/>
               </w:rPr>
-              <w:t xml:space="preserve">Versao</w:t>
+              <w:t xml:space="preserve">V</w:t>
             </w:r>
           </w:p>
         </w:tc>
@@ -5066,7 +4311,7 @@
                 <w:sz w:val="19"/>
                 <w:szCs w:val="19"/>
               </w:rPr>
-              <w:t xml:space="preserve">Le_RPS</w:t>
+              <w:t xml:space="preserve">RPS</w:t>
             </w:r>
           </w:p>
         </w:tc>
@@ -5282,7 +4527,7 @@
                 <w:sz w:val="19"/>
                 <w:szCs w:val="19"/>
               </w:rPr>
-              <w:t xml:space="preserve">Le_RTS</w:t>
+              <w:t xml:space="preserve">RTS</w:t>
             </w:r>
           </w:p>
         </w:tc>
@@ -5498,7 +4743,7 @@
                 <w:sz w:val="19"/>
                 <w:szCs w:val="19"/>
               </w:rPr>
-              <w:t xml:space="preserve">Religar; Le_RPS, Le_RTS</w:t>
+              <w:t xml:space="preserve">Religar; RPS, RTS</w:t>
             </w:r>
           </w:p>
         </w:tc>
@@ -5714,7 +4959,7 @@
                 <w:sz w:val="19"/>
                 <w:szCs w:val="19"/>
               </w:rPr>
-              <w:t xml:space="preserve">Reset</w:t>
+              <w:t xml:space="preserve">R</w:t>
             </w:r>
           </w:p>
         </w:tc>
@@ -5930,7 +5175,7 @@
                 <w:sz w:val="19"/>
                 <w:szCs w:val="19"/>
               </w:rPr>
-              <w:t xml:space="preserve">Le_PP e Le_TP</w:t>
+              <w:t xml:space="preserve">PP e TP</w:t>
             </w:r>
           </w:p>
         </w:tc>
@@ -6146,7 +5391,7 @@
                 <w:sz w:val="19"/>
                 <w:szCs w:val="19"/>
               </w:rPr>
-              <w:t xml:space="preserve">PP1000, Le_PP, PP0</w:t>
+              <w:t xml:space="preserve">PP1000, PP, PP0</w:t>
             </w:r>
           </w:p>
         </w:tc>
@@ -6181,7 +5426,7 @@
                 <w:sz w:val="19"/>
                 <w:szCs w:val="19"/>
               </w:rPr>
-              <w:t xml:space="preserve">O pan vai até 1000 e volta a 0; Le_PP indica 1000 após o primeiro movimento</w:t>
+              <w:t xml:space="preserve">O pan vai até 1000 e volta a 0; PP indica 1000 após o primeiro movimento</w:t>
             </w:r>
           </w:p>
         </w:tc>
@@ -6362,7 +5607,7 @@
                 <w:sz w:val="19"/>
                 <w:szCs w:val="19"/>
               </w:rPr>
-              <w:t xml:space="preserve">TP500, Le_TP, TP0</w:t>
+              <w:t xml:space="preserve">TP500, TP, TP0</w:t>
             </w:r>
           </w:p>
         </w:tc>
@@ -6397,7 +5642,7 @@
                 <w:sz w:val="19"/>
                 <w:szCs w:val="19"/>
               </w:rPr>
-              <w:t xml:space="preserve">O tilt vai até 500 e volta a 0; Le_TP indica 500 após o primeiro movimento</w:t>
+              <w:t xml:space="preserve">O tilt vai até 500 e volta a 0; TP indica 500 após o primeiro movimento</w:t>
             </w:r>
           </w:p>
         </w:tc>
@@ -6578,7 +5823,7 @@
                 <w:sz w:val="19"/>
                 <w:szCs w:val="19"/>
               </w:rPr>
-              <w:t xml:space="preserve">Versao</w:t>
+              <w:t xml:space="preserve">V</w:t>
             </w:r>
           </w:p>
         </w:tc>

</xml_diff>

<commit_message>
Docs: teste funcional do PTU-D300E com comandos digitados à mão
Os comandos deixam de ser cadastrados como sequências do Docklight e
passam a ser digitados linha por linha no Keyboard Console (Tools →
Keyboard Console On, Ctrl+F5), em ASCII como no manual da FLIR, com
Enter enviando o CR. Removidas as figuras do cadastro de sequências;
Figura 4 destaca o Keyboard Console; tabelas 3 e 4 com a coluna
"Digitar + Enter"; orientação para erro de digitação.

Co-Authored-By: Claude Opus 5.5 <noreply@anthropic.com>
Claude-Session: https://claude.ai/code/session_01VvvtJDPvh4mDoSVpkHza1d
</commit_message>
<xml_diff>
--- a/docs/procedimento-teste-funcional-ptu-d300e.docx
+++ b/docs/procedimento-teste-funcional-ptu-d300e.docx
@@ -1958,7 +1958,7 @@
           <w:sz w:val="19"/>
           <w:szCs w:val="19"/>
         </w:rPr>
-        <w:t xml:space="preserve">Figura 4: Docklight — menu Tools: Project Settings… e Start Communication Logging… (F2)</w:t>
+        <w:t xml:space="preserve">Figura 4: Docklight — menu Tools: Start Communication Logging… (F2), Keyboard Console On (Ctrl+F5) e Project Settings…</w:t>
       </w:r>
     </w:p>
     <w:p>
@@ -1972,7 +1972,7 @@
           <wp:inline distT="0" distB="0" distL="0" distR="0">
             <wp:extent cx="6000750" cy="3695700"/>
             <wp:effectExtent t="0" r="0" b="0" l="0"/>
-            <wp:docPr id="1" name="fig4" descr="Docklight — menu Tools: Project Settings… e Start Communication Logging… (F2)" title="Docklight — menu Tools: Project Settings… e Start Communication Logging… (F2)"/>
+            <wp:docPr id="1" name="fig4" descr="Docklight — menu Tools: Start Communication Logging… (F2), Keyboard Console On (Ctrl+F5) e Project Settings…" title="Docklight — menu Tools: Start Communication Logging… (F2), Keyboard Console On (Ctrl+F5) e Project Settings…"/>
             <wp:cNvGraphicFramePr>
               <a:graphicFrameLocks xmlns:a="http://schemas.openxmlformats.org/drawingml/2006/main" noChangeAspect="1"/>
             </wp:cNvGraphicFramePr>
@@ -2217,7 +2217,7 @@
           <w:sz w:val="21"/>
           <w:szCs w:val="21"/>
         </w:rPr>
-        <w:t xml:space="preserve">No painel Send Sequences, dar duplo clique numa linha vazia (ou usar Edit → Edit Send Sequence List…, Figura 7) e cadastrar cada comando da Tabela 3. Em Name, digitar o próprio comando; em Edit Mode, manter ASCII e, em Sequence, digitar o comando exatamente como no manual da FLIR (ex.: RPS500). Todo comando precisa terminar com Enter (CR, código 0D), sem o qual o PTU não o executa: com o cursor no fim do texto, mudar Edit Mode para HEX, digitar 0D e voltar para ASCII — o CR passa a aparecer no fim do comando. Confirmar com OK.</w:t>
+        <w:t xml:space="preserve">Em Tools → Start Communication Logging… (tecla F2, Figura 4), criar um arquivo de registro identificando a unidade (ex.: TESTE_PTU-D300E_&lt;nº de série&gt;_&lt;data&gt;).</w:t>
       </w:r>
     </w:p>
     <w:p>
@@ -2236,92 +2236,7 @@
           <w:sz w:val="19"/>
           <w:szCs w:val="19"/>
         </w:rPr>
-        <w:t xml:space="preserve">Figura 7: Docklight — menu Edit: Edit Send Sequence List…</w:t>
-      </w:r>
-    </w:p>
-    <w:p>
-      <w:pPr>
-        <w:keepNext/>
-        <w:spacing w:line="240" w:lineRule="auto"/>
-        <w:jc w:val="center"/>
-      </w:pPr>
-      <w:r>
-        <w:drawing>
-          <wp:inline distT="0" distB="0" distL="0" distR="0">
-            <wp:extent cx="6000750" cy="1819275"/>
-            <wp:effectExtent t="0" r="0" b="0" l="0"/>
-            <wp:docPr id="1" name="fig7" descr="Docklight — menu Edit: Edit Send Sequence List…" title="Docklight — menu Edit: Edit Send Sequence List…"/>
-            <wp:cNvGraphicFramePr>
-              <a:graphicFrameLocks xmlns:a="http://schemas.openxmlformats.org/drawingml/2006/main" noChangeAspect="1"/>
-            </wp:cNvGraphicFramePr>
-            <a:graphic xmlns:a="http://schemas.openxmlformats.org/drawingml/2006/main">
-              <a:graphicData uri="http://schemas.openxmlformats.org/drawingml/2006/picture">
-                <pic:pic xmlns:pic="http://schemas.openxmlformats.org/drawingml/2006/picture">
-                  <pic:nvPicPr>
-                    <pic:cNvPr id="0" name="" descr=""/>
-                    <pic:cNvPicPr>
-                      <a:picLocks noChangeAspect="1" noChangeArrowheads="1"/>
-                    </pic:cNvPicPr>
-                  </pic:nvPicPr>
-                  <pic:blipFill>
-                    <a:blip r:embed="rId14" cstate="none"/>
-                    <a:srcRect/>
-                    <a:stretch>
-                      <a:fillRect/>
-                    </a:stretch>
-                  </pic:blipFill>
-                  <pic:spPr bwMode="auto">
-                    <a:xfrm>
-                      <a:off x="0" y="0"/>
-                      <a:ext cx="6000750" cy="1819275"/>
-                    </a:xfrm>
-                    <a:prstGeom prst="rect">
-                      <a:avLst/>
-                    </a:prstGeom>
-                  </pic:spPr>
-                </pic:pic>
-              </a:graphicData>
-            </a:graphic>
-          </wp:inline>
-        </w:drawing>
-      </w:r>
-    </w:p>
-    <w:p>
-      <w:pPr>
-        <w:keepNext w:val="false"/>
-        <w:spacing w:after="80" w:before="0"/>
-        <w:jc w:val="both"/>
-      </w:pPr>
-      <w:r>
-        <w:rPr>
-          <w:rFonts w:ascii="Arial" w:cs="Arial" w:eastAsia="Arial" w:hAnsi="Arial"/>
-          <w:b w:val="false"/>
-          <w:bCs w:val="false"/>
-          <w:i w:val="false"/>
-          <w:iCs w:val="false"/>
-          <w:sz w:val="21"/>
-          <w:szCs w:val="21"/>
-        </w:rPr>
-        <w:t xml:space="preserve"/>
-      </w:r>
-    </w:p>
-    <w:p>
-      <w:pPr>
-        <w:keepNext/>
-        <w:spacing w:after="60" w:before="120"/>
-        <w:jc w:val="center"/>
-      </w:pPr>
-      <w:r>
-        <w:rPr>
-          <w:rFonts w:ascii="Arial" w:cs="Arial" w:eastAsia="Arial" w:hAnsi="Arial"/>
-          <w:b/>
-          <w:bCs/>
-          <w:i w:val="false"/>
-          <w:iCs w:val="false"/>
-          <w:sz w:val="19"/>
-          <w:szCs w:val="19"/>
-        </w:rPr>
-        <w:t xml:space="preserve">Figura 8: Docklight — Edit Send Sequence em modo ASCII</w:t>
+        <w:t xml:space="preserve">Figura 7: Docklight — início do registro (log) da comunicação</w:t>
       </w:r>
     </w:p>
     <w:tbl>
@@ -2370,7 +2285,7 @@
                 <w:sz w:val="18"/>
                 <w:szCs w:val="18"/>
               </w:rPr>
-              <w:t xml:space="preserve">INSERIR CAPTURA DE TELA — FIGURA 8</w:t>
+              <w:t xml:space="preserve">INSERIR CAPTURA DE TELA — FIGURA 7</w:t>
             </w:r>
           </w:p>
           <w:p>
@@ -2387,7 +2302,7 @@
                 <w:sz w:val="17"/>
                 <w:szCs w:val="17"/>
               </w:rPr>
-              <w:t xml:space="preserve">Diálogo Edit Send Sequence com Name = RPS500, Edit Mode = ASCII e a sequência RPS500 seguida do CR.</w:t>
+              <w:t xml:space="preserve">Diálogo Start Communication Logging com a pasta e o nome do arquivo.</w:t>
             </w:r>
           </w:p>
         </w:tc>
@@ -2414,6 +2329,98 @@
     </w:p>
     <w:p>
       <w:pPr>
+        <w:pStyle w:val="ListParagraph"/>
+        <w:numPr>
+          <w:ilvl w:val="0"/>
+          <w:numId w:val="3"/>
+        </w:numPr>
+        <w:spacing w:after="80"/>
+        <w:jc w:val="both"/>
+      </w:pPr>
+      <w:r>
+        <w:rPr>
+          <w:rFonts w:ascii="Arial" w:cs="Arial" w:eastAsia="Arial" w:hAnsi="Arial"/>
+          <w:b w:val="false"/>
+          <w:bCs w:val="false"/>
+          <w:i w:val="false"/>
+          <w:iCs w:val="false"/>
+          <w:sz w:val="21"/>
+          <w:szCs w:val="21"/>
+        </w:rPr>
+        <w:t xml:space="preserve">Clicar em Start Communication (ícone de "play" na barra de ferramentas). A barra de status deixa de mostrar "Communication port closed".</w:t>
+      </w:r>
+    </w:p>
+    <w:p>
+      <w:pPr>
+        <w:pStyle w:val="ListParagraph"/>
+        <w:numPr>
+          <w:ilvl w:val="0"/>
+          <w:numId w:val="3"/>
+        </w:numPr>
+        <w:spacing w:after="80"/>
+        <w:jc w:val="both"/>
+      </w:pPr>
+      <w:r>
+        <w:rPr>
+          <w:rFonts w:ascii="Arial" w:cs="Arial" w:eastAsia="Arial" w:hAnsi="Arial"/>
+          <w:b w:val="false"/>
+          <w:bCs w:val="false"/>
+          <w:i w:val="false"/>
+          <w:iCs w:val="false"/>
+          <w:sz w:val="21"/>
+          <w:szCs w:val="21"/>
+        </w:rPr>
+        <w:t xml:space="preserve">Ligar o Keyboard Console: Tools → Keyboard Console On (Ctrl+F5, Figura 4). Com ele ligado, não é preciso cadastrar nenhuma sequência: os comandos são digitados à mão, um por linha, diretamente na janela de comunicação.</w:t>
+      </w:r>
+    </w:p>
+    <w:p>
+      <w:pPr>
+        <w:pStyle w:val="ListParagraph"/>
+        <w:numPr>
+          <w:ilvl w:val="0"/>
+          <w:numId w:val="3"/>
+        </w:numPr>
+        <w:spacing w:after="80"/>
+        <w:jc w:val="both"/>
+      </w:pPr>
+      <w:r>
+        <w:rPr>
+          <w:rFonts w:ascii="Arial" w:cs="Arial" w:eastAsia="Arial" w:hAnsi="Arial"/>
+          <w:b w:val="false"/>
+          <w:bCs w:val="false"/>
+          <w:i w:val="false"/>
+          <w:iCs w:val="false"/>
+          <w:sz w:val="21"/>
+          <w:szCs w:val="21"/>
+        </w:rPr>
+        <w:t xml:space="preserve">Clicar dentro da janela de comunicação (aba ASCII), digitar o comando exatamente como no manual da FLIR (Tabela 3) e pressionar Enter: o Enter envia o CR que encerra o comando, e só então o PTU o executa. Digitar um comando de cada vez e conferir a resposta antes do próximo. Respostas iniciadas por "*" indicam comando aceito; por "!", erro.</w:t>
+      </w:r>
+    </w:p>
+    <w:p>
+      <w:pPr>
+        <w:pStyle w:val="ListParagraph"/>
+        <w:numPr>
+          <w:ilvl w:val="0"/>
+          <w:numId w:val="3"/>
+        </w:numPr>
+        <w:spacing w:after="80"/>
+        <w:jc w:val="both"/>
+      </w:pPr>
+      <w:r>
+        <w:rPr>
+          <w:rFonts w:ascii="Arial" w:cs="Arial" w:eastAsia="Arial" w:hAnsi="Arial"/>
+          <w:b w:val="false"/>
+          <w:bCs w:val="false"/>
+          <w:i w:val="false"/>
+          <w:iCs w:val="false"/>
+          <w:sz w:val="21"/>
+          <w:szCs w:val="21"/>
+        </w:rPr>
+        <w:t xml:space="preserve">Em caso de erro de digitação, não tentar apagar (cada tecla, inclusive o Backspace, já foi enviada ao PTU): pressionar Enter, aguardar a resposta "!" e digitar o comando de novo, inteiro.</w:t>
+      </w:r>
+    </w:p>
+    <w:p>
+      <w:pPr>
         <w:keepNext/>
         <w:spacing w:after="60" w:before="120"/>
         <w:jc w:val="center"/>
@@ -2428,7 +2435,7 @@
           <w:sz w:val="19"/>
           <w:szCs w:val="19"/>
         </w:rPr>
-        <w:t xml:space="preserve">Figura 9: Docklight — painel Send Sequences com os comandos cadastrados</w:t>
+        <w:t xml:space="preserve">Figura 8: Docklight — Keyboard Console ligado: comando V digitado e resposta do PTU</w:t>
       </w:r>
     </w:p>
     <w:tbl>
@@ -2477,7 +2484,7 @@
                 <w:sz w:val="18"/>
                 <w:szCs w:val="18"/>
               </w:rPr>
-              <w:t xml:space="preserve">INSERIR CAPTURA DE TELA — FIGURA 9</w:t>
+              <w:t xml:space="preserve">INSERIR CAPTURA DE TELA — FIGURA 8</w:t>
             </w:r>
           </w:p>
           <w:p>
@@ -2494,7 +2501,7 @@
                 <w:sz w:val="17"/>
                 <w:szCs w:val="17"/>
               </w:rPr>
-              <w:t xml:space="preserve">Painel Send Sequences com os comandos da Tabela 3.</w:t>
+              <w:t xml:space="preserve">Aba ASCII com a comunicação aberta, o comando V digitado à mão e a resposta "*" do PTU.</w:t>
             </w:r>
           </w:p>
         </w:tc>
@@ -2521,29 +2528,6 @@
     </w:p>
     <w:p>
       <w:pPr>
-        <w:pStyle w:val="ListParagraph"/>
-        <w:numPr>
-          <w:ilvl w:val="0"/>
-          <w:numId w:val="3"/>
-        </w:numPr>
-        <w:spacing w:after="80"/>
-        <w:jc w:val="both"/>
-      </w:pPr>
-      <w:r>
-        <w:rPr>
-          <w:rFonts w:ascii="Arial" w:cs="Arial" w:eastAsia="Arial" w:hAnsi="Arial"/>
-          <w:b w:val="false"/>
-          <w:bCs w:val="false"/>
-          <w:i w:val="false"/>
-          <w:iCs w:val="false"/>
-          <w:sz w:val="21"/>
-          <w:szCs w:val="21"/>
-        </w:rPr>
-        <w:t xml:space="preserve">Em Tools → Start Communication Logging… (tecla F2, Figura 4), criar um arquivo de registro identificando a unidade (ex.: TESTE_PTU-D300E_&lt;nº de série&gt;_&lt;data&gt;).</w:t>
-      </w:r>
-    </w:p>
-    <w:p>
-      <w:pPr>
         <w:keepNext/>
         <w:spacing w:after="60" w:before="120"/>
         <w:jc w:val="center"/>
@@ -2558,244 +2542,7 @@
           <w:sz w:val="19"/>
           <w:szCs w:val="19"/>
         </w:rPr>
-        <w:t xml:space="preserve">Figura 10: Docklight — início do registro (log) da comunicação</w:t>
-      </w:r>
-    </w:p>
-    <w:tbl>
-      <w:tblPr>
-        <w:tblW w:type="dxa" w:w="7000"/>
-        <w:jc w:val="center"/>
-        <w:tblBorders>
-          <w:top w:val="single" w:color="auto" w:sz="4"/>
-          <w:left w:val="single" w:color="auto" w:sz="4"/>
-          <w:bottom w:val="single" w:color="auto" w:sz="4"/>
-          <w:right w:val="single" w:color="auto" w:sz="4"/>
-          <w:insideH w:val="single" w:color="auto" w:sz="4"/>
-          <w:insideV w:val="single" w:color="auto" w:sz="4"/>
-        </w:tblBorders>
-      </w:tblPr>
-      <w:tblGrid>
-        <w:gridCol w:w="7000"/>
-      </w:tblGrid>
-      <w:tr>
-        <w:trPr>
-          <w:cantSplit/>
-          <w:trHeight w:val="2600" w:hRule="atLeast"/>
-        </w:trPr>
-        <w:tc>
-          <w:tcPr>
-            <w:tcW w:type="dxa" w:w="7000"/>
-            <w:tcBorders>
-              <w:top w:val="dashed" w:color="808080" w:sz="6"/>
-              <w:left w:val="dashed" w:color="808080" w:sz="6"/>
-              <w:bottom w:val="dashed" w:color="808080" w:sz="6"/>
-              <w:right w:val="dashed" w:color="808080" w:sz="6"/>
-            </w:tcBorders>
-            <w:vAlign w:val="center"/>
-          </w:tcPr>
-          <w:p>
-            <w:pPr>
-              <w:jc w:val="center"/>
-            </w:pPr>
-            <w:r>
-              <w:rPr>
-                <w:rFonts w:ascii="Arial" w:cs="Arial" w:eastAsia="Arial" w:hAnsi="Arial"/>
-                <w:b/>
-                <w:bCs/>
-                <w:i w:val="false"/>
-                <w:iCs w:val="false"/>
-                <w:sz w:val="18"/>
-                <w:szCs w:val="18"/>
-              </w:rPr>
-              <w:t xml:space="preserve">INSERIR CAPTURA DE TELA — FIGURA 10</w:t>
-            </w:r>
-          </w:p>
-          <w:p>
-            <w:pPr>
-              <w:jc w:val="center"/>
-            </w:pPr>
-            <w:r>
-              <w:rPr>
-                <w:rFonts w:ascii="Arial" w:cs="Arial" w:eastAsia="Arial" w:hAnsi="Arial"/>
-                <w:b w:val="false"/>
-                <w:bCs w:val="false"/>
-                <w:i/>
-                <w:iCs/>
-                <w:sz w:val="17"/>
-                <w:szCs w:val="17"/>
-              </w:rPr>
-              <w:t xml:space="preserve">Diálogo Start Communication Logging com a pasta e o nome do arquivo.</w:t>
-            </w:r>
-          </w:p>
-        </w:tc>
-      </w:tr>
-    </w:tbl>
-    <w:p>
-      <w:pPr>
-        <w:keepNext w:val="false"/>
-        <w:spacing w:after="80" w:before="0"/>
-        <w:jc w:val="both"/>
-      </w:pPr>
-      <w:r>
-        <w:rPr>
-          <w:rFonts w:ascii="Arial" w:cs="Arial" w:eastAsia="Arial" w:hAnsi="Arial"/>
-          <w:b w:val="false"/>
-          <w:bCs w:val="false"/>
-          <w:i w:val="false"/>
-          <w:iCs w:val="false"/>
-          <w:sz w:val="21"/>
-          <w:szCs w:val="21"/>
-        </w:rPr>
-        <w:t xml:space="preserve"/>
-      </w:r>
-    </w:p>
-    <w:p>
-      <w:pPr>
-        <w:pStyle w:val="ListParagraph"/>
-        <w:numPr>
-          <w:ilvl w:val="0"/>
-          <w:numId w:val="3"/>
-        </w:numPr>
-        <w:spacing w:after="80"/>
-        <w:jc w:val="both"/>
-      </w:pPr>
-      <w:r>
-        <w:rPr>
-          <w:rFonts w:ascii="Arial" w:cs="Arial" w:eastAsia="Arial" w:hAnsi="Arial"/>
-          <w:b w:val="false"/>
-          <w:bCs w:val="false"/>
-          <w:i w:val="false"/>
-          <w:iCs w:val="false"/>
-          <w:sz w:val="21"/>
-          <w:szCs w:val="21"/>
-        </w:rPr>
-        <w:t xml:space="preserve">Clicar em Start Communication (ícone de "play"). Para enviar um comando, clicar no botão Send à esquerda do seu nome; enviar um de cada vez e conferir a resposta na aba ASCII antes do próximo. Respostas iniciadas por "*" indicam comando aceito; por "!", erro.</w:t>
-      </w:r>
-    </w:p>
-    <w:p>
-      <w:pPr>
-        <w:keepNext/>
-        <w:spacing w:after="60" w:before="120"/>
-        <w:jc w:val="center"/>
-      </w:pPr>
-      <w:r>
-        <w:rPr>
-          <w:rFonts w:ascii="Arial" w:cs="Arial" w:eastAsia="Arial" w:hAnsi="Arial"/>
-          <w:b/>
-          <w:bCs/>
-          <w:i w:val="false"/>
-          <w:iCs w:val="false"/>
-          <w:sz w:val="19"/>
-          <w:szCs w:val="19"/>
-        </w:rPr>
-        <w:t xml:space="preserve">Figura 11: Docklight — comunicação iniciada e resposta ao comando V</w:t>
-      </w:r>
-    </w:p>
-    <w:tbl>
-      <w:tblPr>
-        <w:tblW w:type="dxa" w:w="7000"/>
-        <w:jc w:val="center"/>
-        <w:tblBorders>
-          <w:top w:val="single" w:color="auto" w:sz="4"/>
-          <w:left w:val="single" w:color="auto" w:sz="4"/>
-          <w:bottom w:val="single" w:color="auto" w:sz="4"/>
-          <w:right w:val="single" w:color="auto" w:sz="4"/>
-          <w:insideH w:val="single" w:color="auto" w:sz="4"/>
-          <w:insideV w:val="single" w:color="auto" w:sz="4"/>
-        </w:tblBorders>
-      </w:tblPr>
-      <w:tblGrid>
-        <w:gridCol w:w="7000"/>
-      </w:tblGrid>
-      <w:tr>
-        <w:trPr>
-          <w:cantSplit/>
-          <w:trHeight w:val="2600" w:hRule="atLeast"/>
-        </w:trPr>
-        <w:tc>
-          <w:tcPr>
-            <w:tcW w:type="dxa" w:w="7000"/>
-            <w:tcBorders>
-              <w:top w:val="dashed" w:color="808080" w:sz="6"/>
-              <w:left w:val="dashed" w:color="808080" w:sz="6"/>
-              <w:bottom w:val="dashed" w:color="808080" w:sz="6"/>
-              <w:right w:val="dashed" w:color="808080" w:sz="6"/>
-            </w:tcBorders>
-            <w:vAlign w:val="center"/>
-          </w:tcPr>
-          <w:p>
-            <w:pPr>
-              <w:jc w:val="center"/>
-            </w:pPr>
-            <w:r>
-              <w:rPr>
-                <w:rFonts w:ascii="Arial" w:cs="Arial" w:eastAsia="Arial" w:hAnsi="Arial"/>
-                <w:b/>
-                <w:bCs/>
-                <w:i w:val="false"/>
-                <w:iCs w:val="false"/>
-                <w:sz w:val="18"/>
-                <w:szCs w:val="18"/>
-              </w:rPr>
-              <w:t xml:space="preserve">INSERIR CAPTURA DE TELA — FIGURA 11</w:t>
-            </w:r>
-          </w:p>
-          <w:p>
-            <w:pPr>
-              <w:jc w:val="center"/>
-            </w:pPr>
-            <w:r>
-              <w:rPr>
-                <w:rFonts w:ascii="Arial" w:cs="Arial" w:eastAsia="Arial" w:hAnsi="Arial"/>
-                <w:b w:val="false"/>
-                <w:bCs w:val="false"/>
-                <w:i/>
-                <w:iCs/>
-                <w:sz w:val="17"/>
-                <w:szCs w:val="17"/>
-              </w:rPr>
-              <w:t xml:space="preserve">Janela principal com a comunicação aberta (botão Start Communication) e a aba ASCII mostrando o envio de V e a resposta "*" do PTU.</w:t>
-            </w:r>
-          </w:p>
-        </w:tc>
-      </w:tr>
-    </w:tbl>
-    <w:p>
-      <w:pPr>
-        <w:keepNext w:val="false"/>
-        <w:spacing w:after="80" w:before="0"/>
-        <w:jc w:val="both"/>
-      </w:pPr>
-      <w:r>
-        <w:rPr>
-          <w:rFonts w:ascii="Arial" w:cs="Arial" w:eastAsia="Arial" w:hAnsi="Arial"/>
-          <w:b w:val="false"/>
-          <w:bCs w:val="false"/>
-          <w:i w:val="false"/>
-          <w:iCs w:val="false"/>
-          <w:sz w:val="21"/>
-          <w:szCs w:val="21"/>
-        </w:rPr>
-        <w:t xml:space="preserve"/>
-      </w:r>
-    </w:p>
-    <w:p>
-      <w:pPr>
-        <w:keepNext/>
-        <w:spacing w:after="60" w:before="120"/>
-        <w:jc w:val="center"/>
-      </w:pPr>
-      <w:r>
-        <w:rPr>
-          <w:rFonts w:ascii="Arial" w:cs="Arial" w:eastAsia="Arial" w:hAnsi="Arial"/>
-          <w:b/>
-          <w:bCs/>
-          <w:i w:val="false"/>
-          <w:iCs w:val="false"/>
-          <w:sz w:val="19"/>
-          <w:szCs w:val="19"/>
-        </w:rPr>
-        <w:t xml:space="preserve">Tabela 3: Comandos a cadastrar no Docklight (ASCII, conforme o manual FLIR)</w:t>
+        <w:t xml:space="preserve">Tabela 3: Comandos a digitar no Keyboard Console (ASCII, conforme o manual FLIR)</w:t>
       </w:r>
     </w:p>
     <w:tbl>
@@ -2851,7 +2598,7 @@
                 <w:sz w:val="19"/>
                 <w:szCs w:val="19"/>
               </w:rPr>
-              <w:t xml:space="preserve">COMANDO ASCII (NAME e SEQUENCE)</w:t>
+              <w:t xml:space="preserve">DIGITAR + ENTER</w:t>
             </w:r>
           </w:p>
         </w:tc>
@@ -3876,7 +3623,7 @@
                 <w:sz w:val="19"/>
                 <w:szCs w:val="19"/>
               </w:rPr>
-              <w:t xml:space="preserve">ENVIAR</w:t>
+              <w:t xml:space="preserve">DIGITAR + ENTER</w:t>
             </w:r>
           </w:p>
         </w:tc>
@@ -5950,7 +5697,7 @@
           <w:sz w:val="21"/>
           <w:szCs w:val="21"/>
         </w:rPr>
-        <w:t xml:space="preserve">Ao final, clicar em Stop Communication e em Tools → Stop Communication Logging (F3), desenergizar o PTU e guardar o arquivo de registro junto com este formulário.</w:t>
+        <w:t xml:space="preserve">Ao final, desligar o Keyboard Console (Tools → Keyboard Console Off, Ctrl+F6), clicar em Stop Communication e em Tools → Stop Communication Logging (F3), desenergizar o PTU e guardar o arquivo de registro junto com este formulário.</w:t>
       </w:r>
     </w:p>
     <w:p>

</xml_diff>